<commit_message>
W02 Saturday: rebuild the Word paper and key from the corrected source
Co-Authored-By: Claude Opus 5.5 <noreply@anthropic.com>
Claude-Session: https://claude.ai/code/session_01VqAMmTvW7khXDgxHzRQZys
</commit_message>
<xml_diff>
--- a/content/W02/SAT/answer-key/C2_W02_SAT_answer_key_TRAINER.docx
+++ b/content/W02/SAT/answer-key/C2_W02_SAT_answer_key_TRAINER.docx
@@ -13842,7 +13842,7 @@
                 <w:sz w:val="21"/>
                 <w:szCs w:val="21"/>
               </w:rPr>
-              <w:t xml:space="preserve">A table has no stored order, so without ORDER BY the database returns whichever rows its plan reaches first, and two runs can differ.</w:t>
+              <w:t xml:space="preserve">A table has no stored order, so without ORDER BY the database returns whichever rows its plan reaches first, and two runs can differ. The common wrong answer is "sort", which fails because a plan that reads an index does return sorted rows on some runs; what the database withholds is the promise, so the word is guarantee.</w:t>
             </w:r>
           </w:p>
           <w:p>
@@ -14787,7 +14787,7 @@
                 <w:sz w:val="21"/>
                 <w:szCs w:val="21"/>
               </w:rPr>
-              <w:t xml:space="preserve">melt turns columns into rows, which lengthens the table; pivot_table does the reverse.</w:t>
+              <w:t xml:space="preserve">melt turns columns into rows, which lengthens the table; pivot_table does the reverse. The common wrong answer is unstack, which fails because unstack moves an index level into the columns and so widens the table, the same direction as pivot_table.</w:t>
             </w:r>
           </w:p>
           <w:p>
@@ -18192,7 +18192,7 @@
                 <w:sz w:val="21"/>
                 <w:szCs w:val="21"/>
               </w:rPr>
-              <w:t xml:space="preserve">When the window's ORDER BY has ties, the order of the tied rows is undefined, so the running total at those rows can differ from run to run. A tiebreaker column fixes it.</w:t>
+              <w:t xml:space="preserve">The claim needs a ROWS frame, such as ROWS BETWEEN UNBOUNDED PRECEDING AND CURRENT ROW: tied rows are then added one at a time in an undefined order, so the running total at those rows can differ from run to run. Postgres's default frame with an ORDER BY is RANGE, which treats tied rows as peers and gives them one shared running total, so on the default the ties change only the order the rows print in. Checked in Postgres 16.13. Option a stays the only defensible cause, because b, c and d are false on any frame, and a tiebreaker column in the window's ORDER BY fixes it on both.</w:t>
             </w:r>
           </w:p>
           <w:p>
@@ -18299,7 +18299,7 @@
                 <w:sz w:val="21"/>
                 <w:szCs w:val="21"/>
               </w:rPr>
-              <w:t xml:space="preserve">A running total that moves between runs has ties in its ORDER BY; add a tiebreaker so the order is defined.</w:t>
+              <w:t xml:space="preserve">A running total that moves between runs has ties in its ORDER BY under a ROWS frame, since the default RANGE frame gives tied rows one shared total; add a tiebreaker so the order is defined.</w:t>
             </w:r>
           </w:p>
           <w:p>
@@ -20456,7 +20456,7 @@
                 <w:sz w:val="21"/>
                 <w:szCs w:val="21"/>
               </w:rPr>
-              <w:t xml:space="preserve">920 orders give one row each, 50 orders give two rows each and 30 unpaid orders keep one row with NULLs: 920 + 100 + 30 = 1,050. Checked in Postgres 16.13.</w:t>
+              <w:t xml:space="preserve">920 orders give one row each, 50 orders give two rows each and 30 unpaid orders keep one row with NULLs: 920 + 100 + 30 = 1,050. Checked in Postgres 16.13. The common wrong answer is 1,000, which fails because a left join keeps every order but writes one row per matching payment, so the 50 retried orders appear twice.</w:t>
             </w:r>
           </w:p>
           <w:p>
@@ -20591,7 +20591,7 @@
                 <w:sz w:val="21"/>
                 <w:szCs w:val="21"/>
               </w:rPr>
-              <w:t xml:space="preserve">The INNER JOIN drops the 30 unpaid orders: 920 + 100 = 1,020.</w:t>
+              <w:t xml:space="preserve">The INNER JOIN drops the 30 unpaid orders: 920 + 100 = 1,020. The common wrong answer is 970, the count of orders with a payment, which fails because a join returns one row per matching pair and the 50 retried orders match two payment rows each.</w:t>
             </w:r>
           </w:p>
           <w:p>
@@ -21080,7 +21080,7 @@
                 <w:sz w:val="21"/>
                 <w:szCs w:val="21"/>
               </w:rPr>
-              <w:t xml:space="preserve">A 900, B and C tie at rank 2, so the next rank is 4 for D and E. Checked in Postgres 16.13.</w:t>
+              <w:t xml:space="preserve">A 900, B and C tie at rank 2, so the next rank is 4 for D and E. Checked in Postgres 16.13. The common wrong answer is 3, which is D's rank under DENSE_RANK(); RANK() skips the ranks the tie used up.</w:t>
             </w:r>
           </w:p>
           <w:p>
@@ -21215,7 +21215,7 @@
                 <w:sz w:val="21"/>
                 <w:szCs w:val="21"/>
               </w:rPr>
-              <w:t xml:space="preserve">Dense ranks run A 1, B and C 2, D and E 3, F 4.</w:t>
+              <w:t xml:space="preserve">Dense ranks run A 1, B and C 2, D and E 3, F 4. The common wrong answer is 6, which fails because 6 is F's rank under RANK() and its row number; DENSE_RANK() never skips a rank after a tie.</w:t>
             </w:r>
           </w:p>
           <w:p>
@@ -21788,7 +21788,7 @@
                 <w:sz w:val="21"/>
                 <w:szCs w:val="21"/>
               </w:rPr>
-              <w:t xml:space="preserve">940 customers match once and 60 match twice: 940 + 120 = 1,060.</w:t>
+              <w:t xml:space="preserve">940 customers match once and 60 match twice: 940 + 120 = 1,060. The common wrong answer is 1,000, which fails because a left merge keeps the left table's row count only when the right key is unique, and each of the 60 repeated customer_ids adds a row.</w:t>
             </w:r>
           </w:p>
           <w:p>
@@ -22496,7 +22496,7 @@
                 <w:sz w:val="21"/>
                 <w:szCs w:val="21"/>
               </w:rPr>
-              <w:t xml:space="preserve">Four segments times two quarters, with every combination present, gives eight groups.</w:t>
+              <w:t xml:space="preserve">Four segments times two quarters, with every combination present, gives eight groups. The common wrong answer is 6, which adds the segments to the quarters and fails because GROUP BY on two columns returns one row per pair of values, so the counts multiply.</w:t>
             </w:r>
           </w:p>
           <w:p>
@@ -22631,7 +22631,7 @@
                 <w:sz w:val="21"/>
                 <w:szCs w:val="21"/>
               </w:rPr>
-              <w:t xml:space="preserve">Fifty payments of Rs 2,000 counted twice add Rs 1 lakh: Rs 20 lakh plus Rs 1 lakh is Rs 21 lakh.</w:t>
+              <w:t xml:space="preserve">Fifty payments of Rs 2,000 counted twice add Rs 1 lakh: Rs 20 lakh plus Rs 1 lakh is Rs 21 lakh. The common wrong answer is Rs 20 lakh, which fails because SUM adds rows, and each retried payment is a second row carrying the same amount.</w:t>
             </w:r>
           </w:p>
           <w:p>
@@ -22766,7 +22766,7 @@
                 <w:sz w:val="21"/>
                 <w:szCs w:val="21"/>
               </w:rPr>
-              <w:t xml:space="preserve">Under RANK both tied members hold rank fifty, so 51 rows return; ROW_NUMBER numbers every row once and returns 50.</w:t>
+              <w:t xml:space="preserve">Under RANK both tied members hold rank fifty, so 51 rows return; ROW_NUMBER numbers every row once and returns 50. The common wrong answer is 50 under both, which fails because RANK() gives both tied members rank fifty and the filter keeps both.</w:t>
             </w:r>
           </w:p>
           <w:p>
@@ -22901,7 +22901,7 @@
                 <w:sz w:val="21"/>
                 <w:szCs w:val="21"/>
               </w:rPr>
-              <w:t xml:space="preserve">LAG gives 4,200 minus 5,000, a fall of Rs 800, and 3,900 minus 4,200, a fall of Rs 300. Two consecutive falls fire the flag.</w:t>
+              <w:t xml:space="preserve">LAG gives 4,200 minus 5,000, a fall of Rs 800, and 3,900 minus 4,200, a fall of Rs 300. Two consecutive falls fire the flag. The common wrong answer takes last month minus this month, reads two rises of Rs 800 and Rs 300 and says the flag does not fire; LAG returns last month's value, and the change is this month minus that value, so both changes are falls.</w:t>
             </w:r>
           </w:p>
           <w:p>

</xml_diff>

<commit_message>
W02 Saturday paper and key rebuilt: 55 items in six parts at 120 minutes
Built with scripts/build_saturday_paper.py W02 --docx on the source above: the
markdown paper and key, both Word files, and the item-analysis workbook with
its recalc manifest, which xlsx_recalc.py passes. The blueprint reads 8 easy,
34 medium and 13 hard.

Co-Authored-By: Claude Opus 5.5 <noreply@anthropic.com>
Claude-Session: https://claude.ai/code/session_01P7zaoR4dQ5pzBFnsX549JQ
</commit_message>
<xml_diff>
--- a/content/W02/SAT/answer-key/C2_W02_SAT_answer_key_TRAINER.docx
+++ b/content/W02/SAT/answer-key/C2_W02_SAT_answer_key_TRAINER.docx
@@ -26,7 +26,7 @@
           <w:sz w:val="21"/>
           <w:szCs w:val="21"/>
         </w:rPr>
-        <w:t xml:space="preserve">TRAINER.  Saturday 17 October 2026  ·  120 minutes  ·  52 items</w:t>
+        <w:t xml:space="preserve">TRAINER.  Saturday 17 October 2026  ·  120 minutes  ·  55 items</w:t>
       </w:r>
     </w:p>
     <w:p>
@@ -112,7 +112,7 @@
           <w:sz w:val="21"/>
           <w:szCs w:val="21"/>
         </w:rPr>
-        <w:t xml:space="preserve">The marker writes the count of ticks as Items right, out of 52, and hands the paper back.</w:t>
+        <w:t xml:space="preserve">The marker writes the count of ticks as Items right, out of 55, and hands the paper back.</w:t>
       </w:r>
     </w:p>
     <w:p>
@@ -1629,7 +1629,7 @@
                 <w:sz w:val="18"/>
                 <w:szCs w:val="18"/>
               </w:rPr>
-              <w:t xml:space="preserve">whether you catch a wrong number in a query, a line of pandas or a small result before it reaches a decision</w:t>
+              <w:t xml:space="preserve">whether you catch a wrong number in a query or a few lines of pandas before it reaches a decision</w:t>
             </w:r>
           </w:p>
         </w:tc>
@@ -1662,7 +1662,7 @@
                 <w:sz w:val="18"/>
                 <w:szCs w:val="18"/>
               </w:rPr>
-              <w:t xml:space="preserve">Q52 (1)</w:t>
+              <w:t xml:space="preserve">Q52 to Q55 (4)</w:t>
             </w:r>
           </w:p>
         </w:tc>
@@ -1695,7 +1695,7 @@
                 <w:sz w:val="18"/>
                 <w:szCs w:val="18"/>
               </w:rPr>
-              <w:t xml:space="preserve">2</w:t>
+              <w:t xml:space="preserve">8.5</w:t>
             </w:r>
           </w:p>
         </w:tc>
@@ -1794,7 +1794,7 @@
                 <w:sz w:val="18"/>
                 <w:szCs w:val="18"/>
               </w:rPr>
-              <w:t xml:space="preserve">0</w:t>
+              <w:t xml:space="preserve">3</w:t>
             </w:r>
           </w:p>
         </w:tc>
@@ -1892,7 +1892,7 @@
                 <w:sz w:val="18"/>
                 <w:szCs w:val="18"/>
               </w:rPr>
-              <w:t xml:space="preserve">52</w:t>
+              <w:t xml:space="preserve">55</w:t>
             </w:r>
           </w:p>
         </w:tc>
@@ -1924,7 +1924,7 @@
                 <w:sz w:val="18"/>
                 <w:szCs w:val="18"/>
               </w:rPr>
-              <w:t xml:space="preserve">113.5</w:t>
+              <w:t xml:space="preserve">120</w:t>
             </w:r>
           </w:p>
         </w:tc>
@@ -2020,7 +2020,7 @@
                 <w:sz w:val="18"/>
                 <w:szCs w:val="18"/>
               </w:rPr>
-              <w:t xml:space="preserve">10</w:t>
+              <w:t xml:space="preserve">13</w:t>
             </w:r>
           </w:p>
         </w:tc>
@@ -2050,7 +2050,7 @@
           <w:sz w:val="21"/>
           <w:szCs w:val="21"/>
         </w:rPr>
-        <w:t xml:space="preserve">A learner who guessed every item blind would average 10.6 of 52, since a written answer cannot be guessed from a list, and fewer than one guesser in twenty would reach 16. A score of 15 or below is therefore within reach of guessing alone, and the tally reads such a paper as a conversation to have on Monday, never as a result.</w:t>
+        <w:t xml:space="preserve">A learner who guessed every item blind would average 11.4 of 55, since a written answer cannot be guessed from a list, and fewer than one guesser in twenty would reach 17. A score of 16 or below is therefore within reach of guessing alone, and the tally reads such a paper as a conversation to have on Monday, never as a result.</w:t>
       </w:r>
     </w:p>
     <w:p>
@@ -14959,6 +14959,746 @@
                 <w:sz w:val="18"/>
                 <w:szCs w:val="18"/>
               </w:rPr>
+              <w:t xml:space="preserve">c</w:t>
+            </w:r>
+          </w:p>
+        </w:tc>
+        <w:tc>
+          <w:tcPr>
+            <w:tcW w:type="dxa" w:w="2200"/>
+            <w:tcBorders>
+              <w:top w:val="single" w:color="CFC9EE" w:sz="6"/>
+              <w:left w:val="single" w:color="CFC9EE" w:sz="6"/>
+              <w:bottom w:val="single" w:color="CFC9EE" w:sz="6"/>
+              <w:right w:val="single" w:color="CFC9EE" w:sz="6"/>
+            </w:tcBorders>
+            <w:shd w:fill="F4F2FA" w:color="auto" w:val="clear"/>
+            <w:tcMar>
+              <w:top w:type="dxa" w:w="90"/>
+              <w:left w:type="dxa" w:w="140"/>
+              <w:bottom w:type="dxa" w:w="90"/>
+              <w:right w:type="dxa" w:w="140"/>
+            </w:tcMar>
+          </w:tcPr>
+          <w:p>
+            <w:pPr>
+              <w:spacing w:after="80"/>
+            </w:pPr>
+            <w:r>
+              <w:rPr>
+                <w:color w:val="1A0F5C"/>
+                <w:sz w:val="18"/>
+                <w:szCs w:val="18"/>
+              </w:rPr>
+              <w:t xml:space="preserve">One correct option</w:t>
+            </w:r>
+          </w:p>
+        </w:tc>
+        <w:tc>
+          <w:tcPr>
+            <w:tcW w:type="dxa" w:w="700"/>
+            <w:tcBorders>
+              <w:top w:val="single" w:color="CFC9EE" w:sz="6"/>
+              <w:left w:val="single" w:color="CFC9EE" w:sz="6"/>
+              <w:bottom w:val="single" w:color="CFC9EE" w:sz="6"/>
+              <w:right w:val="single" w:color="CFC9EE" w:sz="6"/>
+            </w:tcBorders>
+            <w:shd w:fill="F4F2FA" w:color="auto" w:val="clear"/>
+            <w:tcMar>
+              <w:top w:type="dxa" w:w="90"/>
+              <w:left w:type="dxa" w:w="140"/>
+              <w:bottom w:type="dxa" w:w="90"/>
+              <w:right w:type="dxa" w:w="140"/>
+            </w:tcMar>
+          </w:tcPr>
+          <w:p>
+            <w:pPr>
+              <w:spacing w:after="80"/>
+            </w:pPr>
+            <w:r>
+              <w:rPr>
+                <w:color w:val="1A0F5C"/>
+                <w:sz w:val="18"/>
+                <w:szCs w:val="18"/>
+              </w:rPr>
+              <w:t xml:space="preserve">6</w:t>
+            </w:r>
+          </w:p>
+        </w:tc>
+        <w:tc>
+          <w:tcPr>
+            <w:tcW w:type="dxa" w:w="1000"/>
+            <w:tcBorders>
+              <w:top w:val="single" w:color="CFC9EE" w:sz="6"/>
+              <w:left w:val="single" w:color="CFC9EE" w:sz="6"/>
+              <w:bottom w:val="single" w:color="CFC9EE" w:sz="6"/>
+              <w:right w:val="single" w:color="CFC9EE" w:sz="6"/>
+            </w:tcBorders>
+            <w:shd w:fill="F4F2FA" w:color="auto" w:val="clear"/>
+            <w:tcMar>
+              <w:top w:type="dxa" w:w="90"/>
+              <w:left w:type="dxa" w:w="140"/>
+              <w:bottom w:type="dxa" w:w="90"/>
+              <w:right w:type="dxa" w:w="140"/>
+            </w:tcMar>
+          </w:tcPr>
+          <w:p>
+            <w:pPr>
+              <w:spacing w:after="80"/>
+            </w:pPr>
+            <w:r>
+              <w:rPr>
+                <w:color w:val="1A0F5C"/>
+                <w:sz w:val="18"/>
+                <w:szCs w:val="18"/>
+              </w:rPr>
+              <w:t xml:space="preserve">Hard</w:t>
+            </w:r>
+          </w:p>
+        </w:tc>
+        <w:tc>
+          <w:tcPr>
+            <w:tcW w:type="dxa" w:w="800"/>
+            <w:tcBorders>
+              <w:top w:val="single" w:color="CFC9EE" w:sz="6"/>
+              <w:left w:val="single" w:color="CFC9EE" w:sz="6"/>
+              <w:bottom w:val="single" w:color="CFC9EE" w:sz="6"/>
+              <w:right w:val="single" w:color="CFC9EE" w:sz="6"/>
+            </w:tcBorders>
+            <w:shd w:fill="F4F2FA" w:color="auto" w:val="clear"/>
+            <w:tcMar>
+              <w:top w:type="dxa" w:w="90"/>
+              <w:left w:type="dxa" w:w="140"/>
+              <w:bottom w:type="dxa" w:w="90"/>
+              <w:right w:type="dxa" w:w="140"/>
+            </w:tcMar>
+          </w:tcPr>
+          <w:p>
+            <w:pPr>
+              <w:spacing w:after="80"/>
+            </w:pPr>
+            <w:r>
+              <w:rPr>
+                <w:color w:val="1A0F5C"/>
+                <w:sz w:val="18"/>
+                <w:szCs w:val="18"/>
+              </w:rPr>
+              <w:t xml:space="preserve">[D]</w:t>
+            </w:r>
+          </w:p>
+        </w:tc>
+        <w:tc>
+          <w:tcPr>
+            <w:tcW w:type="dxa" w:w="800"/>
+            <w:tcBorders>
+              <w:top w:val="single" w:color="CFC9EE" w:sz="6"/>
+              <w:left w:val="single" w:color="CFC9EE" w:sz="6"/>
+              <w:bottom w:val="single" w:color="CFC9EE" w:sz="6"/>
+              <w:right w:val="single" w:color="CFC9EE" w:sz="6"/>
+            </w:tcBorders>
+            <w:shd w:fill="F4F2FA" w:color="auto" w:val="clear"/>
+            <w:tcMar>
+              <w:top w:type="dxa" w:w="90"/>
+              <w:left w:type="dxa" w:w="140"/>
+              <w:bottom w:type="dxa" w:w="90"/>
+              <w:right w:type="dxa" w:w="140"/>
+            </w:tcMar>
+          </w:tcPr>
+          <w:p>
+            <w:pPr>
+              <w:spacing w:after="80"/>
+            </w:pPr>
+            <w:r>
+              <w:rPr>
+                <w:color w:val="1A0F5C"/>
+                <w:sz w:val="18"/>
+                <w:szCs w:val="18"/>
+              </w:rPr>
+              <w:t xml:space="preserve">Mon</w:t>
+            </w:r>
+          </w:p>
+        </w:tc>
+        <w:tc>
+          <w:tcPr>
+            <w:tcW w:type="dxa" w:w="2306"/>
+            <w:tcBorders>
+              <w:top w:val="single" w:color="CFC9EE" w:sz="6"/>
+              <w:left w:val="single" w:color="CFC9EE" w:sz="6"/>
+              <w:bottom w:val="single" w:color="CFC9EE" w:sz="6"/>
+              <w:right w:val="single" w:color="CFC9EE" w:sz="6"/>
+            </w:tcBorders>
+            <w:shd w:fill="F4F2FA" w:color="auto" w:val="clear"/>
+            <w:tcMar>
+              <w:top w:type="dxa" w:w="90"/>
+              <w:left w:type="dxa" w:w="140"/>
+              <w:bottom w:type="dxa" w:w="90"/>
+              <w:right w:type="dxa" w:w="140"/>
+            </w:tcMar>
+          </w:tcPr>
+          <w:p>
+            <w:pPr>
+              <w:spacing w:after="80"/>
+            </w:pPr>
+            <w:r>
+              <w:rPr>
+                <w:color w:val="1A0F5C"/>
+                <w:sz w:val="18"/>
+                <w:szCs w:val="18"/>
+              </w:rPr>
+              <w:t xml:space="preserve">new</w:t>
+            </w:r>
+          </w:p>
+        </w:tc>
+      </w:tr>
+      <w:tr>
+        <w:tc>
+          <w:tcPr>
+            <w:tcW w:type="dxa" w:w="600"/>
+            <w:tcBorders>
+              <w:top w:val="single" w:color="CFC9EE" w:sz="6"/>
+              <w:left w:val="single" w:color="CFC9EE" w:sz="6"/>
+              <w:bottom w:val="single" w:color="CFC9EE" w:sz="6"/>
+              <w:right w:val="single" w:color="CFC9EE" w:sz="6"/>
+            </w:tcBorders>
+            <w:tcMar>
+              <w:top w:type="dxa" w:w="90"/>
+              <w:left w:type="dxa" w:w="140"/>
+              <w:bottom w:type="dxa" w:w="90"/>
+              <w:right w:type="dxa" w:w="140"/>
+            </w:tcMar>
+          </w:tcPr>
+          <w:p>
+            <w:pPr>
+              <w:spacing w:after="80"/>
+            </w:pPr>
+            <w:r>
+              <w:rPr>
+                <w:color w:val="1A0F5C"/>
+                <w:sz w:val="18"/>
+                <w:szCs w:val="18"/>
+              </w:rPr>
+              <w:t xml:space="preserve">53</w:t>
+            </w:r>
+          </w:p>
+        </w:tc>
+        <w:tc>
+          <w:tcPr>
+            <w:tcW w:type="dxa" w:w="1400"/>
+            <w:tcBorders>
+              <w:top w:val="single" w:color="CFC9EE" w:sz="6"/>
+              <w:left w:val="single" w:color="CFC9EE" w:sz="6"/>
+              <w:bottom w:val="single" w:color="CFC9EE" w:sz="6"/>
+              <w:right w:val="single" w:color="CFC9EE" w:sz="6"/>
+            </w:tcBorders>
+            <w:tcMar>
+              <w:top w:type="dxa" w:w="90"/>
+              <w:left w:type="dxa" w:w="140"/>
+              <w:bottom w:type="dxa" w:w="90"/>
+              <w:right w:type="dxa" w:w="140"/>
+            </w:tcMar>
+          </w:tcPr>
+          <w:p>
+            <w:pPr>
+              <w:spacing w:after="80"/>
+            </w:pPr>
+            <w:r>
+              <w:rPr>
+                <w:color w:val="1A0F5C"/>
+                <w:sz w:val="18"/>
+                <w:szCs w:val="18"/>
+              </w:rPr>
+              <w:t xml:space="preserve">b</w:t>
+            </w:r>
+          </w:p>
+        </w:tc>
+        <w:tc>
+          <w:tcPr>
+            <w:tcW w:type="dxa" w:w="2200"/>
+            <w:tcBorders>
+              <w:top w:val="single" w:color="CFC9EE" w:sz="6"/>
+              <w:left w:val="single" w:color="CFC9EE" w:sz="6"/>
+              <w:bottom w:val="single" w:color="CFC9EE" w:sz="6"/>
+              <w:right w:val="single" w:color="CFC9EE" w:sz="6"/>
+            </w:tcBorders>
+            <w:tcMar>
+              <w:top w:type="dxa" w:w="90"/>
+              <w:left w:type="dxa" w:w="140"/>
+              <w:bottom w:type="dxa" w:w="90"/>
+              <w:right w:type="dxa" w:w="140"/>
+            </w:tcMar>
+          </w:tcPr>
+          <w:p>
+            <w:pPr>
+              <w:spacing w:after="80"/>
+            </w:pPr>
+            <w:r>
+              <w:rPr>
+                <w:color w:val="1A0F5C"/>
+                <w:sz w:val="18"/>
+                <w:szCs w:val="18"/>
+              </w:rPr>
+              <w:t xml:space="preserve">Scenario set</w:t>
+            </w:r>
+          </w:p>
+        </w:tc>
+        <w:tc>
+          <w:tcPr>
+            <w:tcW w:type="dxa" w:w="700"/>
+            <w:tcBorders>
+              <w:top w:val="single" w:color="CFC9EE" w:sz="6"/>
+              <w:left w:val="single" w:color="CFC9EE" w:sz="6"/>
+              <w:bottom w:val="single" w:color="CFC9EE" w:sz="6"/>
+              <w:right w:val="single" w:color="CFC9EE" w:sz="6"/>
+            </w:tcBorders>
+            <w:tcMar>
+              <w:top w:type="dxa" w:w="90"/>
+              <w:left w:type="dxa" w:w="140"/>
+              <w:bottom w:type="dxa" w:w="90"/>
+              <w:right w:type="dxa" w:w="140"/>
+            </w:tcMar>
+          </w:tcPr>
+          <w:p>
+            <w:pPr>
+              <w:spacing w:after="80"/>
+            </w:pPr>
+            <w:r>
+              <w:rPr>
+                <w:color w:val="1A0F5C"/>
+                <w:sz w:val="18"/>
+                <w:szCs w:val="18"/>
+              </w:rPr>
+              <w:t xml:space="preserve">6</w:t>
+            </w:r>
+          </w:p>
+        </w:tc>
+        <w:tc>
+          <w:tcPr>
+            <w:tcW w:type="dxa" w:w="1000"/>
+            <w:tcBorders>
+              <w:top w:val="single" w:color="CFC9EE" w:sz="6"/>
+              <w:left w:val="single" w:color="CFC9EE" w:sz="6"/>
+              <w:bottom w:val="single" w:color="CFC9EE" w:sz="6"/>
+              <w:right w:val="single" w:color="CFC9EE" w:sz="6"/>
+            </w:tcBorders>
+            <w:tcMar>
+              <w:top w:type="dxa" w:w="90"/>
+              <w:left w:type="dxa" w:w="140"/>
+              <w:bottom w:type="dxa" w:w="90"/>
+              <w:right w:type="dxa" w:w="140"/>
+            </w:tcMar>
+          </w:tcPr>
+          <w:p>
+            <w:pPr>
+              <w:spacing w:after="80"/>
+            </w:pPr>
+            <w:r>
+              <w:rPr>
+                <w:color w:val="1A0F5C"/>
+                <w:sz w:val="18"/>
+                <w:szCs w:val="18"/>
+              </w:rPr>
+              <w:t xml:space="preserve">Hard</w:t>
+            </w:r>
+          </w:p>
+        </w:tc>
+        <w:tc>
+          <w:tcPr>
+            <w:tcW w:type="dxa" w:w="800"/>
+            <w:tcBorders>
+              <w:top w:val="single" w:color="CFC9EE" w:sz="6"/>
+              <w:left w:val="single" w:color="CFC9EE" w:sz="6"/>
+              <w:bottom w:val="single" w:color="CFC9EE" w:sz="6"/>
+              <w:right w:val="single" w:color="CFC9EE" w:sz="6"/>
+            </w:tcBorders>
+            <w:tcMar>
+              <w:top w:type="dxa" w:w="90"/>
+              <w:left w:type="dxa" w:w="140"/>
+              <w:bottom w:type="dxa" w:w="90"/>
+              <w:right w:type="dxa" w:w="140"/>
+            </w:tcMar>
+          </w:tcPr>
+          <w:p>
+            <w:pPr>
+              <w:spacing w:after="80"/>
+            </w:pPr>
+            <w:r>
+              <w:rPr>
+                <w:color w:val="1A0F5C"/>
+                <w:sz w:val="18"/>
+                <w:szCs w:val="18"/>
+              </w:rPr>
+              <w:t xml:space="preserve">[S]</w:t>
+            </w:r>
+          </w:p>
+        </w:tc>
+        <w:tc>
+          <w:tcPr>
+            <w:tcW w:type="dxa" w:w="800"/>
+            <w:tcBorders>
+              <w:top w:val="single" w:color="CFC9EE" w:sz="6"/>
+              <w:left w:val="single" w:color="CFC9EE" w:sz="6"/>
+              <w:bottom w:val="single" w:color="CFC9EE" w:sz="6"/>
+              <w:right w:val="single" w:color="CFC9EE" w:sz="6"/>
+            </w:tcBorders>
+            <w:tcMar>
+              <w:top w:type="dxa" w:w="90"/>
+              <w:left w:type="dxa" w:w="140"/>
+              <w:bottom w:type="dxa" w:w="90"/>
+              <w:right w:type="dxa" w:w="140"/>
+            </w:tcMar>
+          </w:tcPr>
+          <w:p>
+            <w:pPr>
+              <w:spacing w:after="80"/>
+            </w:pPr>
+            <w:r>
+              <w:rPr>
+                <w:color w:val="1A0F5C"/>
+                <w:sz w:val="18"/>
+                <w:szCs w:val="18"/>
+              </w:rPr>
+              <w:t xml:space="preserve">Tue</w:t>
+            </w:r>
+          </w:p>
+        </w:tc>
+        <w:tc>
+          <w:tcPr>
+            <w:tcW w:type="dxa" w:w="2306"/>
+            <w:tcBorders>
+              <w:top w:val="single" w:color="CFC9EE" w:sz="6"/>
+              <w:left w:val="single" w:color="CFC9EE" w:sz="6"/>
+              <w:bottom w:val="single" w:color="CFC9EE" w:sz="6"/>
+              <w:right w:val="single" w:color="CFC9EE" w:sz="6"/>
+            </w:tcBorders>
+            <w:tcMar>
+              <w:top w:type="dxa" w:w="90"/>
+              <w:left w:type="dxa" w:w="140"/>
+              <w:bottom w:type="dxa" w:w="90"/>
+              <w:right w:type="dxa" w:w="140"/>
+            </w:tcMar>
+          </w:tcPr>
+          <w:p>
+            <w:pPr>
+              <w:spacing w:after="80"/>
+            </w:pPr>
+            <w:r>
+              <w:rPr>
+                <w:color w:val="1A0F5C"/>
+                <w:sz w:val="18"/>
+                <w:szCs w:val="18"/>
+              </w:rPr>
+              <w:t xml:space="preserve">new</w:t>
+            </w:r>
+          </w:p>
+        </w:tc>
+      </w:tr>
+      <w:tr>
+        <w:tc>
+          <w:tcPr>
+            <w:tcW w:type="dxa" w:w="600"/>
+            <w:tcBorders>
+              <w:top w:val="single" w:color="CFC9EE" w:sz="6"/>
+              <w:left w:val="single" w:color="CFC9EE" w:sz="6"/>
+              <w:bottom w:val="single" w:color="CFC9EE" w:sz="6"/>
+              <w:right w:val="single" w:color="CFC9EE" w:sz="6"/>
+            </w:tcBorders>
+            <w:shd w:fill="F4F2FA" w:color="auto" w:val="clear"/>
+            <w:tcMar>
+              <w:top w:type="dxa" w:w="90"/>
+              <w:left w:type="dxa" w:w="140"/>
+              <w:bottom w:type="dxa" w:w="90"/>
+              <w:right w:type="dxa" w:w="140"/>
+            </w:tcMar>
+          </w:tcPr>
+          <w:p>
+            <w:pPr>
+              <w:spacing w:after="80"/>
+            </w:pPr>
+            <w:r>
+              <w:rPr>
+                <w:color w:val="1A0F5C"/>
+                <w:sz w:val="18"/>
+                <w:szCs w:val="18"/>
+              </w:rPr>
+              <w:t xml:space="preserve">54</w:t>
+            </w:r>
+          </w:p>
+        </w:tc>
+        <w:tc>
+          <w:tcPr>
+            <w:tcW w:type="dxa" w:w="1400"/>
+            <w:tcBorders>
+              <w:top w:val="single" w:color="CFC9EE" w:sz="6"/>
+              <w:left w:val="single" w:color="CFC9EE" w:sz="6"/>
+              <w:bottom w:val="single" w:color="CFC9EE" w:sz="6"/>
+              <w:right w:val="single" w:color="CFC9EE" w:sz="6"/>
+            </w:tcBorders>
+            <w:shd w:fill="F4F2FA" w:color="auto" w:val="clear"/>
+            <w:tcMar>
+              <w:top w:type="dxa" w:w="90"/>
+              <w:left w:type="dxa" w:w="140"/>
+              <w:bottom w:type="dxa" w:w="90"/>
+              <w:right w:type="dxa" w:w="140"/>
+            </w:tcMar>
+          </w:tcPr>
+          <w:p>
+            <w:pPr>
+              <w:spacing w:after="80"/>
+            </w:pPr>
+            <w:r>
+              <w:rPr>
+                <w:color w:val="1A0F5C"/>
+                <w:sz w:val="18"/>
+                <w:szCs w:val="18"/>
+              </w:rPr>
+              <w:t xml:space="preserve">d</w:t>
+            </w:r>
+          </w:p>
+        </w:tc>
+        <w:tc>
+          <w:tcPr>
+            <w:tcW w:type="dxa" w:w="2200"/>
+            <w:tcBorders>
+              <w:top w:val="single" w:color="CFC9EE" w:sz="6"/>
+              <w:left w:val="single" w:color="CFC9EE" w:sz="6"/>
+              <w:bottom w:val="single" w:color="CFC9EE" w:sz="6"/>
+              <w:right w:val="single" w:color="CFC9EE" w:sz="6"/>
+            </w:tcBorders>
+            <w:shd w:fill="F4F2FA" w:color="auto" w:val="clear"/>
+            <w:tcMar>
+              <w:top w:type="dxa" w:w="90"/>
+              <w:left w:type="dxa" w:w="140"/>
+              <w:bottom w:type="dxa" w:w="90"/>
+              <w:right w:type="dxa" w:w="140"/>
+            </w:tcMar>
+          </w:tcPr>
+          <w:p>
+            <w:pPr>
+              <w:spacing w:after="80"/>
+            </w:pPr>
+            <w:r>
+              <w:rPr>
+                <w:color w:val="1A0F5C"/>
+                <w:sz w:val="18"/>
+                <w:szCs w:val="18"/>
+              </w:rPr>
+              <w:t xml:space="preserve">One correct option</w:t>
+            </w:r>
+          </w:p>
+        </w:tc>
+        <w:tc>
+          <w:tcPr>
+            <w:tcW w:type="dxa" w:w="700"/>
+            <w:tcBorders>
+              <w:top w:val="single" w:color="CFC9EE" w:sz="6"/>
+              <w:left w:val="single" w:color="CFC9EE" w:sz="6"/>
+              <w:bottom w:val="single" w:color="CFC9EE" w:sz="6"/>
+              <w:right w:val="single" w:color="CFC9EE" w:sz="6"/>
+            </w:tcBorders>
+            <w:shd w:fill="F4F2FA" w:color="auto" w:val="clear"/>
+            <w:tcMar>
+              <w:top w:type="dxa" w:w="90"/>
+              <w:left w:type="dxa" w:w="140"/>
+              <w:bottom w:type="dxa" w:w="90"/>
+              <w:right w:type="dxa" w:w="140"/>
+            </w:tcMar>
+          </w:tcPr>
+          <w:p>
+            <w:pPr>
+              <w:spacing w:after="80"/>
+            </w:pPr>
+            <w:r>
+              <w:rPr>
+                <w:color w:val="1A0F5C"/>
+                <w:sz w:val="18"/>
+                <w:szCs w:val="18"/>
+              </w:rPr>
+              <w:t xml:space="preserve">6</w:t>
+            </w:r>
+          </w:p>
+        </w:tc>
+        <w:tc>
+          <w:tcPr>
+            <w:tcW w:type="dxa" w:w="1000"/>
+            <w:tcBorders>
+              <w:top w:val="single" w:color="CFC9EE" w:sz="6"/>
+              <w:left w:val="single" w:color="CFC9EE" w:sz="6"/>
+              <w:bottom w:val="single" w:color="CFC9EE" w:sz="6"/>
+              <w:right w:val="single" w:color="CFC9EE" w:sz="6"/>
+            </w:tcBorders>
+            <w:shd w:fill="F4F2FA" w:color="auto" w:val="clear"/>
+            <w:tcMar>
+              <w:top w:type="dxa" w:w="90"/>
+              <w:left w:type="dxa" w:w="140"/>
+              <w:bottom w:type="dxa" w:w="90"/>
+              <w:right w:type="dxa" w:w="140"/>
+            </w:tcMar>
+          </w:tcPr>
+          <w:p>
+            <w:pPr>
+              <w:spacing w:after="80"/>
+            </w:pPr>
+            <w:r>
+              <w:rPr>
+                <w:color w:val="1A0F5C"/>
+                <w:sz w:val="18"/>
+                <w:szCs w:val="18"/>
+              </w:rPr>
+              <w:t xml:space="preserve">Hard</w:t>
+            </w:r>
+          </w:p>
+        </w:tc>
+        <w:tc>
+          <w:tcPr>
+            <w:tcW w:type="dxa" w:w="800"/>
+            <w:tcBorders>
+              <w:top w:val="single" w:color="CFC9EE" w:sz="6"/>
+              <w:left w:val="single" w:color="CFC9EE" w:sz="6"/>
+              <w:bottom w:val="single" w:color="CFC9EE" w:sz="6"/>
+              <w:right w:val="single" w:color="CFC9EE" w:sz="6"/>
+            </w:tcBorders>
+            <w:shd w:fill="F4F2FA" w:color="auto" w:val="clear"/>
+            <w:tcMar>
+              <w:top w:type="dxa" w:w="90"/>
+              <w:left w:type="dxa" w:w="140"/>
+              <w:bottom w:type="dxa" w:w="90"/>
+              <w:right w:type="dxa" w:w="140"/>
+            </w:tcMar>
+          </w:tcPr>
+          <w:p>
+            <w:pPr>
+              <w:spacing w:after="80"/>
+            </w:pPr>
+            <w:r>
+              <w:rPr>
+                <w:color w:val="1A0F5C"/>
+                <w:sz w:val="18"/>
+                <w:szCs w:val="18"/>
+              </w:rPr>
+              <w:t xml:space="preserve">[S]</w:t>
+            </w:r>
+          </w:p>
+        </w:tc>
+        <w:tc>
+          <w:tcPr>
+            <w:tcW w:type="dxa" w:w="800"/>
+            <w:tcBorders>
+              <w:top w:val="single" w:color="CFC9EE" w:sz="6"/>
+              <w:left w:val="single" w:color="CFC9EE" w:sz="6"/>
+              <w:bottom w:val="single" w:color="CFC9EE" w:sz="6"/>
+              <w:right w:val="single" w:color="CFC9EE" w:sz="6"/>
+            </w:tcBorders>
+            <w:shd w:fill="F4F2FA" w:color="auto" w:val="clear"/>
+            <w:tcMar>
+              <w:top w:type="dxa" w:w="90"/>
+              <w:left w:type="dxa" w:w="140"/>
+              <w:bottom w:type="dxa" w:w="90"/>
+              <w:right w:type="dxa" w:w="140"/>
+            </w:tcMar>
+          </w:tcPr>
+          <w:p>
+            <w:pPr>
+              <w:spacing w:after="80"/>
+            </w:pPr>
+            <w:r>
+              <w:rPr>
+                <w:color w:val="1A0F5C"/>
+                <w:sz w:val="18"/>
+                <w:szCs w:val="18"/>
+              </w:rPr>
+              <w:t xml:space="preserve">Thu</w:t>
+            </w:r>
+          </w:p>
+        </w:tc>
+        <w:tc>
+          <w:tcPr>
+            <w:tcW w:type="dxa" w:w="2306"/>
+            <w:tcBorders>
+              <w:top w:val="single" w:color="CFC9EE" w:sz="6"/>
+              <w:left w:val="single" w:color="CFC9EE" w:sz="6"/>
+              <w:bottom w:val="single" w:color="CFC9EE" w:sz="6"/>
+              <w:right w:val="single" w:color="CFC9EE" w:sz="6"/>
+            </w:tcBorders>
+            <w:shd w:fill="F4F2FA" w:color="auto" w:val="clear"/>
+            <w:tcMar>
+              <w:top w:type="dxa" w:w="90"/>
+              <w:left w:type="dxa" w:w="140"/>
+              <w:bottom w:type="dxa" w:w="90"/>
+              <w:right w:type="dxa" w:w="140"/>
+            </w:tcMar>
+          </w:tcPr>
+          <w:p>
+            <w:pPr>
+              <w:spacing w:after="80"/>
+            </w:pPr>
+            <w:r>
+              <w:rPr>
+                <w:color w:val="1A0F5C"/>
+                <w:sz w:val="18"/>
+                <w:szCs w:val="18"/>
+              </w:rPr>
+              <w:t xml:space="preserve">new</w:t>
+            </w:r>
+          </w:p>
+        </w:tc>
+      </w:tr>
+      <w:tr>
+        <w:tc>
+          <w:tcPr>
+            <w:tcW w:type="dxa" w:w="600"/>
+            <w:tcBorders>
+              <w:top w:val="single" w:color="CFC9EE" w:sz="6"/>
+              <w:left w:val="single" w:color="CFC9EE" w:sz="6"/>
+              <w:bottom w:val="single" w:color="CFC9EE" w:sz="6"/>
+              <w:right w:val="single" w:color="CFC9EE" w:sz="6"/>
+            </w:tcBorders>
+            <w:tcMar>
+              <w:top w:type="dxa" w:w="90"/>
+              <w:left w:type="dxa" w:w="140"/>
+              <w:bottom w:type="dxa" w:w="90"/>
+              <w:right w:type="dxa" w:w="140"/>
+            </w:tcMar>
+          </w:tcPr>
+          <w:p>
+            <w:pPr>
+              <w:spacing w:after="80"/>
+            </w:pPr>
+            <w:r>
+              <w:rPr>
+                <w:color w:val="1A0F5C"/>
+                <w:sz w:val="18"/>
+                <w:szCs w:val="18"/>
+              </w:rPr>
+              <w:t xml:space="preserve">55</w:t>
+            </w:r>
+          </w:p>
+        </w:tc>
+        <w:tc>
+          <w:tcPr>
+            <w:tcW w:type="dxa" w:w="1400"/>
+            <w:tcBorders>
+              <w:top w:val="single" w:color="CFC9EE" w:sz="6"/>
+              <w:left w:val="single" w:color="CFC9EE" w:sz="6"/>
+              <w:bottom w:val="single" w:color="CFC9EE" w:sz="6"/>
+              <w:right w:val="single" w:color="CFC9EE" w:sz="6"/>
+            </w:tcBorders>
+            <w:tcMar>
+              <w:top w:type="dxa" w:w="90"/>
+              <w:left w:type="dxa" w:w="140"/>
+              <w:bottom w:type="dxa" w:w="90"/>
+              <w:right w:type="dxa" w:w="140"/>
+            </w:tcMar>
+          </w:tcPr>
+          <w:p>
+            <w:pPr>
+              <w:spacing w:after="80"/>
+            </w:pPr>
+            <w:r>
+              <w:rPr>
+                <w:color w:val="1A0F5C"/>
+                <w:sz w:val="18"/>
+                <w:szCs w:val="18"/>
+              </w:rPr>
               <w:t xml:space="preserve">a</w:t>
             </w:r>
           </w:p>
@@ -14972,7 +15712,6 @@
               <w:bottom w:val="single" w:color="CFC9EE" w:sz="6"/>
               <w:right w:val="single" w:color="CFC9EE" w:sz="6"/>
             </w:tcBorders>
-            <w:shd w:fill="F4F2FA" w:color="auto" w:val="clear"/>
             <w:tcMar>
               <w:top w:type="dxa" w:w="90"/>
               <w:left w:type="dxa" w:w="140"/>
@@ -15003,7 +15742,6 @@
               <w:bottom w:val="single" w:color="CFC9EE" w:sz="6"/>
               <w:right w:val="single" w:color="CFC9EE" w:sz="6"/>
             </w:tcBorders>
-            <w:shd w:fill="F4F2FA" w:color="auto" w:val="clear"/>
             <w:tcMar>
               <w:top w:type="dxa" w:w="90"/>
               <w:left w:type="dxa" w:w="140"/>
@@ -15034,7 +15772,6 @@
               <w:bottom w:val="single" w:color="CFC9EE" w:sz="6"/>
               <w:right w:val="single" w:color="CFC9EE" w:sz="6"/>
             </w:tcBorders>
-            <w:shd w:fill="F4F2FA" w:color="auto" w:val="clear"/>
             <w:tcMar>
               <w:top w:type="dxa" w:w="90"/>
               <w:left w:type="dxa" w:w="140"/>
@@ -15065,7 +15802,6 @@
               <w:bottom w:val="single" w:color="CFC9EE" w:sz="6"/>
               <w:right w:val="single" w:color="CFC9EE" w:sz="6"/>
             </w:tcBorders>
-            <w:shd w:fill="F4F2FA" w:color="auto" w:val="clear"/>
             <w:tcMar>
               <w:top w:type="dxa" w:w="90"/>
               <w:left w:type="dxa" w:w="140"/>
@@ -15096,7 +15832,6 @@
               <w:bottom w:val="single" w:color="CFC9EE" w:sz="6"/>
               <w:right w:val="single" w:color="CFC9EE" w:sz="6"/>
             </w:tcBorders>
-            <w:shd w:fill="F4F2FA" w:color="auto" w:val="clear"/>
             <w:tcMar>
               <w:top w:type="dxa" w:w="90"/>
               <w:left w:type="dxa" w:w="140"/>
@@ -15127,7 +15862,6 @@
               <w:bottom w:val="single" w:color="CFC9EE" w:sz="6"/>
               <w:right w:val="single" w:color="CFC9EE" w:sz="6"/>
             </w:tcBorders>
-            <w:shd w:fill="F4F2FA" w:color="auto" w:val="clear"/>
             <w:tcMar>
               <w:top w:type="dxa" w:w="90"/>
               <w:left w:type="dxa" w:w="140"/>
@@ -17479,7 +18213,7 @@
                 <w:sz w:val="21"/>
                 <w:szCs w:val="21"/>
               </w:rPr>
-              <w:t xml:space="preserve">The logical order is FROM, WHERE, GROUP BY, HAVING, SELECT, ORDER BY.</w:t>
+              <w:t xml:space="preserve">The logical order is FROM, WHERE, GROUP BY, HAVING, SELECT, ORDER BY. The common wrong answer is the order the clauses are typed, a, c, b, e, f, d, which puts SELECT first; the database cannot pick columns from rows it has not yet read, filtered and grouped.</w:t>
             </w:r>
           </w:p>
           <w:p>
@@ -18518,7 +19252,7 @@
                 <w:sz w:val="21"/>
                 <w:szCs w:val="21"/>
               </w:rPr>
-              <w:t xml:space="preserve">The font changes no number; it is the nonsense option that tests reading.</w:t>
+              <w:t xml:space="preserve">Every order stays in a LEFT JOIN, so the channels match before and after it whether or not the join fanned out. A check that cannot fail proves nothing, which is how the doubled total passed a row-by-row reading on Tuesday.</w:t>
             </w:r>
           </w:p>
           <w:p>
@@ -22850,7 +23584,7 @@
                 <w:sz w:val="21"/>
                 <w:szCs w:val="21"/>
               </w:rPr>
-              <w:t xml:space="preserve">Colour styles the card and changes no reading of the number.</w:t>
+              <w:t xml:space="preserve">An exact figure changes no reading: Rs 19,84,00,000 to the rupee reads as a doubled quarter exactly as Friday's card of Rs 19.84 crore did, because what was missing was the period.</w:t>
             </w:r>
           </w:p>
           <w:p>
@@ -23828,7 +24562,7 @@
                 <w:sz w:val="21"/>
                 <w:szCs w:val="21"/>
               </w:rPr>
-              <w:t xml:space="preserve">The warehouse computes the source of truth, pandas carries the analyst's iteration, and Excel presents it to the room.</w:t>
+              <w:t xml:space="preserve">The warehouse computes the source of truth, pandas carries the analyst's iteration, and Excel presents it to the room. Any order that starts in pandas or Excel makes a copy the source of truth, which Friday's operating rule forbids: the number of record lives in the warehouse.</w:t>
             </w:r>
           </w:p>
           <w:p>
@@ -23923,6 +24657,663 @@
                 <w:szCs w:val="24"/>
               </w:rPr>
               <w:t xml:space="preserve">Q52</w:t>
+            </w:r>
+            <w:r>
+              <w:rPr>
+                <w:b/>
+                <w:bCs/>
+                <w:color w:val="1A0F5C"/>
+                <w:sz w:val="21"/>
+                <w:szCs w:val="21"/>
+              </w:rPr>
+              <w:t xml:space="preserve">   key c</w:t>
+            </w:r>
+            <w:r>
+              <w:rPr>
+                <w:color w:val="6B6690"/>
+                <w:sz w:val="18"/>
+                <w:szCs w:val="18"/>
+              </w:rPr>
+              <w:t xml:space="preserve">   One correct option, Hard, [D], Mon</w:t>
+            </w:r>
+          </w:p>
+          <w:p>
+            <w:pPr>
+              <w:spacing w:after="80"/>
+            </w:pPr>
+            <w:r>
+              <w:rPr>
+                <w:b/>
+                <w:bCs/>
+                <w:color w:val="1A0F5C"/>
+                <w:sz w:val="21"/>
+                <w:szCs w:val="21"/>
+              </w:rPr>
+              <w:t xml:space="preserve">Why it holds.  </w:t>
+            </w:r>
+            <w:r>
+              <w:rPr>
+                <w:color w:val="1A0F5C"/>
+                <w:sz w:val="21"/>
+                <w:szCs w:val="21"/>
+              </w:rPr>
+              <w:t xml:space="preserve">The CASE has no ELSE, so C3 and C4, who bought nothing in Q2, carry a NULL q2_spend where a zero was meant. AVG divides by the values it can see: avg_q1 is Rs 6,000 over four members and avg_q2 is C1's Rs 1,800 and C2's Rs 1,200 over two, so both come to 1,500 and the query reports spend per member as flat. Half the members stopped buying, and with COALESCE(..., 0) the honest Q2 figure is Rs 750, half of Q1. The check that catches it is count(*) beside count(q2_spend), 4 against 2. Run on PostgreSQL 16.13 on 30 September 2026, the query returns 1500 and 1500.</w:t>
+            </w:r>
+          </w:p>
+          <w:p>
+            <w:pPr>
+              <w:pStyle w:val="ListParagraph"/>
+              <w:numPr>
+                <w:ilvl w:val="0"/>
+                <w:numId w:val="3"/>
+              </w:numPr>
+              <w:spacing w:after="40"/>
+            </w:pPr>
+            <w:r>
+              <w:rPr>
+                <w:b/>
+                <w:bCs/>
+                <w:color w:val="5B3FD6"/>
+                <w:sz w:val="21"/>
+                <w:szCs w:val="21"/>
+              </w:rPr>
+              <w:t xml:space="preserve">(a)  </w:t>
+            </w:r>
+            <w:r>
+              <w:rPr>
+                <w:color w:val="1A0F5C"/>
+                <w:sz w:val="21"/>
+                <w:szCs w:val="21"/>
+              </w:rPr>
+              <w:t xml:space="preserve">The figure the head of Retail-Plus needed, and one this query never computes: it would need COALESCE(..., 0) to count the two members with no Q2 order as zero. Reading AVG as dividing by every member is Monday's round 3 trap, the member average that quietly left out the members who bought nothing in the quarter.</w:t>
+            </w:r>
+          </w:p>
+          <w:p>
+            <w:pPr>
+              <w:pStyle w:val="ListParagraph"/>
+              <w:numPr>
+                <w:ilvl w:val="0"/>
+                <w:numId w:val="3"/>
+              </w:numPr>
+              <w:spacing w:after="40"/>
+            </w:pPr>
+            <w:r>
+              <w:rPr>
+                <w:b/>
+                <w:bCs/>
+                <w:color w:val="5B3FD6"/>
+                <w:sz w:val="21"/>
+                <w:szCs w:val="21"/>
+              </w:rPr>
+              <w:t xml:space="preserve">(b)  </w:t>
+            </w:r>
+            <w:r>
+              <w:rPr>
+                <w:color w:val="1A0F5C"/>
+                <w:sz w:val="21"/>
+                <w:szCs w:val="21"/>
+              </w:rPr>
+              <w:t xml:space="preserve">Averages the three Q2 order rows, Rs 3,000 over three, at the order's grain, where the CTE first sums C1's two Q2 orders into one member. Rows read as customers is Monday's round 1 trap.</w:t>
+            </w:r>
+          </w:p>
+          <w:p>
+            <w:pPr>
+              <w:pStyle w:val="ListParagraph"/>
+              <w:numPr>
+                <w:ilvl w:val="0"/>
+                <w:numId w:val="3"/>
+              </w:numPr>
+              <w:spacing w:after="40"/>
+            </w:pPr>
+            <w:r>
+              <w:rPr>
+                <w:b/>
+                <w:bCs/>
+                <w:color w:val="5B3FD6"/>
+                <w:sz w:val="21"/>
+                <w:szCs w:val="21"/>
+              </w:rPr>
+              <w:t xml:space="preserve">(d)  </w:t>
+            </w:r>
+            <w:r>
+              <w:rPr>
+                <w:color w:val="1A0F5C"/>
+                <w:sz w:val="21"/>
+                <w:szCs w:val="21"/>
+              </w:rPr>
+              <w:t xml:space="preserve">Reads NULL as spreading through the aggregate. AVG skips NULLs, as Monday's round 3 showed on the invented values 100, NULL and 200, where AVG returned 150; only arithmetic such as q2_spend - q1_spend turns NULL.</w:t>
+            </w:r>
+          </w:p>
+          <w:p>
+            <w:pPr>
+              <w:spacing w:before="60"/>
+            </w:pPr>
+            <w:r>
+              <w:rPr>
+                <w:b/>
+                <w:bCs/>
+                <w:color w:val="1A0F5C"/>
+                <w:sz w:val="21"/>
+                <w:szCs w:val="21"/>
+              </w:rPr>
+              <w:t xml:space="preserve">In the interview.  </w:t>
+            </w:r>
+            <w:r>
+              <w:rPr>
+                <w:color w:val="1A0F5C"/>
+                <w:sz w:val="21"/>
+                <w:szCs w:val="21"/>
+              </w:rPr>
+              <w:t xml:space="preserve">AVG divides by the values it can see, so a CASE with no ELSE turns a member who bought nothing into a NULL that drops out of the denominator; I write the zero on purpose with COALESCE and put count(*) beside count(q2_spend), so the analyst auditing the query sees both denominators.</w:t>
+            </w:r>
+          </w:p>
+          <w:p>
+            <w:pPr>
+              <w:spacing w:after="80"/>
+            </w:pPr>
+            <w:r>
+              <w:rPr>
+                <w:color w:val="6B6690"/>
+                <w:sz w:val="18"/>
+                <w:szCs w:val="18"/>
+              </w:rPr>
+              <w:t xml:space="preserve">Anchor: A stakeholder's analyst must audit your query; what changes in how you write it, and what would you refuse to compute in a notebook?</w:t>
+            </w:r>
+          </w:p>
+        </w:tc>
+      </w:tr>
+    </w:tbl>
+    <w:p>
+      <w:pPr>
+        <w:spacing w:after="90"/>
+      </w:pPr>
+    </w:p>
+    <w:tbl>
+      <w:tblPr>
+        <w:tblW w:type="dxa" w:w="9806"/>
+        <w:tblBorders>
+          <w:top w:val="single" w:color="auto" w:sz="4"/>
+          <w:left w:val="single" w:color="auto" w:sz="4"/>
+          <w:bottom w:val="single" w:color="auto" w:sz="4"/>
+          <w:right w:val="single" w:color="auto" w:sz="4"/>
+          <w:insideH w:val="single" w:color="auto" w:sz="4"/>
+          <w:insideV w:val="single" w:color="auto" w:sz="4"/>
+        </w:tblBorders>
+      </w:tblPr>
+      <w:tblGrid>
+        <w:gridCol w:w="9806"/>
+      </w:tblGrid>
+      <w:tr>
+        <w:trPr>
+          <w:cantSplit/>
+        </w:trPr>
+        <w:tc>
+          <w:tcPr>
+            <w:tcW w:type="dxa" w:w="9806"/>
+            <w:tcBorders>
+              <w:top w:val="single" w:color="CFC9EE" w:sz="6"/>
+              <w:left w:val="single" w:color="CFC9EE" w:sz="6"/>
+              <w:bottom w:val="single" w:color="CFC9EE" w:sz="6"/>
+              <w:right w:val="single" w:color="CFC9EE" w:sz="6"/>
+            </w:tcBorders>
+            <w:tcMar>
+              <w:top w:type="dxa" w:w="90"/>
+              <w:left w:type="dxa" w:w="140"/>
+              <w:bottom w:type="dxa" w:w="90"/>
+              <w:right w:type="dxa" w:w="140"/>
+            </w:tcMar>
+          </w:tcPr>
+          <w:p>
+            <w:pPr>
+              <w:spacing w:after="80"/>
+            </w:pPr>
+            <w:r>
+              <w:rPr>
+                <w:b/>
+                <w:bCs/>
+                <w:color w:val="5B3FD6"/>
+                <w:sz w:val="24"/>
+                <w:szCs w:val="24"/>
+              </w:rPr>
+              <w:t xml:space="preserve">Q53</w:t>
+            </w:r>
+            <w:r>
+              <w:rPr>
+                <w:b/>
+                <w:bCs/>
+                <w:color w:val="1A0F5C"/>
+                <w:sz w:val="21"/>
+                <w:szCs w:val="21"/>
+              </w:rPr>
+              <w:t xml:space="preserve">   key b</w:t>
+            </w:r>
+            <w:r>
+              <w:rPr>
+                <w:color w:val="6B6690"/>
+                <w:sz w:val="18"/>
+                <w:szCs w:val="18"/>
+              </w:rPr>
+              <w:t xml:space="preserve">   Scenario set, Hard, [S], Tue</w:t>
+            </w:r>
+          </w:p>
+          <w:p>
+            <w:pPr>
+              <w:spacing w:after="80"/>
+            </w:pPr>
+            <w:r>
+              <w:rPr>
+                <w:b/>
+                <w:bCs/>
+                <w:color w:val="1A0F5C"/>
+                <w:sz w:val="21"/>
+                <w:szCs w:val="21"/>
+              </w:rPr>
+              <w:t xml:space="preserve">Why it holds.  </w:t>
+            </w:r>
+            <w:r>
+              <w:rPr>
+                <w:color w:val="1A0F5C"/>
+                <w:sz w:val="21"/>
+                <w:szCs w:val="21"/>
+              </w:rPr>
+              <w:t xml:space="preserve">O-1's two instalments both fall inside the quarter, so the join gives O-1 two rows and SUM(o.amount) counts its Rs 1,200 twice. O-2's only payment is dated 1 October, so its joined row fails the WHERE. O-3 has no payment, so its paid_date is NULL, BETWEEN on a NULL is unknown, and WHERE drops that row too. Two rows remain, booked Rs 2,400, against three orders worth Rs 2,500: the report lost two orders and doubled the one it kept. Run on PostgreSQL 16.13 on 30 September 2026, the query returns 2 and 2400.</w:t>
+            </w:r>
+          </w:p>
+          <w:p>
+            <w:pPr>
+              <w:pStyle w:val="ListParagraph"/>
+              <w:numPr>
+                <w:ilvl w:val="0"/>
+                <w:numId w:val="3"/>
+              </w:numPr>
+              <w:spacing w:after="40"/>
+            </w:pPr>
+            <w:r>
+              <w:rPr>
+                <w:b/>
+                <w:bCs/>
+                <w:color w:val="5B3FD6"/>
+                <w:sz w:val="21"/>
+                <w:szCs w:val="21"/>
+              </w:rPr>
+              <w:t xml:space="preserve">(a)  </w:t>
+            </w:r>
+            <w:r>
+              <w:rPr>
+                <w:color w:val="1A0F5C"/>
+                <w:sz w:val="21"/>
+                <w:szCs w:val="21"/>
+              </w:rPr>
+              <w:t xml:space="preserve">Assumes one row per order, which holds only once payments are brought to one row per order; O-1 has two payment rows inside the quarter, so the join repeats it. The fan-out is Tuesday's round 1 trap.</w:t>
+            </w:r>
+          </w:p>
+          <w:p>
+            <w:pPr>
+              <w:pStyle w:val="ListParagraph"/>
+              <w:numPr>
+                <w:ilvl w:val="0"/>
+                <w:numId w:val="3"/>
+              </w:numPr>
+              <w:spacing w:after="40"/>
+            </w:pPr>
+            <w:r>
+              <w:rPr>
+                <w:b/>
+                <w:bCs/>
+                <w:color w:val="5B3FD6"/>
+                <w:sz w:val="21"/>
+                <w:szCs w:val="21"/>
+              </w:rPr>
+              <w:t xml:space="preserve">(c)  </w:t>
+            </w:r>
+            <w:r>
+              <w:rPr>
+                <w:color w:val="1A0F5C"/>
+                <w:sz w:val="21"/>
+                <w:szCs w:val="21"/>
+              </w:rPr>
+              <w:t xml:space="preserve">Keeps O-3 as if its NULL date passed the filter. A comparison with NULL is unknown and WHERE keeps only rows where it is true, which is how the LEFT JOIN with a date filter in Tuesday's round 3 emptied the unpaid list.</w:t>
+            </w:r>
+          </w:p>
+          <w:p>
+            <w:pPr>
+              <w:pStyle w:val="ListParagraph"/>
+              <w:numPr>
+                <w:ilvl w:val="0"/>
+                <w:numId w:val="3"/>
+              </w:numPr>
+              <w:spacing w:after="40"/>
+            </w:pPr>
+            <w:r>
+              <w:rPr>
+                <w:b/>
+                <w:bCs/>
+                <w:color w:val="5B3FD6"/>
+                <w:sz w:val="21"/>
+                <w:szCs w:val="21"/>
+              </w:rPr>
+              <w:t xml:space="preserve">(d)  </w:t>
+            </w:r>
+            <w:r>
+              <w:rPr>
+                <w:color w:val="1A0F5C"/>
+                <w:sz w:val="21"/>
+                <w:szCs w:val="21"/>
+              </w:rPr>
+              <w:t xml:space="preserve">Reads the WHERE as if it sat in the ON clause, where it would keep every order and leave NULL payments on O-2 and O-3. In WHERE it runs after the join and turns the LEFT JOIN into an INNER one, which is Tuesday's round 3 trap.</w:t>
+            </w:r>
+          </w:p>
+          <w:p>
+            <w:pPr>
+              <w:spacing w:before="60"/>
+            </w:pPr>
+            <w:r>
+              <w:rPr>
+                <w:b/>
+                <w:bCs/>
+                <w:color w:val="1A0F5C"/>
+                <w:sz w:val="21"/>
+                <w:szCs w:val="21"/>
+              </w:rPr>
+              <w:t xml:space="preserve">In the interview.  </w:t>
+            </w:r>
+            <w:r>
+              <w:rPr>
+                <w:color w:val="1A0F5C"/>
+                <w:sz w:val="21"/>
+                <w:szCs w:val="21"/>
+              </w:rPr>
+              <w:t xml:space="preserve">INNER keeps only the matched rows and LEFT keeps every left row with NULLs where nothing matched; both repeat a left row once per matching right row, and a WHERE on the right-hand table drops the NULL rows and turns the LEFT back into an INNER, so a filter on payments goes in ON and the payments go to one row per order before the join.</w:t>
+            </w:r>
+          </w:p>
+          <w:p>
+            <w:pPr>
+              <w:spacing w:after="80"/>
+            </w:pPr>
+            <w:r>
+              <w:rPr>
+                <w:color w:val="6B6690"/>
+                <w:sz w:val="18"/>
+                <w:szCs w:val="18"/>
+              </w:rPr>
+              <w:t xml:space="preserve">Anchor: INNER against LEFT join: what does each drop or keep?</w:t>
+            </w:r>
+          </w:p>
+        </w:tc>
+      </w:tr>
+    </w:tbl>
+    <w:p>
+      <w:pPr>
+        <w:spacing w:after="90"/>
+      </w:pPr>
+    </w:p>
+    <w:tbl>
+      <w:tblPr>
+        <w:tblW w:type="dxa" w:w="9806"/>
+        <w:tblBorders>
+          <w:top w:val="single" w:color="auto" w:sz="4"/>
+          <w:left w:val="single" w:color="auto" w:sz="4"/>
+          <w:bottom w:val="single" w:color="auto" w:sz="4"/>
+          <w:right w:val="single" w:color="auto" w:sz="4"/>
+          <w:insideH w:val="single" w:color="auto" w:sz="4"/>
+          <w:insideV w:val="single" w:color="auto" w:sz="4"/>
+        </w:tblBorders>
+      </w:tblPr>
+      <w:tblGrid>
+        <w:gridCol w:w="9806"/>
+      </w:tblGrid>
+      <w:tr>
+        <w:trPr>
+          <w:cantSplit/>
+        </w:trPr>
+        <w:tc>
+          <w:tcPr>
+            <w:tcW w:type="dxa" w:w="9806"/>
+            <w:tcBorders>
+              <w:top w:val="single" w:color="CFC9EE" w:sz="6"/>
+              <w:left w:val="single" w:color="CFC9EE" w:sz="6"/>
+              <w:bottom w:val="single" w:color="CFC9EE" w:sz="6"/>
+              <w:right w:val="single" w:color="CFC9EE" w:sz="6"/>
+            </w:tcBorders>
+            <w:tcMar>
+              <w:top w:type="dxa" w:w="90"/>
+              <w:left w:type="dxa" w:w="140"/>
+              <w:bottom w:type="dxa" w:w="90"/>
+              <w:right w:type="dxa" w:w="140"/>
+            </w:tcMar>
+          </w:tcPr>
+          <w:p>
+            <w:pPr>
+              <w:spacing w:after="80"/>
+            </w:pPr>
+            <w:r>
+              <w:rPr>
+                <w:b/>
+                <w:bCs/>
+                <w:color w:val="5B3FD6"/>
+                <w:sz w:val="24"/>
+                <w:szCs w:val="24"/>
+              </w:rPr>
+              <w:t xml:space="preserve">Q54</w:t>
+            </w:r>
+            <w:r>
+              <w:rPr>
+                <w:b/>
+                <w:bCs/>
+                <w:color w:val="1A0F5C"/>
+                <w:sz w:val="21"/>
+                <w:szCs w:val="21"/>
+              </w:rPr>
+              <w:t xml:space="preserve">   key d</w:t>
+            </w:r>
+            <w:r>
+              <w:rPr>
+                <w:color w:val="6B6690"/>
+                <w:sz w:val="18"/>
+                <w:szCs w:val="18"/>
+              </w:rPr>
+              <w:t xml:space="preserve">   One correct option, Hard, [S], Thu</w:t>
+            </w:r>
+          </w:p>
+          <w:p>
+            <w:pPr>
+              <w:spacing w:after="80"/>
+            </w:pPr>
+            <w:r>
+              <w:rPr>
+                <w:b/>
+                <w:bCs/>
+                <w:color w:val="1A0F5C"/>
+                <w:sz w:val="21"/>
+                <w:szCs w:val="21"/>
+              </w:rPr>
+              <w:t xml:space="preserve">Why it holds.  </w:t>
+            </w:r>
+            <w:r>
+              <w:rPr>
+                <w:color w:val="1A0F5C"/>
+                <w:sz w:val="21"/>
+                <w:szCs w:val="21"/>
+              </w:rPr>
+              <w:t xml:space="preserve">how='right' keeps every customer in reached, so t holds 5 rows, and validate passes because no key repeats. C5, C6 and C7 never ordered, so the merge gives them NaN for segment and for orders. groupby drops a missing key by default, so those three rows never reach a group: reached sums to 2 and bought to 2, and the slide reads 2 of 2 reached customers bought, 100 percent, where 2 of the 5 reached bought, 40 percent. Run on pandas 3.0.5 on 30 September 2026, the code prints 5 2 2.</w:t>
+            </w:r>
+          </w:p>
+          <w:p>
+            <w:pPr>
+              <w:pStyle w:val="ListParagraph"/>
+              <w:numPr>
+                <w:ilvl w:val="0"/>
+                <w:numId w:val="3"/>
+              </w:numPr>
+              <w:spacing w:after="40"/>
+            </w:pPr>
+            <w:r>
+              <w:rPr>
+                <w:b/>
+                <w:bCs/>
+                <w:color w:val="5B3FD6"/>
+                <w:sz w:val="21"/>
+                <w:szCs w:val="21"/>
+              </w:rPr>
+              <w:t xml:space="preserve">(a)  </w:t>
+            </w:r>
+            <w:r>
+              <w:rPr>
+                <w:color w:val="1A0F5C"/>
+                <w:sz w:val="21"/>
+                <w:szCs w:val="21"/>
+              </w:rPr>
+              <w:t xml:space="preserve">Reads the merge as an inner one, which would keep only C1 and C2. An inner merge is the default, and how='right' here keeps all five reached customers; Thursday's round 2 showed the default dropping every customer the sale did not reach.</w:t>
+            </w:r>
+          </w:p>
+          <w:p>
+            <w:pPr>
+              <w:pStyle w:val="ListParagraph"/>
+              <w:numPr>
+                <w:ilvl w:val="0"/>
+                <w:numId w:val="3"/>
+              </w:numPr>
+              <w:spacing w:after="40"/>
+            </w:pPr>
+            <w:r>
+              <w:rPr>
+                <w:b/>
+                <w:bCs/>
+                <w:color w:val="5B3FD6"/>
+                <w:sz w:val="21"/>
+                <w:szCs w:val="21"/>
+              </w:rPr>
+              <w:t xml:space="preserve">(b)  </w:t>
+            </w:r>
+            <w:r>
+              <w:rPr>
+                <w:color w:val="1A0F5C"/>
+                <w:sz w:val="21"/>
+                <w:szCs w:val="21"/>
+              </w:rPr>
+              <w:t xml:space="preserve">Reads how='right' as if it kept the left frame, the four buyers built from order rows. A frame built from order rows holds only the customers who ordered, which is why Thursday's round 1 built the table on the customer list; a right merge keeps every row of the right-hand frame, here the five reached.</w:t>
+            </w:r>
+          </w:p>
+          <w:p>
+            <w:pPr>
+              <w:pStyle w:val="ListParagraph"/>
+              <w:numPr>
+                <w:ilvl w:val="0"/>
+                <w:numId w:val="3"/>
+              </w:numPr>
+              <w:spacing w:after="40"/>
+            </w:pPr>
+            <w:r>
+              <w:rPr>
+                <w:b/>
+                <w:bCs/>
+                <w:color w:val="5B3FD6"/>
+                <w:sz w:val="21"/>
+                <w:szCs w:val="21"/>
+              </w:rPr>
+              <w:t xml:space="preserve">(c)  </w:t>
+            </w:r>
+            <w:r>
+              <w:rPr>
+                <w:color w:val="1A0F5C"/>
+                <w:sz w:val="21"/>
+                <w:szCs w:val="21"/>
+              </w:rPr>
+              <w:t xml:space="preserve">Counts the three customers with no segment as a group of their own, which is what groupby does only with dropna=False. The default drops a missing key: Thursday's round 2 trap, where reach read 100 percent conversion until dropna=False showed the missing group.</w:t>
+            </w:r>
+          </w:p>
+          <w:p>
+            <w:pPr>
+              <w:spacing w:before="60"/>
+            </w:pPr>
+            <w:r>
+              <w:rPr>
+                <w:b/>
+                <w:bCs/>
+                <w:color w:val="1A0F5C"/>
+                <w:sz w:val="21"/>
+                <w:szCs w:val="21"/>
+              </w:rPr>
+              <w:t xml:space="preserve">In the interview.  </w:t>
+            </w:r>
+            <w:r>
+              <w:rPr>
+                <w:color w:val="1A0F5C"/>
+                <w:sz w:val="21"/>
+                <w:szCs w:val="21"/>
+              </w:rPr>
+              <w:t xml:space="preserve">groupby splits the rows by a key, applies a computation to each group and combines one row per group, and a row whose key is missing belongs to no group, so the default drops it; after a merge that can leave a key empty I group from the full list or pass dropna=False, and check that the groups add back to the rows.</w:t>
+            </w:r>
+          </w:p>
+          <w:p>
+            <w:pPr>
+              <w:spacing w:after="80"/>
+            </w:pPr>
+            <w:r>
+              <w:rPr>
+                <w:color w:val="6B6690"/>
+                <w:sz w:val="18"/>
+                <w:szCs w:val="18"/>
+              </w:rPr>
+              <w:t xml:space="preserve">Anchor: groupby in the split-apply-combine sentence.</w:t>
+            </w:r>
+          </w:p>
+        </w:tc>
+      </w:tr>
+    </w:tbl>
+    <w:p>
+      <w:pPr>
+        <w:spacing w:after="90"/>
+      </w:pPr>
+    </w:p>
+    <w:tbl>
+      <w:tblPr>
+        <w:tblW w:type="dxa" w:w="9806"/>
+        <w:tblBorders>
+          <w:top w:val="single" w:color="auto" w:sz="4"/>
+          <w:left w:val="single" w:color="auto" w:sz="4"/>
+          <w:bottom w:val="single" w:color="auto" w:sz="4"/>
+          <w:right w:val="single" w:color="auto" w:sz="4"/>
+          <w:insideH w:val="single" w:color="auto" w:sz="4"/>
+          <w:insideV w:val="single" w:color="auto" w:sz="4"/>
+        </w:tblBorders>
+      </w:tblPr>
+      <w:tblGrid>
+        <w:gridCol w:w="9806"/>
+      </w:tblGrid>
+      <w:tr>
+        <w:trPr>
+          <w:cantSplit/>
+        </w:trPr>
+        <w:tc>
+          <w:tcPr>
+            <w:tcW w:type="dxa" w:w="9806"/>
+            <w:tcBorders>
+              <w:top w:val="single" w:color="CFC9EE" w:sz="6"/>
+              <w:left w:val="single" w:color="CFC9EE" w:sz="6"/>
+              <w:bottom w:val="single" w:color="CFC9EE" w:sz="6"/>
+              <w:right w:val="single" w:color="CFC9EE" w:sz="6"/>
+            </w:tcBorders>
+            <w:tcMar>
+              <w:top w:type="dxa" w:w="90"/>
+              <w:left w:type="dxa" w:w="140"/>
+              <w:bottom w:type="dxa" w:w="90"/>
+              <w:right w:type="dxa" w:w="140"/>
+            </w:tcMar>
+          </w:tcPr>
+          <w:p>
+            <w:pPr>
+              <w:spacing w:after="80"/>
+            </w:pPr>
+            <w:r>
+              <w:rPr>
+                <w:b/>
+                <w:bCs/>
+                <w:color w:val="5B3FD6"/>
+                <w:sz w:val="24"/>
+                <w:szCs w:val="24"/>
+              </w:rPr>
+              <w:t xml:space="preserve">Q55</w:t>
             </w:r>
             <w:r>
               <w:rPr>
@@ -24123,7 +25514,7 @@
           <w:sz w:val="21"/>
           <w:szCs w:val="21"/>
         </w:rPr>
-        <w:t xml:space="preserve">[S] (27): Q2, Q4, Q6, Q7, Q8, Q12, Q14, Q15, Q16, Q17, Q18, Q21, Q23, Q24, Q27, Q28, Q29, Q30, Q32, Q34, Q35, Q40, Q42, Q43, Q45, Q48, Q52</w:t>
+        <w:t xml:space="preserve">[S] (29): Q2, Q4, Q6, Q7, Q8, Q12, Q14, Q15, Q16, Q17, Q18, Q21, Q23, Q24, Q27, Q28, Q29, Q30, Q32, Q34, Q35, Q40, Q42, Q43, Q45, Q48, Q53, Q54, Q55</w:t>
       </w:r>
     </w:p>
     <w:p>
@@ -24177,7 +25568,7 @@
           <w:sz w:val="21"/>
           <w:szCs w:val="21"/>
         </w:rPr>
-        <w:t xml:space="preserve">[D] (6): Q20, Q33, Q37, Q38, Q49, Q51</w:t>
+        <w:t xml:space="preserve">[D] (7): Q20, Q33, Q37, Q38, Q49, Q51, Q52</w:t>
       </w:r>
     </w:p>
     <w:p>
@@ -24213,7 +25604,7 @@
           <w:sz w:val="21"/>
           <w:szCs w:val="21"/>
         </w:rPr>
-        <w:t xml:space="preserve">Medium (34): Q1, Q2, Q3, Q5, Q7, Q9, Q13, Q14, Q16, Q18, Q19, Q21, Q23, Q24, Q25, Q26, Q27, Q29, Q30, Q34, Q35, Q39, Q40, Q41, Q42, Q43, Q44, Q45, Q46, Q47, Q48, Q50, Q51, Q52</w:t>
+        <w:t xml:space="preserve">Medium (34): Q1, Q2, Q3, Q5, Q7, Q9, Q13, Q14, Q16, Q18, Q19, Q21, Q23, Q24, Q25, Q26, Q27, Q29, Q30, Q34, Q35, Q39, Q40, Q41, Q42, Q43, Q44, Q45, Q46, Q47, Q48, Q50, Q51, Q55</w:t>
       </w:r>
     </w:p>
     <w:p>
@@ -24231,7 +25622,88 @@
           <w:sz w:val="21"/>
           <w:szCs w:val="21"/>
         </w:rPr>
-        <w:t xml:space="preserve">Hard (10): Q8, Q20, Q22, Q31, Q32, Q33, Q36, Q37, Q38, Q49</w:t>
+        <w:t xml:space="preserve">Hard (13): Q8, Q20, Q22, Q31, Q32, Q33, Q36, Q37, Q38, Q49, Q52, Q53, Q54</w:t>
+      </w:r>
+    </w:p>
+    <w:p>
+      <w:pPr>
+        <w:spacing w:after="100" w:before="240"/>
+      </w:pPr>
+      <w:r>
+        <w:rPr>
+          <w:rFonts w:ascii="Georgia" w:cs="Georgia" w:eastAsia="Georgia" w:hAnsi="Georgia"/>
+          <w:color w:val="1A0F5C"/>
+          <w:sz w:val="26"/>
+          <w:szCs w:val="26"/>
+        </w:rPr>
+        <w:t xml:space="preserve">New items waiting for the tracker</w:t>
+      </w:r>
+    </w:p>
+    <w:p>
+      <w:pPr>
+        <w:spacing w:after="80"/>
+      </w:pPr>
+      <w:r>
+        <w:rPr>
+          <w:color w:val="1A0F5C"/>
+          <w:sz w:val="21"/>
+          <w:szCs w:val="21"/>
+        </w:rPr>
+        <w:t xml:space="preserve">These items come from the week's source file, not the tracker. Accept one by adding it to the tracker's Saturday papers tab.</w:t>
+      </w:r>
+    </w:p>
+    <w:p>
+      <w:pPr>
+        <w:pStyle w:val="ListParagraph"/>
+        <w:numPr>
+          <w:ilvl w:val="0"/>
+          <w:numId w:val="3"/>
+        </w:numPr>
+        <w:spacing w:after="40"/>
+      </w:pPr>
+      <w:r>
+        <w:rPr>
+          <w:color w:val="1A0F5C"/>
+          <w:sz w:val="21"/>
+          <w:szCs w:val="21"/>
+        </w:rPr>
+        <w:t xml:space="preserve">Q52 (One correct option, Hard, [D]): The head of Retail-Plus asks whether spend per member fell from Q1 to Q2, and the analyst answers with the query above. What does it return, and what does it tell her?</w:t>
+      </w:r>
+    </w:p>
+    <w:p>
+      <w:pPr>
+        <w:pStyle w:val="ListParagraph"/>
+        <w:numPr>
+          <w:ilvl w:val="0"/>
+          <w:numId w:val="3"/>
+        </w:numPr>
+        <w:spacing w:after="40"/>
+      </w:pPr>
+      <w:r>
+        <w:rPr>
+          <w:color w:val="1A0F5C"/>
+          <w:sz w:val="21"/>
+          <w:szCs w:val="21"/>
+        </w:rPr>
+        <w:t xml:space="preserve">Q53 (Scenario set, Hard, [S]): Anand wants every Q2 order beside what was collected on it within the quarter. Before the report goes to him, the analyst runs the query above to count its rows and their booked value. What does it return?</w:t>
+      </w:r>
+    </w:p>
+    <w:p>
+      <w:pPr>
+        <w:pStyle w:val="ListParagraph"/>
+        <w:numPr>
+          <w:ilvl w:val="0"/>
+          <w:numId w:val="3"/>
+        </w:numPr>
+        <w:spacing w:after="40"/>
+      </w:pPr>
+      <w:r>
+        <w:rPr>
+          <w:color w:val="1A0F5C"/>
+          <w:sz w:val="21"/>
+          <w:szCs w:val="21"/>
+        </w:rPr>
+        <w:t xml:space="preserve">Q54 (One correct option, Hard, [S]): The marketing lead asks how many customers the monsoon sale reached and how many of them bought, and the analyst runs the code above. What does it print?</w:t>
       </w:r>
     </w:p>
     <w:p>

</xml_diff>

<commit_message>
Week 2 Saturday v3: the paper raised after the blind sitting
Ten items rebuilt as several steps on an exhibit (Q8, Q10, Q11, Q15, Q16,
Q20, Q27, Q28, Q29, Q32), Q1 turned into worked arithmetic, Q5 and Q13
relabelled medium and Q34 hard, so 21 of 35 items are hard in fact. Every
give-away, cross-item leak and arguable key the sitting found is closed, the
public-case facts are corrected against their sources, the invented Part 6
company is no longer named, and every key is proved again.

Co-Authored-By: Claude Opus 5.5 <noreply@anthropic.com>
Claude-Session: https://claude.ai/code/session_01P7zaoR4dQ5pzBFnsX549JQ
</commit_message>
<xml_diff>
--- a/content/W02/SAT/answer-key/C2_W02_SAT_answer_key_TRAINER.docx
+++ b/content/W02/SAT/answer-key/C2_W02_SAT_answer_key_TRAINER.docx
@@ -653,7 +653,7 @@
                 <w:sz w:val="18"/>
                 <w:szCs w:val="18"/>
               </w:rPr>
-              <w:t xml:space="preserve">whether you read a query the way the database runs it, and choose where a number Finance audits is computed</w:t>
+              <w:t xml:space="preserve">whether you read a query the way the database runs it, and place each piece of work where it belongs</w:t>
             </w:r>
           </w:p>
         </w:tc>
@@ -689,7 +689,7 @@
                 <w:sz w:val="18"/>
                 <w:szCs w:val="18"/>
               </w:rPr>
-              <w:t xml:space="preserve">17.5</w:t>
+              <w:t xml:space="preserve">16</w:t>
             </w:r>
           </w:p>
         </w:tc>
@@ -761,7 +761,7 @@
                 <w:sz w:val="18"/>
                 <w:szCs w:val="18"/>
               </w:rPr>
-              <w:t xml:space="preserve">1</w:t>
+              <w:t xml:space="preserve">2</w:t>
             </w:r>
           </w:p>
         </w:tc>
@@ -797,7 +797,7 @@
                 <w:sz w:val="18"/>
                 <w:szCs w:val="18"/>
               </w:rPr>
-              <w:t xml:space="preserve">3</w:t>
+              <w:t xml:space="preserve">2</w:t>
             </w:r>
           </w:p>
         </w:tc>
@@ -1235,7 +1235,7 @@
                 <w:sz w:val="18"/>
                 <w:szCs w:val="18"/>
               </w:rPr>
-              <w:t xml:space="preserve">whether you rank within a segment with the tie rule the business asked for, and read a monthly flag and a run rate before anyone acts</w:t>
+              <w:t xml:space="preserve">whether you rank within a segment by the rule the business set, and read a monthly flag and a plan line before anyone acts</w:t>
             </w:r>
           </w:p>
         </w:tc>
@@ -1271,7 +1271,7 @@
                 <w:sz w:val="18"/>
                 <w:szCs w:val="18"/>
               </w:rPr>
-              <w:t xml:space="preserve">18.5</w:t>
+              <w:t xml:space="preserve">17</w:t>
             </w:r>
           </w:p>
         </w:tc>
@@ -1343,7 +1343,7 @@
                 <w:sz w:val="18"/>
                 <w:szCs w:val="18"/>
               </w:rPr>
-              <w:t xml:space="preserve">1</w:t>
+              <w:t xml:space="preserve">2</w:t>
             </w:r>
           </w:p>
         </w:tc>
@@ -1379,7 +1379,7 @@
                 <w:sz w:val="18"/>
                 <w:szCs w:val="18"/>
               </w:rPr>
-              <w:t xml:space="preserve">4</w:t>
+              <w:t xml:space="preserve">3</w:t>
             </w:r>
           </w:p>
         </w:tc>
@@ -1817,7 +1817,7 @@
                 <w:sz w:val="18"/>
                 <w:szCs w:val="18"/>
               </w:rPr>
-              <w:t xml:space="preserve">whether you match each workbook job to the technique that does it, and name the check that catches a spreadsheet error before the room sees it</w:t>
+              <w:t xml:space="preserve">whether you match each workbook job to the technique that does it, and work a spreadsheet error through before the room sees it</w:t>
             </w:r>
           </w:p>
         </w:tc>
@@ -1853,7 +1853,7 @@
                 <w:sz w:val="18"/>
                 <w:szCs w:val="18"/>
               </w:rPr>
-              <w:t xml:space="preserve">20.5</w:t>
+              <w:t xml:space="preserve">22</w:t>
             </w:r>
           </w:p>
         </w:tc>
@@ -1925,7 +1925,7 @@
                 <w:sz w:val="18"/>
                 <w:szCs w:val="18"/>
               </w:rPr>
-              <w:t xml:space="preserve">5</w:t>
+              <w:t xml:space="preserve">4</w:t>
             </w:r>
           </w:p>
         </w:tc>
@@ -1961,7 +1961,7 @@
                 <w:sz w:val="18"/>
                 <w:szCs w:val="18"/>
               </w:rPr>
-              <w:t xml:space="preserve">2</w:t>
+              <w:t xml:space="preserve">3</w:t>
             </w:r>
           </w:p>
         </w:tc>
@@ -2144,7 +2144,7 @@
                 <w:sz w:val="18"/>
                 <w:szCs w:val="18"/>
               </w:rPr>
-              <w:t xml:space="preserve">21</w:t>
+              <w:t xml:space="preserve">22.5</w:t>
             </w:r>
           </w:p>
         </w:tc>
@@ -2216,7 +2216,7 @@
                 <w:sz w:val="18"/>
                 <w:szCs w:val="18"/>
               </w:rPr>
-              <w:t xml:space="preserve">2</w:t>
+              <w:t xml:space="preserve">1</w:t>
             </w:r>
           </w:p>
         </w:tc>
@@ -2252,7 +2252,7 @@
                 <w:sz w:val="18"/>
                 <w:szCs w:val="18"/>
               </w:rPr>
-              <w:t xml:space="preserve">4</w:t>
+              <w:t xml:space="preserve">5</w:t>
             </w:r>
           </w:p>
         </w:tc>
@@ -2580,7 +2580,7 @@
           <w:sz w:val="21"/>
           <w:szCs w:val="21"/>
         </w:rPr>
-        <w:t xml:space="preserve">A learner who guessed every item blind would average 6.9 of 35, since a written answer cannot be guessed from a list, and fewer than one guesser in twenty would reach 12. A score of 11 or below is therefore within reach of guessing alone, and the tally reads such a paper as a conversation to have on Monday, never as a result.</w:t>
+        <w:t xml:space="preserve">A learner who guessed every item blind would average 6.4 of 35, since a written answer cannot be guessed from a list, and fewer than one guesser in twenty would reach 11. A score of 10 or below is therefore within reach of guessing alone, and the tally reads such a paper as a conversation to have on Monday, never as a result.</w:t>
       </w:r>
     </w:p>
     <w:p>
@@ -3026,7 +3026,7 @@
                 <w:sz w:val="18"/>
                 <w:szCs w:val="18"/>
               </w:rPr>
-              <w:t xml:space="preserve">C</w:t>
+              <w:t xml:space="preserve">It prints 2 and 1. The true figures are 2.36 and 1.84, a fall of about 22 percent.</w:t>
             </w:r>
           </w:p>
         </w:tc>
@@ -3062,7 +3062,7 @@
                 <w:sz w:val="18"/>
                 <w:szCs w:val="18"/>
               </w:rPr>
-              <w:t xml:space="preserve">One correct option</w:t>
+              <w:t xml:space="preserve">Applied maths</w:t>
             </w:r>
           </w:p>
         </w:tc>
@@ -4190,7 +4190,7 @@
                 <w:sz w:val="18"/>
                 <w:szCs w:val="18"/>
               </w:rPr>
-              <w:t xml:space="preserve">A</w:t>
+              <w:t xml:space="preserve">B</w:t>
             </w:r>
           </w:p>
         </w:tc>
@@ -4298,7 +4298,7 @@
                 <w:sz w:val="18"/>
                 <w:szCs w:val="18"/>
               </w:rPr>
-              <w:t xml:space="preserve">Hard</w:t>
+              <w:t xml:space="preserve">Medium</w:t>
             </w:r>
           </w:p>
         </w:tc>
@@ -5063,7 +5063,7 @@
                 <w:sz w:val="18"/>
                 <w:szCs w:val="18"/>
               </w:rPr>
-              <w:t xml:space="preserve">C, E, A, D, B</w:t>
+              <w:t xml:space="preserve">E, F, B, C, A</w:t>
             </w:r>
           </w:p>
         </w:tc>
@@ -6518,7 +6518,7 @@
                 <w:sz w:val="18"/>
                 <w:szCs w:val="18"/>
               </w:rPr>
-              <w:t xml:space="preserve">D</w:t>
+              <w:t xml:space="preserve">C</w:t>
             </w:r>
           </w:p>
         </w:tc>
@@ -6626,7 +6626,7 @@
                 <w:sz w:val="18"/>
                 <w:szCs w:val="18"/>
               </w:rPr>
-              <w:t xml:space="preserve">Hard</w:t>
+              <w:t xml:space="preserve">Medium</w:t>
             </w:r>
           </w:p>
         </w:tc>
@@ -8555,7 +8555,7 @@
                 <w:sz w:val="18"/>
                 <w:szCs w:val="18"/>
               </w:rPr>
-              <w:t xml:space="preserve">C</w:t>
+              <w:t xml:space="preserve">D</w:t>
             </w:r>
           </w:p>
         </w:tc>
@@ -9428,7 +9428,7 @@
                 <w:sz w:val="18"/>
                 <w:szCs w:val="18"/>
               </w:rPr>
-              <w:t xml:space="preserve">D (XLOOKUP with a message for a missing id)</w:t>
+              <w:t xml:space="preserve">D (XLOOKUP with its if_not_found argument set)</w:t>
             </w:r>
           </w:p>
         </w:tc>
@@ -9719,7 +9719,7 @@
                 <w:sz w:val="18"/>
                 <w:szCs w:val="18"/>
               </w:rPr>
-              <w:t xml:space="preserve">A (SUBTOTAL(109, ...) at the foot of the list)</w:t>
+              <w:t xml:space="preserve">A (SUBTOTAL with function number 109)</w:t>
             </w:r>
           </w:p>
         </w:tc>
@@ -10010,7 +10010,7 @@
                 <w:sz w:val="18"/>
                 <w:szCs w:val="18"/>
               </w:rPr>
-              <w:t xml:space="preserve">F (a first-row flag per order, summed with SUMIFS)</w:t>
+              <w:t xml:space="preserve">F (a first-row flag per order, then SUMIFS)</w:t>
             </w:r>
           </w:p>
         </w:tc>
@@ -10301,7 +10301,7 @@
                 <w:sz w:val="18"/>
                 <w:szCs w:val="18"/>
               </w:rPr>
-              <w:t xml:space="preserve">C (a labelled input cell beside the actual figure)</w:t>
+              <w:t xml:space="preserve">C (a labelled input cell feeding a scenario line)</w:t>
             </w:r>
           </w:p>
         </w:tc>
@@ -10592,7 +10592,7 @@
                 <w:sz w:val="18"/>
                 <w:szCs w:val="18"/>
               </w:rPr>
-              <w:t xml:space="preserve">D</w:t>
+              <w:t xml:space="preserve">B8 returns -0.5; the six rows average 1.0; the formula understates growth by 1.5 points and turns growth into a fall.</w:t>
             </w:r>
           </w:p>
         </w:tc>
@@ -10628,7 +10628,7 @@
                 <w:sz w:val="18"/>
                 <w:szCs w:val="18"/>
               </w:rPr>
-              <w:t xml:space="preserve">One correct option</w:t>
+              <w:t xml:space="preserve">Applied maths</w:t>
             </w:r>
           </w:p>
         </w:tc>
@@ -10883,7 +10883,7 @@
                 <w:sz w:val="18"/>
                 <w:szCs w:val="18"/>
               </w:rPr>
-              <w:t xml:space="preserve">A</w:t>
+              <w:t xml:space="preserve">B</w:t>
             </w:r>
           </w:p>
         </w:tc>
@@ -11174,7 +11174,7 @@
                 <w:sz w:val="18"/>
                 <w:szCs w:val="18"/>
               </w:rPr>
-              <w:t xml:space="preserve">0.60 dollars a trip</w:t>
+              <w:t xml:space="preserve">2.00 dollars, about 8.5 percent of the 23.50 dollars charged</w:t>
             </w:r>
           </w:p>
         </w:tc>
@@ -11282,7 +11282,7 @@
                 <w:sz w:val="18"/>
                 <w:szCs w:val="18"/>
               </w:rPr>
-              <w:t xml:space="preserve">Medium</w:t>
+              <w:t xml:space="preserve">Hard</w:t>
             </w:r>
           </w:p>
         </w:tc>
@@ -12047,7 +12047,7 @@
                 <w:sz w:val="18"/>
                 <w:szCs w:val="18"/>
               </w:rPr>
-              <w:t xml:space="preserve">B</w:t>
+              <w:t xml:space="preserve">A</w:t>
             </w:r>
           </w:p>
         </w:tc>
@@ -12737,7 +12737,7 @@
                 <w:sz w:val="18"/>
                 <w:szCs w:val="18"/>
               </w:rPr>
-              <w:t xml:space="preserve">Medium</w:t>
+              <w:t xml:space="preserve">Hard</w:t>
             </w:r>
           </w:p>
         </w:tc>
@@ -13220,7 +13220,7 @@
                 <w:sz w:val="21"/>
                 <w:szCs w:val="21"/>
               </w:rPr>
-              <w:t xml:space="preserve">   Key C</w:t>
+              <w:t xml:space="preserve">   Key It prints 2 and 1. The true figures are 2.36 and 1.84, a fall of about 22 percent.</w:t>
             </w:r>
             <w:r>
               <w:rPr>
@@ -13229,7 +13229,7 @@
                 <w:sz w:val="18"/>
                 <w:szCs w:val="18"/>
               </w:rPr>
-              <w:t xml:space="preserve">   One correct option, Hard, [F], Mon</w:t>
+              <w:t xml:space="preserve">   Applied maths, Hard, [F], Mon</w:t>
             </w:r>
           </w:p>
           <w:p>
@@ -13255,88 +13255,7 @@
                 <w:sz w:val="21"/>
                 <w:szCs w:val="21"/>
               </w:rPr>
-              <w:t xml:space="preserve">count(*) and count(DISTINCT customer_id) are both integers, so Postgres divides integers and drops the fraction: 215 / 91 returns 2 and 140 / 76 returns 1. The true figures are 2.36 and 1.84, a fall of 22 percent, and casting one side, count(*)::numeric, prints them. The check is to multiply back: 1 times 76 members is 76, against 140 orders. Run on PostgreSQL 16.13 on the week's warehouse on 30 September 2026.</w:t>
-            </w:r>
-          </w:p>
-          <w:p>
-            <w:pPr>
-              <w:keepNext/>
-              <w:spacing w:after="40" w:line="264"/>
-              <w:ind w:left="360" w:hanging="360"/>
-            </w:pPr>
-            <w:r>
-              <w:rPr>
-                <w:rFonts w:ascii="Arial" w:cs="Arial" w:eastAsia="Arial" w:hAnsi="Arial"/>
-                <w:b/>
-                <w:bCs/>
-                <w:color w:val="1C1B16"/>
-                <w:sz w:val="20"/>
-                <w:szCs w:val="20"/>
-              </w:rPr>
-              <w:t xml:space="preserve">A.  </w:t>
-            </w:r>
-            <w:r>
-              <w:rPr>
-                <w:rFonts w:ascii="Arial" w:cs="Arial" w:eastAsia="Arial" w:hAnsi="Arial"/>
-                <w:color w:val="1C1B16"/>
-                <w:sz w:val="20"/>
-                <w:szCs w:val="20"/>
-              </w:rPr>
-              <w:t xml:space="preserve">The decimals appear only when one side is numeric, as in count(*)::numeric; two integer counts divide as integers. This is the number the query should print, and does not.</w:t>
-            </w:r>
-          </w:p>
-          <w:p>
-            <w:pPr>
-              <w:keepNext/>
-              <w:spacing w:after="40" w:line="264"/>
-              <w:ind w:left="360" w:hanging="360"/>
-            </w:pPr>
-            <w:r>
-              <w:rPr>
-                <w:rFonts w:ascii="Arial" w:cs="Arial" w:eastAsia="Arial" w:hAnsi="Arial"/>
-                <w:b/>
-                <w:bCs/>
-                <w:color w:val="1C1B16"/>
-                <w:sz w:val="20"/>
-                <w:szCs w:val="20"/>
-              </w:rPr>
-              <w:t xml:space="preserve">B.  </w:t>
-            </w:r>
-            <w:r>
-              <w:rPr>
-                <w:rFonts w:ascii="Arial" w:cs="Arial" w:eastAsia="Arial" w:hAnsi="Arial"/>
-                <w:color w:val="1C1B16"/>
-                <w:sz w:val="20"/>
-                <w:szCs w:val="20"/>
-              </w:rPr>
-              <w:t xml:space="preserve">Postgres truncates integer division; it does not round, and 140 / 76 rounded would be 2, which the printed 1 contradicts.</w:t>
-            </w:r>
-          </w:p>
-          <w:p>
-            <w:pPr>
-              <w:keepNext/>
-              <w:spacing w:after="40" w:line="264"/>
-              <w:ind w:left="360" w:hanging="360"/>
-            </w:pPr>
-            <w:r>
-              <w:rPr>
-                <w:rFonts w:ascii="Arial" w:cs="Arial" w:eastAsia="Arial" w:hAnsi="Arial"/>
-                <w:b/>
-                <w:bCs/>
-                <w:color w:val="1C1B16"/>
-                <w:sz w:val="20"/>
-                <w:szCs w:val="20"/>
-              </w:rPr>
-              <w:t xml:space="preserve">D.  </w:t>
-            </w:r>
-            <w:r>
-              <w:rPr>
-                <w:rFonts w:ascii="Arial" w:cs="Arial" w:eastAsia="Arial" w:hAnsi="Arial"/>
-                <w:color w:val="1C1B16"/>
-                <w:sz w:val="20"/>
-                <w:szCs w:val="20"/>
-              </w:rPr>
-              <w:t xml:space="preserve">Reads the printed 2 and 1 as the business fact, which is Monday's round 2 trap: Retail-Plus "halved" and the budget went to Retail-Core, where multiplying back (1 times 76 is 76, against 140 orders) shows the query is wrong.</w:t>
+              <w:t xml:space="preserve">count(*) and count(DISTINCT customer_id) are both integers, so Postgres divides integers and drops the fraction: 215 / 91 prints 2 for April to June, and 140 / 76 prints 1 for July to September. The true figures are 2.36 and 1.84, and 1.84 against 2.36 is a fall of about 22 percent; accept 21 to 22 percent, or about a fifth. A note that quotes the printed 2 and 1 says orders per member halved, which is Monday's round 2 trap. The fix is count(*)::numeric, and the check is to multiply back: 1 times 76 members is 76, against 140 orders. Run on PostgreSQL 16.13 on the week's warehouse on 30 September 2026.</w:t>
             </w:r>
           </w:p>
           <w:p>
@@ -13632,7 +13551,7 @@
                 <w:sz w:val="21"/>
                 <w:szCs w:val="21"/>
               </w:rPr>
-              <w:t xml:space="preserve">A table has no stored order, so without ORDER BY the database returns whichever rows its plan reaches first, and two runs can differ: Monday's sample of five delivered app orders summed to Rs 3,900 and, after a reload that rewrote two rows with their own values, to Rs 4,590. "sort" is the near miss, and it fails because a plan that reads an index does return sorted rows on some runs; what the database withholds is the promise.</w:t>
+              <w:t xml:space="preserve">A table has no stored order, so without ORDER BY the database returns whichever rows its plan reaches first, and two runs can differ: Monday's sample of five delivered app orders summed to Rs 3,900 and, after a reload that rewrote two rows with their own values, to Rs 4,590. Every word in the bank is a noun and fits the blank's grammar; only guarantee fits its sense. "sort" is the near miss, since a plan that reads an index may well return sorted rows on some runs, which is why a sample can look stable until a reload; what the database withholds is the promise.</w:t>
             </w:r>
           </w:p>
           <w:p>
@@ -13893,7 +13812,7 @@
                 <w:sz w:val="21"/>
                 <w:szCs w:val="21"/>
               </w:rPr>
-              <w:t xml:space="preserve">   Key A</w:t>
+              <w:t xml:space="preserve">   Key B</w:t>
             </w:r>
             <w:r>
               <w:rPr>
@@ -13902,7 +13821,7 @@
                 <w:sz w:val="18"/>
                 <w:szCs w:val="18"/>
               </w:rPr>
-              <w:t xml:space="preserve">   One correct option, Hard, [D], Mon</w:t>
+              <w:t xml:space="preserve">   One correct option, Medium, [D], Mon</w:t>
             </w:r>
           </w:p>
           <w:p>
@@ -13928,7 +13847,7 @@
                 <w:sz w:val="21"/>
                 <w:szCs w:val="21"/>
               </w:rPr>
-              <w:t xml:space="preserve">Excel's job is the last mile: presenting a number and letting people explore it. A number that becomes a what-if for the room, with nothing filed from it, has become that job. Every other option is a reason to keep the number in the warehouse, where it reruns unchanged on the source and every step can be audited. Friday's operating rule says the same, and gives the one direction a number travels: the warehouse computes it, pandas carries the analyst's iteration, and Excel presents it to the room, never the other way.</w:t>
+              <w:t xml:space="preserve">Anand's rule is about the reported number, which comes from a saved query that reruns unchanged on the book every Monday and can be read line by line. A first look at a question reports nothing: charts, tests and the first reading of a question belong in a notebook, and a notebook that reads the warehouse works on the same book as the suite. The one direction a number travels is from the warehouse, through pandas for the analyst's iteration, to Excel for the room; once the head of Retail-Plus decides what to report, that number becomes a query in the suite.</w:t>
             </w:r>
           </w:p>
           <w:p>
@@ -13946,7 +13865,7 @@
                 <w:sz w:val="20"/>
                 <w:szCs w:val="20"/>
               </w:rPr>
-              <w:t xml:space="preserve">B.  </w:t>
+              <w:t xml:space="preserve">A.  </w:t>
             </w:r>
             <w:r>
               <w:rPr>
@@ -13955,7 +13874,7 @@
                 <w:sz w:val="20"/>
                 <w:szCs w:val="20"/>
               </w:rPr>
-              <w:t xml:space="preserve">A workbook fed by an export is staler than the warehouse, never fresher; a number needed early on Monday is a scheduling question for the warehouse query.</w:t>
+              <w:t xml:space="preserve">Stretches the rule past its purpose: it governs the numbers Finance receives, and a suite that holds every exploratory chart stops being a list an analyst can audit.</w:t>
             </w:r>
           </w:p>
           <w:p>
@@ -13982,7 +13901,7 @@
                 <w:sz w:val="20"/>
                 <w:szCs w:val="20"/>
               </w:rPr>
-              <w:t xml:space="preserve">Line-by-line audit is the reason the number lives in the warehouse: a query can be read step by step, and a typed-over cell leaves no trail.</w:t>
+              <w:t xml:space="preserve">An export is stale the day it lands and a workbook can be typed over, which is what Anand's rule rules out; Excel is where a finished number meets the room.</w:t>
             </w:r>
           </w:p>
           <w:p>
@@ -14009,7 +13928,7 @@
                 <w:sz w:val="20"/>
                 <w:szCs w:val="20"/>
               </w:rPr>
-              <w:t xml:space="preserve">Convenience is no reason to move a number Finance reports; a pivot on an export is one more copy that can drift from the source.</w:t>
+              <w:t xml:space="preserve">Exploration is how a definition gets agreed; refusing to look leaves Finance to define the number blind.</w:t>
             </w:r>
           </w:p>
           <w:p>
@@ -14035,7 +13954,7 @@
                 <w:sz w:val="21"/>
                 <w:szCs w:val="21"/>
               </w:rPr>
-              <w:t xml:space="preserve">A number Finance audits lives in the warehouse because it reruns unchanged on the source and every step can be read; Excel is for presenting it and for what-ifs the room explores, never for computing the number of record.</w:t>
+              <w:t xml:space="preserve">The reported number lives in the warehouse because it reruns unchanged on the source and every line can be audited; exploration lives in a notebook that reads the warehouse, and Excel presents what has been decided.</w:t>
             </w:r>
           </w:p>
           <w:p>
@@ -14157,7 +14076,7 @@
                 <w:sz w:val="21"/>
                 <w:szCs w:val="21"/>
               </w:rPr>
-              <w:t xml:space="preserve">The CASE has no ELSE, so it returns NULL for the two short views, and count skips NULLs: the reported figure divides all 30 seconds by 3 views, 10.0, where the average per view is 30 over 5, 6.0. Measured against the true figure, 10.0 overstates 6.0 by 4.0 over 6.0, about 67 percent. TechCrunch (22 September 2016), citing The Wall Street Journal, put Facebook's overstatement at 60 to 80 percent over two years and reported that billing was not affected; checked on 30 September 2026. Run on PostgreSQL 16.13 on 30 September 2026.</w:t>
+              <w:t xml:space="preserve">The CASE has no ELSE, so it returns NULL for the two viewers under three seconds, and count skips NULLs: the calculated average divides all 30 seconds by 3 people, 10.0, where the defined one divides by all 5 who played, 6.0. Against the defined figure, 10.0 overstates 6.0 by 4.0 over 6.0, about 67 percent. TechCrunch (Devin Coldewey, 22 September 2016) quoted Facebook's definition and its calculation, put the inflation at 60 to 80 percent over two years and reported that billing was not affected; checked on 30 September 2026. Run on PostgreSQL 16.13 on 30 September 2026.</w:t>
             </w:r>
           </w:p>
           <w:p>
@@ -14184,7 +14103,7 @@
                 <w:sz w:val="20"/>
                 <w:szCs w:val="20"/>
               </w:rPr>
-              <w:t xml:space="preserve">Divides the gap by the wrong base: 4.0 over the reported 10.0 is 40 percent, and an overstatement is measured against the true figure, 6.0.</w:t>
+              <w:t xml:space="preserve">Divides the gap by the wrong base: 4.0 over the calculated 10.0 is 40 percent, and an overstatement is measured against the true figure, the defined 6.0.</w:t>
             </w:r>
           </w:p>
           <w:p>
@@ -14211,7 +14130,7 @@
                 <w:sz w:val="20"/>
                 <w:szCs w:val="20"/>
               </w:rPr>
-              <w:t xml:space="preserve">Averages the three long views alone, (14 + 9 + 4) / 3 = 9.0; the metric's numerator was all the time watched, and the short views' 3 seconds stay in it.</w:t>
+              <w:t xml:space="preserve">Averages the three long viewers alone, (14 + 9 + 4) / 3 = 9.0; the numerator stayed all the time watched, the short viewers' 3 seconds included.</w:t>
             </w:r>
           </w:p>
           <w:p>
@@ -14238,7 +14157,7 @@
                 <w:sz w:val="20"/>
                 <w:szCs w:val="20"/>
               </w:rPr>
-              <w:t xml:space="preserve">count(CASE WHEN ... THEN 1 END) counts only the non-NULL results, and a CASE with no ELSE returns NULL for the views it does not match; Monday's round 3 trap in another form.</w:t>
+              <w:t xml:space="preserve">count(CASE WHEN ... THEN 1 END) counts only the non-NULL results, and a CASE with no ELSE returns NULL for the viewers it does not match; Monday's round 3 trap in another form.</w:t>
             </w:r>
           </w:p>
           <w:p>
@@ -14580,7 +14499,7 @@
                 <w:sz w:val="21"/>
                 <w:szCs w:val="21"/>
               </w:rPr>
-              <w:t xml:space="preserve">   Key C, E, A, D, B</w:t>
+              <w:t xml:space="preserve">   Key E, F, B, C, A</w:t>
             </w:r>
             <w:r>
               <w:rPr>
@@ -14615,7 +14534,7 @@
                 <w:sz w:val="21"/>
                 <w:szCs w:val="21"/>
               </w:rPr>
-              <w:t xml:space="preserve">The repeats go first, because a sum taken before them keeps the Rs 20,750 the gateway posted twice; the payments go to one row per order before the join, because a join onto payment rows repeats every instalment order; the LEFT JOIN keeps all 462 orders; the checks come before anything is sent, and on Kalpa's Q2 book they read 462 rows out and a gap of Rs 17,54,930, the booked value of the 30 unpaid orders exactly. On the same book, HAVING count(*) &gt; 1 by order lists 216 orders, of which 188 are two instalments; grouping by order and instalment leaves the 28 repeats. The common wrong order sums first (e before c), which keeps the repeats in collected, or sends before checking. Run on PostgreSQL 16.13 on the week's warehouse on 30 September 2026.</w:t>
+              <w:t xml:space="preserve">The step to leave out is d: 188 of the orders with two payment rows are instalments 1 and 2 of one invoice, and dropping them throws away real cash along with the 28 repeats. On the same book, HAVING count(*) &gt; 1 by order lists 216 orders, and by order and instalment it lists the 28 repeats. The repeats go first (e), because a sum taken before them keeps the Rs 20,750 the gateway posted twice. The payment rows go to one figure per order (f) before the join (b), because only then does the join return one row per order: joined first, the rows come out at 650, the 462 orders plus 188 second instalments, and booked counts twice for every instalment order. The checks (c) come before anything is sent (a), and on Kalpa's book they read 462 rows and a gap of Rs 17,54,930, the unpaid orders' booked value exactly. Run on PostgreSQL 16.13 on the week's warehouse on 30 September 2026.</w:t>
             </w:r>
           </w:p>
           <w:p>
@@ -14992,7 +14911,7 @@
                 <w:sz w:val="21"/>
                 <w:szCs w:val="21"/>
               </w:rPr>
-              <w:t xml:space="preserve">Booked passed both of its checks, so it can leave. Collected rests on the check that failed, so it waits, and naming the Rs 21,750 as an open line with an owner and a time is what Anand can act on. The Tuesday pack gives this answer to its question on the end of reporting day: ship booked with the open line named, and hold collected.</w:t>
+              <w:t xml:space="preserve">The gaps are app Rs 8,120 and store Rs 9,57,810, each equal to its unpaid list to the rupee, and web Rs 8,10,750, which exceeds its list's Rs 7,89,000 by Rs 21,750 that nobody has explained. Booked passed its checks, so it goes for every channel; app's and store's collected reconcile, so they go; web's collected waits, with the Rs 21,750 named as an open line with an owner and a time. The Tuesday pack's rule is to send what reconciles with its definition and name the line that does not close. The figures are illustrative: on Kalpa's own book, web's gap equals its unpaid list at Rs 7,89,000.</w:t>
             </w:r>
           </w:p>
           <w:p>
@@ -15019,7 +14938,7 @@
                 <w:sz w:val="20"/>
                 <w:szCs w:val="20"/>
               </w:rPr>
-              <w:t xml:space="preserve">Forcing the bridge to close hides the one fact the check found; the reconciliation would then explain a sum that no order carries.</w:t>
+              <w:t xml:space="preserve">Adding the unexplained Rs 21,750 to web's unpaid list forces the bridge closed and puts on the list an amount that no unpaid order carries.</w:t>
             </w:r>
           </w:p>
           <w:p>
@@ -15046,7 +14965,7 @@
                 <w:sz w:val="20"/>
                 <w:szCs w:val="20"/>
               </w:rPr>
-              <w:t xml:space="preserve">Sends the one figure the failed check leaves unproven, and a footnote does not travel with a number once it is quoted.</w:t>
+              <w:t xml:space="preserve">Store has the largest gap, and its gap equals its unpaid list to the rupee; the channel whose bridge fails is web, by Rs 21,750.</w:t>
             </w:r>
           </w:p>
           <w:p>
@@ -15073,7 +14992,7 @@
                 <w:sz w:val="20"/>
                 <w:szCs w:val="20"/>
               </w:rPr>
-              <w:t xml:space="preserve">Holds back a figure that passed its checks; Anand loses the booked number over a doubt that concerns collected alone.</w:t>
+              <w:t xml:space="preserve">Holds back two collected figures that reconcile to the rupee; Anand loses app's and store's collected over a doubt that concerns web alone.</w:t>
             </w:r>
           </w:p>
           <w:p>
@@ -15099,7 +15018,7 @@
                 <w:sz w:val="21"/>
                 <w:szCs w:val="21"/>
               </w:rPr>
-              <w:t xml:space="preserve">Before a joined number reaches Finance I check rows in against rows out, the total against its source and the gap against a named list; when one fails at the end of reporting day, the figures that passed go out, the one that failed waits, and the open line is named with an owner and a time.</w:t>
+              <w:t xml:space="preserve">Before a joined number reaches Finance I check rows in against rows out, the total against its source and the gap against a named list; when one fails at the end of the reporting day, what reconciles goes out, what does not waits, and the open line is named with its amount, an owner and a time.</w:t>
             </w:r>
           </w:p>
           <w:p>
@@ -15221,7 +15140,7 @@
                 <w:sz w:val="21"/>
                 <w:szCs w:val="21"/>
               </w:rPr>
-              <w:t xml:space="preserve">Both correct checks compare what arrived with what was loaded, so a truncation shows the day it happens: a per-file count of records against rows loaded, and a control total from the source against the loaded total. That is Tuesday's habit, rows in against rows out, and Week 1's revenue bridge, input equals clean plus rejected. The facts are from the GOV.UK statement of 4 October 2020 (15,841 cases between 25 September and 2 October; files that exceeded the maximum size) and The Register of 5 October 2020 (lab files in CSV converted to the .xls format, 65,536 rows a sheet, records past the cut-off left off), both checked on 30 September 2026.</w:t>
+              <w:t xml:space="preserve">Lab B's file lost 5,365 records in the conversion, 70,900 in the CSV against 65,535 rows in the sheet. Comparing rows loaded with the lab's own count of records sees the loss, and a sheet at exactly 65,535 data rows sits at the format's limit, which a check can treat as a stop. Rows loaded and rows in the sheet were both counted after the cut, so they agree, and Lab B loaded more rows than the day before, 65,535 against 61,020, so neither of those checks fires. That is Tuesday's habit, rows in against rows out, taken back to the first count in the chain. The facts are from the GOV.UK statement of 4 October 2020 (15,841 cases between 25 September and 2 October; files that exceeded the maximum file size) and The Register of 5 October 2020 (lab CSV files stored in the older .xls format, 65,536 rows a sheet, records past the limit left off and not counted), both checked on 30 September 2026; the three labs' counts are illustrative.</w:t>
             </w:r>
           </w:p>
           <w:p>
@@ -15248,7 +15167,7 @@
                 <w:sz w:val="20"/>
                 <w:szCs w:val="20"/>
               </w:rPr>
-              <w:t xml:space="preserve">Raises the ceiling from 65,536 rows to about a million and checks nothing: a file past the new limit would be cut just as quietly. It removes this cause, and leaves the kind of failure.</w:t>
+              <w:t xml:space="preserve">Rows loaded and data rows in the sheet were both counted after the conversion cut the file, so they agree at 65,535 and the check passes.</w:t>
             </w:r>
           </w:p>
           <w:p>
@@ -15302,7 +15221,7 @@
                 <w:sz w:val="20"/>
                 <w:szCs w:val="20"/>
               </w:rPr>
-              <w:t xml:space="preserve">A pivot sums what was loaded, so it cannot see what never arrived: the missing cases are missing from the pivot too.</w:t>
+              <w:t xml:space="preserve">Lab B loaded 65,535 rows against 61,020 the day before, so a check for a fall stays quiet while 5,365 records go missing; a day-on-day check sees only a loss larger than the day's growth.</w:t>
             </w:r>
           </w:p>
           <w:p>
@@ -15328,7 +15247,7 @@
                 <w:sz w:val="21"/>
                 <w:szCs w:val="21"/>
               </w:rPr>
-              <w:t xml:space="preserve">Any step that can drop rows without a warning needs a count on both sides of it, and the load stops when they differ; raising a limit only moves the cliff.</w:t>
+              <w:t xml:space="preserve">Any step that can drop rows without a warning needs a count on both sides of it, taken back to the first count in the chain, and the load stops when they differ; raising a limit only moves the cliff.</w:t>
             </w:r>
           </w:p>
           <w:p>
@@ -15644,7 +15563,7 @@
                 <w:sz w:val="21"/>
                 <w:szCs w:val="21"/>
               </w:rPr>
-              <w:t xml:space="preserve">   Key D</w:t>
+              <w:t xml:space="preserve">   Key C</w:t>
             </w:r>
             <w:r>
               <w:rPr>
@@ -15653,7 +15572,7 @@
                 <w:sz w:val="18"/>
                 <w:szCs w:val="18"/>
               </w:rPr>
-              <w:t xml:space="preserve">   Scenario set, Hard, [D], Wed</w:t>
+              <w:t xml:space="preserve">   Scenario set, Medium, [D], Wed</w:t>
             </w:r>
           </w:p>
           <w:p>
@@ -15679,7 +15598,7 @@
                 <w:sz w:val="21"/>
                 <w:szCs w:val="21"/>
               </w:rPr>
-              <w:t xml:space="preserve">He asked for tied members to share a rank and for the count to include a tie at the line. RANK does both: 51 members, and the note says why the list is one over fifty. DENSE_RANK also ranks ties the same but ships 52, because an earlier tie compressed its numbers, so the list gains C-0259 on Rs 3,200, a member below both tied members.</w:t>
+              <w:t xml:space="preserve">The rule has two parts: members who spent the same share a rank, and the list keeps every member who spent at least as much as the fiftieth and nobody who spent less. RANK does both: C-0185 and C-0242 share rank 50 on Rs 3,350 and C-0259, on Rs 3,200, falls to 52. DENSE_RANK shares ranks too, and because it never skips, the earlier tie at 48 lifts C-0259 to dense rank 50. The note to Marketing gives the list's length and the tie that sets it.</w:t>
             </w:r>
           </w:p>
           <w:p>
@@ -15706,7 +15625,7 @@
                 <w:sz w:val="20"/>
                 <w:szCs w:val="20"/>
               </w:rPr>
-              <w:t xml:space="preserve">Meets the first half of the ask and breaks the second: its 52 includes C-0259, who spent less than both members tied at the line, so the length no longer means the top fifty with ties.</w:t>
+              <w:t xml:space="preserve">Shares ranks, and then keeps C-0259, who spent Rs 3,200, less than both members at the fiftieth place; that is Wednesday's trap, where "ties rank the same" quietly shipped a member below the line.</w:t>
             </w:r>
           </w:p>
           <w:p>
@@ -15733,7 +15652,7 @@
                 <w:sz w:val="20"/>
                 <w:szCs w:val="20"/>
               </w:rPr>
-              <w:t xml:space="preserve">Exactly fifty and the same every Monday, at the cost of dropping a member who spent exactly what the fiftieth did, by an id nobody chose on purpose; if the budget demands exactly fifty, the tiebreaker becomes a decision the head of Retail-Plus owns.</w:t>
+              <w:t xml:space="preserve">Keeps exactly fifty, the same every Monday, by dropping C-0242, who spent exactly what the fiftieth did, on an id nobody chose on purpose; if the budget demands fifty, the tiebreaker is a decision the head of Retail-Plus owns.</w:t>
             </w:r>
           </w:p>
           <w:p>
@@ -15751,7 +15670,7 @@
                 <w:sz w:val="20"/>
                 <w:szCs w:val="20"/>
               </w:rPr>
-              <w:t xml:space="preserve">C.  </w:t>
+              <w:t xml:space="preserve">D.  </w:t>
             </w:r>
             <w:r>
               <w:rPr>
@@ -15760,7 +15679,7 @@
                 <w:sz w:val="20"/>
                 <w:szCs w:val="20"/>
               </w:rPr>
-              <w:t xml:space="preserve">The "forty-nine because of a tie" he ruled out, in his own words.</w:t>
+              <w:t xml:space="preserve">Gives members who spent the same different numbers and lets the database choose which of C-0185 and C-0242 stays, so the list can change between two runs.</w:t>
             </w:r>
           </w:p>
           <w:p>
@@ -15786,7 +15705,7 @@
                 <w:sz w:val="21"/>
                 <w:szCs w:val="21"/>
               </w:rPr>
-              <w:t xml:space="preserve">When the business says ties rank the same, I use RANK and state the count and its reason in the same line, because the list can ship more than N; if the budget demands exactly N, the tiebreaker becomes a decision someone owns.</w:t>
+              <w:t xml:space="preserve">When the business says ties rank the same, I use RANK and state the list's length and its reason in the same line, because the list can ship more than N; if the budget demands exactly N, the tiebreaker becomes a decision someone owns.</w:t>
             </w:r>
           </w:p>
           <w:p>
@@ -15908,7 +15827,7 @@
                 <w:sz w:val="21"/>
                 <w:szCs w:val="21"/>
               </w:rPr>
-              <w:t xml:space="preserve">A rank computed within PARTITION BY segment keeps every member and restarts for each segment; the outer query keeps the rows ranked three or better. The window has to be filtered outside, because WHERE runs before any window is computed. The whole-table list in the stem is Wednesday's round 1 trap: 35 Business members, 11 Retail-Plus, 4 Retail-Core and no Student.</w:t>
+              <w:t xml:space="preserve">A rank computed within PARTITION BY segment keeps every customer and restarts for each segment; the outer query keeps the rows ranked three or better. The window has to be filtered outside, because WHERE runs before any window is computed. The whole-table list in the stem is Wednesday's round 1 trap: 35 Business customers, 11 Retail-Plus members, 4 Retail-Core customers and no Student, since Business carries 99 percent of the quarter's revenue.</w:t>
             </w:r>
           </w:p>
           <w:p>
@@ -15935,7 +15854,7 @@
                 <w:sz w:val="20"/>
                 <w:szCs w:val="20"/>
               </w:rPr>
-              <w:t xml:space="preserve">GROUP BY collapses each segment to one row, so the members are gone before LIMIT runs, and LIMIT applies once to the whole result, never per group.</w:t>
+              <w:t xml:space="preserve">GROUP BY collapses each segment to one row, so the customers are gone before LIMIT runs, and LIMIT applies once to the whole result, never per group.</w:t>
             </w:r>
           </w:p>
           <w:p>
@@ -16137,7 +16056,7 @@
                 <w:sz w:val="21"/>
                 <w:szCs w:val="21"/>
               </w:rPr>
-              <w:t xml:space="preserve">LAG reads the previous row in the partition, never the previous calendar month. C-0185's September is compared with July (1,450 below 1,900) and July with June (1,900 below 2,690), and C-0216's September with July and July with May (2,540 below 4,300, below 6,440), so both are flagged although neither ordered in August: a gap has been read as a fall. A calendar check, that the two rows LAG reads are August and July, keeps C-0161 and C-0171, the two genuine falls. C-0185 is one of the pair tied at fiftieth in Set 5. Run on PostgreSQL 16.13 on the week's warehouse on 30 September 2026.</w:t>
+              <w:t xml:space="preserve">LAG reads the previous row in the partition, never the previous calendar month. C-0161 and C-0171 fell from July to August and again from August to September, so both are flagged, and rightly. C-0185's September is compared with July (1,450 below 1,900) and July with June (1,900 below 2,690), and C-0216's September with July and July with May (2,540 below 4,300, below 6,440), so both are flagged too, although neither ordered in August: two calls tell a member their spend fell in August and September when there was no August reading at all. A calendar check, that the two rows LAG reads are August and July, keeps the two genuine falls. Run on PostgreSQL 16.13 on the week's warehouse on 30 September 2026.</w:t>
             </w:r>
           </w:p>
           <w:p>
@@ -16164,7 +16083,7 @@
                 <w:sz w:val="20"/>
                 <w:szCs w:val="20"/>
               </w:rPr>
-              <w:t xml:space="preserve">LAG knows nothing of the calendar; it returns whatever row came before in the window's order, which is why the two members with a missing August pass.</w:t>
+              <w:t xml:space="preserve">Assumes LAG steps back one calendar month, so C-0185 and C-0216 would meet an empty August and drop out; LAG returns whatever row came before in the window's order, and both are flagged.</w:t>
             </w:r>
           </w:p>
           <w:p>
@@ -16191,7 +16110,7 @@
                 <w:sz w:val="20"/>
                 <w:szCs w:val="20"/>
               </w:rPr>
-              <w:t xml:space="preserve">Reads the query's output as the business answer; a member with no August order has no August reading, and this is the member who says he was on holiday.</w:t>
+              <w:t xml:space="preserve">Assumes LAG(spend, 2) returns NULL for C-0216; it has rows for May, July and September, so on its September row LAG(spend, 2) returns May's 6,440. LAG returns NULL only on a member's first rows, and a comparison with that NULL flags nobody.</w:t>
             </w:r>
           </w:p>
           <w:p>
@@ -16218,7 +16137,7 @@
                 <w:sz w:val="20"/>
                 <w:szCs w:val="20"/>
               </w:rPr>
-              <w:t xml:space="preserve">C-0216 has three rows (May, July, September), so LAG(spend, 2) on its September row returns May's 6,440. LAG returns NULL only when the partition has no row that far back, as on a member's first two rows, and a comparison with that NULL flags nobody.</w:t>
+              <w:t xml:space="preserve">Reads the query's output as the business answer; a member with no August order has no August reading, and C-0216 is the member in Wednesday's case who said he was on holiday.</w:t>
             </w:r>
           </w:p>
           <w:p>
@@ -16366,7 +16285,7 @@
                 <w:sz w:val="21"/>
                 <w:szCs w:val="21"/>
               </w:rPr>
-              <w:t xml:space="preserve">Both readings are true and the line needs both: the total closed on plan, Rs 10 ahead, and six of the seven full weeks from 10 August sit below the weekly Rs 75.69 lakh (only the week of 14 September, Rs 93.0 lakh, cleared it). A front-page line carries its period and its comparison, so a director does not read one July week as the trend. The weekly figures are the week's own running total against plan_line, recomputed on PostgreSQL 16.13 on 30 September 2026.</w:t>
+              <w:t xml:space="preserve">Booked less plan at the seven points reads -0.25, +1.95, +2.17, +1.57, +0.73, +0.79 and 0.00 crore: behind after the first week, well ahead once the week of 13 July booked Rs 2.66 crore, furthest ahead at the start of August, and level at the close, Rs 9,84,00,000 against a plan of Rs 9,83,99,990. The weekly rate did the giving back: six of the seven full weeks from 10 August booked below the plan's Rs 75.69 lakh a week. A front-page line carries its period and its comparison, so a director reads the close and the trend together. The figures are the week's own running total against plan_line, recomputed on PostgreSQL 16.13 on 30 September 2026.</w:t>
             </w:r>
           </w:p>
           <w:p>
@@ -16393,7 +16312,7 @@
                 <w:sz w:val="20"/>
                 <w:szCs w:val="20"/>
               </w:rPr>
-              <w:t xml:space="preserve">A total that lands on plan says nothing about the weekly rate; the chart shows the rate below plan in six weeks of seven.</w:t>
+              <w:t xml:space="preserve">The lead peaked at Rs 2.17 crore at the start of August and was gone by the close, where booked and plan both read Rs 9.84 crore.</w:t>
             </w:r>
           </w:p>
           <w:p>
@@ -16420,7 +16339,7 @@
                 <w:sz w:val="20"/>
                 <w:szCs w:val="20"/>
               </w:rPr>
-              <w:t xml:space="preserve">Reads the weekly shortfall as the quarter's result; the quarter closed Rs 10 above plan because of the week in July.</w:t>
+              <w:t xml:space="preserve">Booked stayed above plan at every point after the first week; the quarter gave back its lead and never fell behind.</w:t>
             </w:r>
           </w:p>
           <w:p>
@@ -16447,7 +16366,7 @@
                 <w:sz w:val="20"/>
                 <w:szCs w:val="20"/>
               </w:rPr>
-              <w:t xml:space="preserve">Quotes a mid-quarter running figure as the close; the lead had shrunk to Rs 10 by the end of the quarter.</w:t>
+              <w:t xml:space="preserve">At its widest the lead was Rs 2.17 crore, more than a fifth of the quarter's plan, which is a lead worth a line.</w:t>
             </w:r>
           </w:p>
           <w:p>
@@ -16473,7 +16392,7 @@
                 <w:sz w:val="21"/>
                 <w:szCs w:val="21"/>
               </w:rPr>
-              <w:t xml:space="preserve">One number goes out with its period, its base and its comparison, here the quarter against plan and the weekly rate against the weekly plan, so it is read the way it was meant.</w:t>
+              <w:t xml:space="preserve">One number goes out with its period, its base and its comparison, here the quarter's close against plan and the trend that brought it there, so it is read the way it was meant.</w:t>
             </w:r>
           </w:p>
           <w:p>
@@ -17166,7 +17085,7 @@
                 <w:sz w:val="21"/>
                 <w:szCs w:val="21"/>
               </w:rPr>
-              <w:t xml:space="preserve">   Key C</w:t>
+              <w:t xml:space="preserve">   Key D</w:t>
             </w:r>
             <w:r>
               <w:rPr>
@@ -17201,7 +17120,7 @@
                 <w:sz w:val="21"/>
                 <w:szCs w:val="21"/>
               </w:rPr>
-              <w:t xml:space="preserve">A customer the sale reached twice was still reached once, so the business rule is one exposure per customer, the first by date. Applied to the feed, it leaves 340 rows, spend on the book and 130 reached customers, and validate stays on so that a new kind of repeat stops the refresh instead of changing the number. Run on pandas 3.0.5 on 30 September 2026.</w:t>
+              <w:t xml:space="preserve">The two sends differ in exposed_date, so they do not repeat in every column, and the file is newest first, so each repeated customer's first row as listed is the 11 August send. Sorting by exposed_date from the earliest and then keeping each customer's first row leaves 3 August for C-0001 and C-0002 and C-0012's one row: 130 rows, one per customer, and the merge returns 340 rows with spend on the book. Run on pandas 3.0.5 on the week's feed, sent newest first, on 30 September 2026.</w:t>
             </w:r>
           </w:p>
           <w:p>
@@ -17228,7 +17147,7 @@
                 <w:sz w:val="20"/>
                 <w:szCs w:val="20"/>
               </w:rPr>
-              <w:t xml:space="preserve">Typing over the total hides the error, leaves every per-customer figure wrong, and the next refresh brings it back.</w:t>
+              <w:t xml:space="preserve">The two sends differ in exposed_date, 3 and 11 August, so no row repeats in every column and all 136 stay.</w:t>
             </w:r>
           </w:p>
           <w:p>
@@ -17255,7 +17174,7 @@
                 <w:sz w:val="20"/>
                 <w:szCs w:val="20"/>
               </w:rPr>
-              <w:t xml:space="preserve">The repeated rows differ in exposed_date, so drop_duplicates() on every column removes nothing.</w:t>
+              <w:t xml:space="preserve">The file is newest first, so each repeated customer's first row as listed is the 11 August send, the second exposure.</w:t>
             </w:r>
           </w:p>
           <w:p>
@@ -17273,7 +17192,7 @@
                 <w:sz w:val="20"/>
                 <w:szCs w:val="20"/>
               </w:rPr>
-              <w:t xml:space="preserve">D.  </w:t>
+              <w:t xml:space="preserve">C.  </w:t>
             </w:r>
             <w:r>
               <w:rPr>
@@ -17282,7 +17201,7 @@
                 <w:sz w:val="20"/>
                 <w:szCs w:val="20"/>
               </w:rPr>
-              <w:t xml:space="preserve">Spend per reached customer is a doubled numerator over a count of rows or of customers; either way the repeated rows move it.</w:t>
+              <w:t xml:space="preserve">The merge keeps each customer's feed rows in the file's order, so keeping the first merged row keeps 11 August; the table has one row per customer and the wrong exposure on two of them.</w:t>
             </w:r>
           </w:p>
           <w:p>
@@ -17308,7 +17227,7 @@
                 <w:sz w:val="21"/>
                 <w:szCs w:val="21"/>
               </w:rPr>
-              <w:t xml:space="preserve">Fix the error where it was made, at the feed, with a rule the business agrees, and keep the guard on so next week's feed fails loudly instead of quietly.</w:t>
+              <w:t xml:space="preserve">Fix the error where it was made, at the feed, with a rule the business agrees and a sort that makes first mean first by date, and keep the guard on so next week's feed fails loudly instead of quietly.</w:t>
             </w:r>
           </w:p>
           <w:p>
@@ -17659,7 +17578,7 @@
                 <w:sz w:val="21"/>
                 <w:szCs w:val="21"/>
               </w:rPr>
-              <w:t xml:space="preserve">A left merge keeps all 4 of the lab's rows; '2-Sep' and '1-Mar' match no symbol, so indicator marks them left_only and only 2 rows are both. Nothing raises: two genes lose their annotation without a word. The fix belongs at the source, a list kept as text, and the naming body has since moved the other way too: in 2020 the HGNC renamed every symbol Excel turned into a date, so SEPT1 is now SEPTIN1 and MARCH1 is now MARCHF1 (Bruford and colleagues, Nature Genetics, 2020). Both papers checked on 30 September 2026; the code run on pandas 3.0.5 the same day.</w:t>
+              <w:t xml:space="preserve">A left merge keeps all 4 of the lab's rows; '2-Sep' and '1-Mar' match no symbol, so indicator marks them left_only: 2. Nothing raises, and two genes lose their annotation without a word. The fix belongs at the source, a list the lab keeps as text, and the naming body later fixed the source every reader shares: in 2020 the HGNC renamed the genes whose symbols Excel turned into dates, so SEPT1 became SEPTIN1 and MARCH1 became MARCHF1 (Bruford and colleagues, Nature Genetics, 2020). Both papers checked on 30 September 2026; the code run on pandas 3.0.5 the same day.</w:t>
             </w:r>
           </w:p>
           <w:p>
@@ -17686,7 +17605,7 @@
                 <w:sz w:val="20"/>
                 <w:szCs w:val="20"/>
               </w:rPr>
-              <w:t xml:space="preserve">pandas reads the text it is given; '2-Sep' stays the string '2-Sep', and no parser turns it back into a gene symbol.</w:t>
+              <w:t xml:space="preserve">pandas reads the text it is given; '2-Sep' stays the string '2-Sep', and no parser turns it back into a gene symbol, so the analysis would go ahead on two unannotated genes.</w:t>
             </w:r>
           </w:p>
           <w:p>
@@ -17713,7 +17632,7 @@
                 <w:sz w:val="20"/>
                 <w:szCs w:val="20"/>
               </w:rPr>
-              <w:t xml:space="preserve">A left merge never adds reference rows that nothing matched; how='right' or how='outer' would.</w:t>
+              <w:t xml:space="preserve">A left merge never adds reference rows that nothing matched; how='right' or how='outer' would, and such a row would be marked right_only, never left_only.</w:t>
             </w:r>
           </w:p>
           <w:p>
@@ -17740,7 +17659,7 @@
                 <w:sz w:val="20"/>
                 <w:szCs w:val="20"/>
               </w:rPr>
-              <w:t xml:space="preserve">A left merge keeps every left row, matched or not; how='inner' would keep 2.</w:t>
+              <w:t xml:space="preserve">A left merge keeps every left row, matched or not; how='inner' would keep 2, and the two genes it dropped would still need the lab, not an analyst's guess.</w:t>
             </w:r>
           </w:p>
           <w:p>
@@ -17853,7 +17772,7 @@
                 <w:sz w:val="21"/>
                 <w:szCs w:val="21"/>
               </w:rPr>
-              <w:t xml:space="preserve">   Key D (XLOOKUP with a message for a missing id)</w:t>
+              <w:t xml:space="preserve">   Key D (XLOOKUP with its if_not_found argument set)</w:t>
             </w:r>
             <w:r>
               <w:rPr>
@@ -17888,7 +17807,7 @@
                 <w:sz w:val="21"/>
                 <w:szCs w:val="21"/>
               </w:rPr>
-              <w:t xml:space="preserve">XLOOKUP matches exactly by default, and its fourth argument, if_not_found, is what it shows for a missing id (Microsoft Support, XLOOKUP function, verified 29 September 2026). The spare beside it, VLOOKUP with its fourth argument left out, looks for an approximate match: on Friday it returned C-0194's Rs 16,740 for C-0195, a member with no orders.</w:t>
+              <w:t xml:space="preserve">XLOOKUP matches exactly by default, and its fourth argument, if_not_found, is what it shows for a code that is not in the list (Microsoft Support, XLOOKUP function, verified 29 September 2026). The spare beside it, VLOOKUP with its fourth argument left out, looks for an approximate match: on Friday it returned C-0194's Rs 16,740 for C-0195, a member with no orders.</w:t>
             </w:r>
           </w:p>
           <w:p>
@@ -17914,7 +17833,7 @@
                 <w:sz w:val="21"/>
                 <w:szCs w:val="21"/>
               </w:rPr>
-              <w:t xml:space="preserve">A lookup has two exits, the row or a visible "not in the table", and I test it with an id I know is missing.</w:t>
+              <w:t xml:space="preserve">A lookup has two exits, the row or a visible "not in the table", and I test it with a code I know is missing.</w:t>
             </w:r>
           </w:p>
           <w:p>
@@ -18001,7 +17920,7 @@
                 <w:sz w:val="21"/>
                 <w:szCs w:val="21"/>
               </w:rPr>
-              <w:t xml:space="preserve">   Key A (SUBTOTAL(109, ...) at the foot of the list)</w:t>
+              <w:t xml:space="preserve">   Key A (SUBTOTAL with function number 109)</w:t>
             </w:r>
             <w:r>
               <w:rPr>
@@ -18036,7 +17955,7 @@
                 <w:sz w:val="21"/>
                 <w:szCs w:val="21"/>
               </w:rPr>
-              <w:t xml:space="preserve">SUBTOTAL(109, ...) adds only the rows on screen, while SUM adds the rows a filter hides: on Friday, filtered to Mumbai's 11 members, SUBTOTAL read Rs 1,56,790 and SUM still read the whole list's Rs 7,14,890, a budget 4.6 times too big.</w:t>
+              <w:t xml:space="preserve">SUBTOTAL with function number 109 adds only the rows on screen, while SUM adds the rows a filter hides: on Friday, filtered to Mumbai's 11 members, SUBTOTAL(109, ...) read Rs 1,56,790 and SUM still read the whole list's Rs 7,14,890, a budget 4.6 times too big.</w:t>
             </w:r>
           </w:p>
           <w:p>
@@ -18149,7 +18068,7 @@
                 <w:sz w:val="21"/>
                 <w:szCs w:val="21"/>
               </w:rPr>
-              <w:t xml:space="preserve">   Key F (a first-row flag per order, summed with SUMIFS)</w:t>
+              <w:t xml:space="preserve">   Key F (a first-row flag per order, then SUMIFS)</w:t>
             </w:r>
             <w:r>
               <w:rPr>
@@ -18184,7 +18103,7 @@
                 <w:sz w:val="21"/>
                 <w:szCs w:val="21"/>
               </w:rPr>
-              <w:t xml:space="preserve">Flagging the first row of each order, with =IF(COUNTIF($A$2:A2,A2)=1,1,0) filled down, and summing only the flagged rows with SUMIFS counts each order once: on Friday that took the raw export's Rs 39.41 crore back to the warehouse's Rs 19.84 crore. The spare beside it, Remove Duplicates, removes only identical rows, and an instalment order's two rows differ in the amount paid, so 1,400 rows stayed and the total still doubled.</w:t>
+              <w:t xml:space="preserve">Friday's export repeats each order's booked amount on every payment row, so an order paid in two instalments carries its order_amount twice. Flagging the first row of each order, with =IF(COUNTIF($A$2:A2,A2)=1,1,0) filled down, and summing order_amount over the flagged rows with SUMIFS counts each order once: on Friday that took the raw export's Rs 39.41 crore back to the warehouse's Rs 19.84 crore. The spare beside it, Remove Duplicates across every column, removes only identical rows, and an instalment order's two rows differ in paid_amount, so 1,400 rows stayed and the total still doubled.</w:t>
             </w:r>
           </w:p>
           <w:p>
@@ -18297,7 +18216,7 @@
                 <w:sz w:val="21"/>
                 <w:szCs w:val="21"/>
               </w:rPr>
-              <w:t xml:space="preserve">   Key C (a labelled input cell beside the actual figure)</w:t>
+              <w:t xml:space="preserve">   Key C (a labelled input cell feeding a scenario line)</w:t>
             </w:r>
             <w:r>
               <w:rPr>
@@ -18332,7 +18251,7 @@
                 <w:sz w:val="21"/>
                 <w:szCs w:val="21"/>
               </w:rPr>
-              <w:t xml:space="preserve">An assumption is an input: a labelled cell beside the actual, feeding a scenario line, so the sheet recalculates in the room and the source stays tied to the warehouse. On Friday, the same Rs 5,00,000 typed over the Q2 cell read "down 14.6 percent" against Finance's 29.4, until Monday's refresh wiped it without a trace.</w:t>
+              <w:t xml:space="preserve">An assumption is an input: a labelled cell beside the actual, feeding a scenario line, so the sheet recalculates in the room and the source stays tied to the warehouse. On Friday, the same Rs 5,00,000 typed over the quarter's cell read "down 14.6 percent" against Finance's 29.4, until Monday's refresh wiped it without a trace.</w:t>
             </w:r>
           </w:p>
           <w:p>
@@ -18445,7 +18364,7 @@
                 <w:sz w:val="21"/>
                 <w:szCs w:val="21"/>
               </w:rPr>
-              <w:t xml:space="preserve">   Key D</w:t>
+              <w:t xml:space="preserve">   Key B8 returns -0.5; the six rows average 1.0; the formula understates growth by 1.5 points and turns growth into a fall.</w:t>
             </w:r>
             <w:r>
               <w:rPr>
@@ -18454,7 +18373,7 @@
                 <w:sz w:val="18"/>
                 <w:szCs w:val="18"/>
               </w:rPr>
-              <w:t xml:space="preserve">   One correct option, Hard, [F], Fri</w:t>
+              <w:t xml:space="preserve">   Applied maths, Hard, [F], Fri</w:t>
             </w:r>
           </w:p>
           <w:p>
@@ -18480,88 +18399,7 @@
                 <w:sz w:val="21"/>
                 <w:szCs w:val="21"/>
               </w:rPr>
-              <w:t xml:space="preserve">Both failures are ranges that stop before the data does, so a control total from the source, here the warehouse's Rs 19,84,00,000, and a count of the rows each range covers against the rows in the table fail the day it happens: 311 customers, 300 covered. That is the drift check in Friday's operating rule. The case is from Herndon, Ash and Pollin, PERI working paper 322 (April 2013), and Retraction Watch (18 April 2013); the replicators' corrected average for the group, 2.2 percent against the published -0.1, also corrects two other choices, so the range alone is not the whole gap. Checked on 30 September 2026.</w:t>
-            </w:r>
-          </w:p>
-          <w:p>
-            <w:pPr>
-              <w:keepNext/>
-              <w:spacing w:after="40" w:line="264"/>
-              <w:ind w:left="360" w:hanging="360"/>
-            </w:pPr>
-            <w:r>
-              <w:rPr>
-                <w:rFonts w:ascii="Arial" w:cs="Arial" w:eastAsia="Arial" w:hAnsi="Arial"/>
-                <w:b/>
-                <w:bCs/>
-                <w:color w:val="1C1B16"/>
-                <w:sz w:val="20"/>
-                <w:szCs w:val="20"/>
-              </w:rPr>
-              <w:t xml:space="preserve">A.  </w:t>
-            </w:r>
-            <w:r>
-              <w:rPr>
-                <w:rFonts w:ascii="Arial" w:cs="Arial" w:eastAsia="Arial" w:hAnsi="Arial"/>
-                <w:color w:val="1C1B16"/>
-                <w:sz w:val="20"/>
-                <w:szCs w:val="20"/>
-              </w:rPr>
-              <w:t xml:space="preserve">Protection stops edits, and the formula that ends at row 301 was never edited, which is the problem.</w:t>
-            </w:r>
-          </w:p>
-          <w:p>
-            <w:pPr>
-              <w:keepNext/>
-              <w:spacing w:after="40" w:line="264"/>
-              <w:ind w:left="360" w:hanging="360"/>
-            </w:pPr>
-            <w:r>
-              <w:rPr>
-                <w:rFonts w:ascii="Arial" w:cs="Arial" w:eastAsia="Arial" w:hAnsi="Arial"/>
-                <w:b/>
-                <w:bCs/>
-                <w:color w:val="1C1B16"/>
-                <w:sz w:val="20"/>
-                <w:szCs w:val="20"/>
-              </w:rPr>
-              <w:t xml:space="preserve">B.  </w:t>
-            </w:r>
-            <w:r>
-              <w:rPr>
-                <w:rFonts w:ascii="Arial" w:cs="Arial" w:eastAsia="Arial" w:hAnsi="Arial"/>
-                <w:color w:val="1C1B16"/>
-                <w:sz w:val="20"/>
-                <w:szCs w:val="20"/>
-              </w:rPr>
-              <w:t xml:space="preserve">Recalculating a formula whose range stops short recalculates the same wrong total; a refresh reaches pivots, and a typed range is no pivot.</w:t>
-            </w:r>
-          </w:p>
-          <w:p>
-            <w:pPr>
-              <w:keepNext/>
-              <w:spacing w:after="40" w:line="264"/>
-              <w:ind w:left="360" w:hanging="360"/>
-            </w:pPr>
-            <w:r>
-              <w:rPr>
-                <w:rFonts w:ascii="Arial" w:cs="Arial" w:eastAsia="Arial" w:hAnsi="Arial"/>
-                <w:b/>
-                <w:bCs/>
-                <w:color w:val="1C1B16"/>
-                <w:sz w:val="20"/>
-                <w:szCs w:val="20"/>
-              </w:rPr>
-              <w:t xml:space="preserve">C.  </w:t>
-            </w:r>
-            <w:r>
-              <w:rPr>
-                <w:rFonts w:ascii="Arial" w:cs="Arial" w:eastAsia="Arial" w:hAnsi="Arial"/>
-                <w:color w:val="1C1B16"/>
-                <w:sz w:val="20"/>
-                <w:szCs w:val="20"/>
-              </w:rPr>
-              <w:t xml:space="preserve">A second calculation on the first rows agrees with the formula wherever both cover the same rows; the rows left out sit at the end.</w:t>
+              <w:t xml:space="preserve">B8 averages rows 2 to 5 alone: (-1.0 + 1.0 - 3.0 + 1.0) / 4 = -0.5. The six countries average (-1.0 + 1.0 - 3.0 + 1.0 + 5.0 + 3.0) / 6 = 1.0, so the formula understates the average by 1.5 percentage points and reports a fall where the group grew. In the paper, the coding error, compounded with other errors, took 0.3 percentage points off the published average for the highest debt group, overstated the lowest group by 0.1 and understated the second by 0.2; the replicators' corrected average for the highest group, 2.2 percent against the published -0.1, also corrects two other choices, so the range alone is not the whole gap (PERI working paper 322, April 2013, page 7, checked on 30 September 2026). The check that catches a range such as B2:B5 is a count of the rows each range covers against the rows in the table, run on every refresh; a Protect tab whose formulas stop at row 301 would miss every customer an export adds past the first 300.</w:t>
             </w:r>
           </w:p>
           <w:p>
@@ -18674,7 +18512,7 @@
                 <w:sz w:val="21"/>
                 <w:szCs w:val="21"/>
               </w:rPr>
-              <w:t xml:space="preserve">   Key A</w:t>
+              <w:t xml:space="preserve">   Key B</w:t>
             </w:r>
             <w:r>
               <w:rPr>
@@ -18709,7 +18547,7 @@
                 <w:sz w:val="21"/>
                 <w:szCs w:val="21"/>
               </w:rPr>
-              <w:t xml:space="preserve">(2.60 - 2.00) / (2.00 + 2.60) = 0.60 / 4.60 = 0.130; divided by the average, 2.30, the change is 0.261, so the sheet halves every change, which the report describes as "muting volatility by a factor of two". A second way to the same number, by hand on one row or in a second tool, catches it: Kavya's review and Thursday's three-tool check. Quoted from the Report of JPMorgan Chase and Co. Management Task Force Regarding 2012 CIO Losses, 16 January 2013, pages 123 and 128, checked on 30 September 2026.</w:t>
+              <w:t xml:space="preserve">Column D reads 0.60 / 4.60 = 0.130, -0.60 / 5.40 = -0.111 and 0.30 / 3.30 = 0.091; divided by the average instead, the changes are 0.261, -0.222 and 0.182. The sum is twice the average, so every change, rising or falling, comes out at half its size, and a model fed half-size moves reports less risk than the book carries: the report describes the effect as "muting volatility by a factor of two". A second way to the same number, by hand on one row or in a second tool, catches it: Kavya's review and Thursday's three-tool check. Quoted from the Report of JPMorgan Chase and Co. Management Task Force Regarding 2012 CIO Losses, 16 January 2013, pages 123 and 128, checked on 30 September 2026.</w:t>
             </w:r>
           </w:p>
           <w:p>
@@ -18727,7 +18565,7 @@
                 <w:sz w:val="20"/>
                 <w:szCs w:val="20"/>
               </w:rPr>
-              <w:t xml:space="preserve">B.  </w:t>
+              <w:t xml:space="preserve">A.  </w:t>
             </w:r>
             <w:r>
               <w:rPr>
@@ -18736,7 +18574,7 @@
                 <w:sz w:val="20"/>
                 <w:szCs w:val="20"/>
               </w:rPr>
-              <w:t xml:space="preserve">The formula divides by B2 + C2, the sum, which is twice the average; the copying is a further risk the report names, and a check on copying alone misses this.</w:t>
+              <w:t xml:space="preserve">Dividing by the sum, which is twice the average, makes each change smaller; a change twice as large would need a divisor of half the average.</w:t>
             </w:r>
           </w:p>
           <w:p>
@@ -18763,7 +18601,7 @@
                 <w:sz w:val="20"/>
                 <w:szCs w:val="20"/>
               </w:rPr>
-              <w:t xml:space="preserve">Dividing by the sum is not the relative change the modeller meant, and only a second calculation shows the gap.</w:t>
+              <w:t xml:space="preserve">The falling rate comes out at half its size like the others, -0.111 against -0.222; the error does not depend on the direction of the move.</w:t>
             </w:r>
           </w:p>
           <w:p>
@@ -18790,7 +18628,7 @@
                 <w:sz w:val="20"/>
                 <w:szCs w:val="20"/>
               </w:rPr>
-              <w:t xml:space="preserve">Divides by the old rate, a third convention; and a pivot of the sheet's outputs repeats the formula's error in every row.</w:t>
+              <w:t xml:space="preserve">Dividing by the sum departs from the relative change the modeller meant, and on these rows it halves every change the model reads.</w:t>
             </w:r>
           </w:p>
           <w:p>
@@ -18903,7 +18741,7 @@
                 <w:sz w:val="21"/>
                 <w:szCs w:val="21"/>
               </w:rPr>
-              <w:t xml:space="preserve">   Key 0.60 dollars a trip</w:t>
+              <w:t xml:space="preserve">   Key 2.00 dollars, about 8.5 percent of the 23.50 dollars charged</w:t>
             </w:r>
             <w:r>
               <w:rPr>
@@ -18912,7 +18750,7 @@
                 <w:sz w:val="18"/>
                 <w:szCs w:val="18"/>
               </w:rPr>
-              <w:t xml:space="preserve">   Applied maths, Medium, [F], Fri</w:t>
+              <w:t xml:space="preserve">   Applied maths, Hard, [F], Fri</w:t>
             </w:r>
           </w:p>
           <w:p>
@@ -18938,7 +18776,7 @@
                 <w:sz w:val="21"/>
                 <w:szCs w:val="21"/>
               </w:rPr>
-              <w:t xml:space="preserve">25 percent of the gross 30.00 is 7.50; 25 percent of the net 27.60 is 6.90; the difference is 0.60 dollars, which is 25 percent of the 2.40 of tax and fees. Small on one trip, it adds up across tens of thousands of drivers, which is why a percentage's base is part of its definition. CBS News, 24 May 2017, checked on 30 September 2026; the fare and the rate here are illustrative.</w:t>
+              <w:t xml:space="preserve">The fares after tax and fees are 27.60, 18.40 and 40.00 dollars, so the commission due is 6.90, 4.60 and 10.00 against 7.50, 5.00 and 11.00 charged: 0.60 + 0.40 + 1.00 = 2.00 dollars, which is also 25 percent of the 8.00 dollars of tax and fees. Against the 23.50 dollars charged that is 8.5 percent, a share that repeats on every trip across tens of thousands of drivers, which is why a percentage's base is part of its definition. CBS News, 24 May 2017, checked on 30 September 2026; the fares and the rate here are illustrative.</w:t>
             </w:r>
           </w:p>
           <w:p>
@@ -19086,7 +18924,7 @@
                 <w:sz w:val="21"/>
                 <w:szCs w:val="21"/>
               </w:rPr>
-              <w:t xml:space="preserve">A merge writes one row per matching label, so T3 and T5 appear twice: 7 rows. Both are tickets the model got wrong, so the mean counts 3 correct rows of 7, 0.43, against 3 correct tickets of 5, 0.6. It is the fan-out of Tuesday's payments and Thursday's exposure feed, and the checks are the same: rows before and after, or validate='one_to_one'. Run on pandas 3.0.5 on 30 September 2026.</w:t>
+              <w:t xml:space="preserve">A merge writes one row per matching label, so T3 and T5 appear twice: 7 rows. Both are tickets the model got wrong, so the mean counts 3 correct rows of 7, 0.43, against 3 correct tickets of 5, 0.6: the model fails the 0.5 bar on a score that counts its two misses twice. It is the fan-out of Tuesday's payments and Thursday's exposure feed, and the checks are the same: rows before and after, or validate='one_to_one'. Run on pandas 3.0.5 on 30 September 2026.</w:t>
             </w:r>
           </w:p>
           <w:p>
@@ -19167,7 +19005,7 @@
                 <w:sz w:val="20"/>
                 <w:szCs w:val="20"/>
               </w:rPr>
-              <w:t xml:space="preserve">A repeat inflates a score only when it repeats correct rows; here it repeats the two misses.</w:t>
+              <w:t xml:space="preserve">A repeat raises a score only when it repeats correct rows; here it repeats the two misses.</w:t>
             </w:r>
           </w:p>
           <w:p>
@@ -19315,7 +19153,7 @@
                 <w:sz w:val="21"/>
                 <w:szCs w:val="21"/>
               </w:rPr>
-              <w:t xml:space="preserve">ROW_NUMBER partitioned by model and ordered by finished_on DESC, run_id DESC, filtered to row 1 outside the window, returns bot-a's r2 (0.78) and bot-b's r5 (0.79) every time. With the date alone, bot-b's two runs of 9 September tie and the database picks one, so the leaderboard can show 0.86 one morning and 0.79 the next. Run on PostgreSQL 16.13 on 30 September 2026.</w:t>
+              <w:t xml:space="preserve">ROW_NUMBER partitioned by model and ordered by finished_on descending, then run_id descending, filtered to row 1 outside the window, returns bot-a's r2 (0.78) and bot-b's r5 (0.79) every time, and r5 is the later run because run ids follow the order runs start. With the date alone, bot-b's two runs of 9 September tie and the database picks one, so the leaderboard can show 0.86 one morning and 0.79 the next. Run on PostgreSQL 16.13 on 30 September 2026.</w:t>
             </w:r>
           </w:p>
           <w:p>
@@ -19396,7 +19234,7 @@
                 <w:sz w:val="20"/>
                 <w:szCs w:val="20"/>
               </w:rPr>
-              <w:t xml:space="preserve">RANK gives r4 and r5 the same rank 1, so bot-b appears twice on the leaderboard.</w:t>
+              <w:t xml:space="preserve">RANK gives r4 and r5 the same rank 1, so bot-b shows two rows, the same two every morning, where the leaderboard wants one.</w:t>
             </w:r>
           </w:p>
           <w:p>
@@ -19509,7 +19347,7 @@
                 <w:sz w:val="21"/>
                 <w:szCs w:val="21"/>
               </w:rPr>
-              <w:t xml:space="preserve">   Key B</w:t>
+              <w:t xml:space="preserve">   Key A</w:t>
             </w:r>
             <w:r>
               <w:rPr>
@@ -19544,7 +19382,7 @@
                 <w:sz w:val="21"/>
                 <w:szCs w:val="21"/>
               </w:rPr>
-              <w:t xml:space="preserve">WHERE runs first and keeps the three low ratings, two for bot-a and one for bot-b. GROUP BY forms groups only from those rows, so bot-c forms no group at all, and HAVING then keeps the groups with two or more: bot-a, 2. The query never prints a zero row. Run on PostgreSQL 16.13 on 30 September 2026.</w:t>
+              <w:t xml:space="preserve">WHERE runs first and keeps the five low ratings: three for bot-a, one for bot-b and one for bot-c. GROUP BY forms its groups from those rows alone, so count(*) counts low ratings, and HAVING count(*) &gt;= 3 keeps bot-a with 3. The lead asked for the models with at least three replies in all, bot-a with 4 and bot-b with 3, so the query drops bot-b: its HAVING tests the wrong count. With no WHERE, counting every reply in HAVING and the low ones with count(*) FILTER (WHERE rating &lt;= 2) returns bot-a 3 and bot-b 1. Run on PostgreSQL 16.13 on 30 September 2026.</w:t>
             </w:r>
           </w:p>
           <w:p>
@@ -19562,7 +19400,7 @@
                 <w:sz w:val="20"/>
                 <w:szCs w:val="20"/>
               </w:rPr>
-              <w:t xml:space="preserve">A.  </w:t>
+              <w:t xml:space="preserve">B.  </w:t>
             </w:r>
             <w:r>
               <w:rPr>
@@ -19571,7 +19409,7 @@
                 <w:sz w:val="20"/>
                 <w:szCs w:val="20"/>
               </w:rPr>
-              <w:t xml:space="preserve">Applies HAVING before WHERE: judged on all seven ratings every model has two or more, and then the rows are filtered. The logical order is WHERE, GROUP BY, HAVING.</w:t>
+              <w:t xml:space="preserve">Reads HAVING as judging all of each model's replies; it runs after WHERE, so it sees only the low ratings, and bot-b's one fails the test.</w:t>
             </w:r>
           </w:p>
           <w:p>
@@ -19598,7 +19436,7 @@
                 <w:sz w:val="20"/>
                 <w:szCs w:val="20"/>
               </w:rPr>
-              <w:t xml:space="preserve">A group exists only for values that survive WHERE; bot-c had no low rating, so it has no row, and bot-b's 1 fails HAVING.</w:t>
+              <w:t xml:space="preserve">Counts every reply, as if WHERE had never run; count(*) counts the rows that survive WHERE.</w:t>
             </w:r>
           </w:p>
           <w:p>
@@ -19625,7 +19463,7 @@
                 <w:sz w:val="20"/>
                 <w:szCs w:val="20"/>
               </w:rPr>
-              <w:t xml:space="preserve">Counts every rating, as if WHERE were ignored; these are the group sizes before any filter.</w:t>
+              <w:t xml:space="preserve">Ignores HAVING; bot-b and bot-c each have one low rating, and HAVING keeps only groups of three or more.</w:t>
             </w:r>
           </w:p>
           <w:p>
@@ -19651,7 +19489,7 @@
                 <w:sz w:val="21"/>
                 <w:szCs w:val="21"/>
               </w:rPr>
-              <w:t xml:space="preserve">WHERE keeps or drops single rows before any group exists; HAVING keeps or drops whole groups after the aggregate is computed, which is why an aggregate can sit in HAVING and never in WHERE.</w:t>
+              <w:t xml:space="preserve">WHERE keeps or drops single rows before any group exists; HAVING keeps or drops whole groups after the aggregate is computed, so a HAVING that follows a WHERE counts only the rows WHERE kept.</w:t>
             </w:r>
           </w:p>
           <w:p>
@@ -19854,7 +19692,7 @@
                 <w:sz w:val="20"/>
                 <w:szCs w:val="20"/>
               </w:rPr>
-              <w:t xml:space="preserve">Postgres raises nothing; the comparison with NULL is unknown and the rows are dropped without a word.</w:t>
+              <w:t xml:space="preserve">Postgres raises nothing; the comparison with NULL is unknown and the rows are dropped without a word, so the review gets a figure, and the wrong one.</w:t>
             </w:r>
           </w:p>
           <w:p>
@@ -19976,7 +19814,7 @@
                 <w:sz w:val="18"/>
                 <w:szCs w:val="18"/>
               </w:rPr>
-              <w:t xml:space="preserve">   One correct option, Medium, [F], Wed</w:t>
+              <w:t xml:space="preserve">   One correct option, Hard, [F], Wed</w:t>
             </w:r>
           </w:p>
           <w:p>
@@ -20231,7 +20069,7 @@
                 <w:sz w:val="21"/>
                 <w:szCs w:val="21"/>
               </w:rPr>
-              <w:t xml:space="preserve">A distinct count does not add across days: a person who used the assistant on five days is in five daily counts and once in the week's. The week's figure is its own COUNT(DISTINCT user_id) over the week's rows, 2,100, never the sum of the days. On Kalpa's book, 244 Q1 buyers and 227 Q2 buyers are 301 customers across both quarters, not 471.</w:t>
+              <w:t xml:space="preserve">A distinct count does not add across days: U1 used the assistant on four days, so U1 is in four daily counts and once in the week's. The week's figure is its own COUNT(DISTINCT user_id) over the week's rows, 6, never the sum of the days, 16. On Kalpa's book, 244 buyers in April to June and 227 in July to September are 301 customers across both quarters, never 471.</w:t>
             </w:r>
           </w:p>
           <w:p>
@@ -20258,7 +20096,7 @@
                 <w:sz w:val="20"/>
                 <w:szCs w:val="20"/>
               </w:rPr>
-              <w:t xml:space="preserve">Each day is distinct within the day; across days the same people repeat, so the sum counts them again.</w:t>
+              <w:t xml:space="preserve">The seven daily counts added up; each day is distinct within the day, and across days the same users repeat, so the sum counts them again.</w:t>
             </w:r>
           </w:p>
           <w:p>
@@ -20285,7 +20123,7 @@
                 <w:sz w:val="20"/>
                 <w:szCs w:val="20"/>
               </w:rPr>
-              <w:t xml:space="preserve">An average of daily counts answers how many on a typical day, a different question from the week's reach.</w:t>
+              <w:t xml:space="preserve">The average of the daily counts answers how many on a typical day, a different question from the week's reach.</w:t>
             </w:r>
           </w:p>
           <w:p>
@@ -20312,7 +20150,7 @@
                 <w:sz w:val="20"/>
                 <w:szCs w:val="20"/>
               </w:rPr>
-              <w:t xml:space="preserve">The peak answers capacity planning; the ask was the week's active users.</w:t>
+              <w:t xml:space="preserve">The busiest day's count answers how much the assistant must handle at once; the ask was the week's active users.</w:t>
             </w:r>
           </w:p>
           <w:p>
@@ -20493,7 +20331,7 @@
           <w:sz w:val="21"/>
           <w:szCs w:val="21"/>
         </w:rPr>
-        <w:t xml:space="preserve">Medium (12): Q2, Q14, Q17, Q18, Q19, Q23, Q24, Q25, Q26, Q29, Q34, Q35</w:t>
+        <w:t xml:space="preserve">Medium (12): Q2, Q5, Q13, Q14, Q17, Q18, Q19, Q23, Q24, Q25, Q26, Q35</w:t>
       </w:r>
     </w:p>
     <w:p>
@@ -20512,7 +20350,7 @@
           <w:sz w:val="21"/>
           <w:szCs w:val="21"/>
         </w:rPr>
-        <w:t xml:space="preserve">Hard (21): Q1, Q5, Q6, Q7, Q8, Q9, Q10, Q11, Q12, Q13, Q15, Q16, Q20, Q21, Q22, Q27, Q28, Q30, Q31, Q32, Q33</w:t>
+        <w:t xml:space="preserve">Hard (21): Q1, Q6, Q7, Q8, Q9, Q10, Q11, Q12, Q15, Q16, Q20, Q21, Q22, Q27, Q28, Q29, Q30, Q31, Q32, Q33, Q34</w:t>
       </w:r>
     </w:p>
     <w:p>
@@ -20677,7 +20515,7 @@
           <w:sz w:val="21"/>
           <w:szCs w:val="21"/>
         </w:rPr>
-        <w:t xml:space="preserve">Q1 (One correct option, Hard, [F]): Anand's analyst fills the missing leaf with SELECT quarter, count(*) / count(DISTINCT customer_id) FROM rp_orders GROUP BY quarter, where rp_orders holds the Retail-Plus orders above. What does the query return, and what should the note to the head of Retail-Plus say?</w:t>
+        <w:t xml:space="preserve">Q1 (Applied maths, Hard, [F]): Anand's analyst fills the missing leaf with SELECT quarter, count(*) / count(DISTINCT customer_id) FROM rp_orders GROUP BY quarter, where rp_orders holds the Retail-Plus orders above. What does the query print for each quarter, what are the true figures, and how did orders per member change from the first quarter to the second? Show the working.</w:t>
       </w:r>
     </w:p>
     <w:p>
@@ -20696,7 +20534,7 @@
           <w:sz w:val="21"/>
           <w:szCs w:val="21"/>
         </w:rPr>
-        <w:t xml:space="preserve">Q5 (One correct option, Hard, [D]): The Monday suite runs as saved queries in the warehouse, so each Monday it reruns unchanged on the source, and Anand's analyst can read every step. Which fact, if it became true of one of its numbers, would make an Excel workbook the better home for that number?</w:t>
+        <w:t xml:space="preserve">Q5 (One correct option, Medium, [D]): On Monday afternoon the head of Retail-Plus asks the analyst for a chart of orders per member, week by week across both quarters, to see how the figure moved before anyone decides what to report. With Anand's rule in mind, where should that work happen?</w:t>
       </w:r>
     </w:p>
     <w:p>
@@ -20715,7 +20553,7 @@
           <w:sz w:val="21"/>
           <w:szCs w:val="21"/>
         </w:rPr>
-        <w:t xml:space="preserve">Q6 (One correct option, Hard, [D]): In 2016 Facebook told advertisers that its average duration of video viewed had divided the total time watched by the number of views lasting 3 seconds or more, where it should have divided by every view (TechCrunch, 2016). The query above rebuilds both versions of the metric. What does it return, and by how much does the reported figure overstate the average per view?</w:t>
+        <w:t xml:space="preserve">Q6 (One correct option, Hard, [D]): In 2016 Facebook told advertisers that it had defined the average duration of video viewed as the total time spent watching a video divided by the number of people who played it, and had calculated it by dividing by only the people who watched for three seconds or more (TechCrunch, 2016). The query above rebuilds both on five illustrative viewers. What does it return, and by how much does the calculated average overstate the defined one?</w:t>
       </w:r>
     </w:p>
     <w:p>
@@ -20753,7 +20591,7 @@
           <w:sz w:val="21"/>
           <w:szCs w:val="21"/>
         </w:rPr>
-        <w:t xml:space="preserve">Q8 (Order the steps, Hard, [D]): Put the steps of Anand's collected-revenue report in the order they must run.</w:t>
+        <w:t xml:space="preserve">Q8 (Order the steps, Hard, [D]): Five of these six steps make Anand's collected-revenue report, and one would spoil it. Leave that step out, and write the other five in the order they must run.</w:t>
       </w:r>
     </w:p>
     <w:p>
@@ -20772,7 +20610,7 @@
           <w:sz w:val="21"/>
           <w:szCs w:val="21"/>
         </w:rPr>
-        <w:t xml:space="preserve">Q9 (One correct option, Hard, [S]): Anand wants every Q2 order beside what was collected on it within the quarter, so the analyst adds a date filter on the payments. Before the report goes to him, the analyst runs the query above to count its rows and their booked value. What does it return?</w:t>
+        <w:t xml:space="preserve">Q9 (One correct option, Hard, [S]): Anand wants every order of the quarter beside what was collected on it within the quarter, so the analyst adds a date filter on the payments. Before the report goes to him, the analyst runs the query above to count its rows and their booked value. What does it return?</w:t>
       </w:r>
     </w:p>
     <w:p>
@@ -20791,7 +20629,7 @@
           <w:sz w:val="21"/>
           <w:szCs w:val="21"/>
         </w:rPr>
-        <w:t xml:space="preserve">Q10 (One correct option, Hard, [D]): It is the end of reporting day, and Anand expects the report tonight. Two checks pass, and the third fails by Rs 21,750 that nobody has explained yet. What do you send?</w:t>
+        <w:t xml:space="preserve">Q10 (One correct option, Hard, [D]): It is the end of the reporting day, and Anand expects the report tonight. In each channel the gap, booked less collected, should equal the unpaid orders' booked value. What do you send?</w:t>
       </w:r>
     </w:p>
     <w:p>
@@ -20810,7 +20648,7 @@
           <w:sz w:val="21"/>
           <w:szCs w:val="21"/>
         </w:rPr>
-        <w:t xml:space="preserve">Q11 (More than one correct, Hard, [D]): In October 2020 Public Health England found that 15,841 positive COVID-19 cases from 25 September to 2 October had been left out of the daily figures, because some files were larger than the load could take (GOV.UK, 2020); rows past the old format's limit were dropped without a warning (The Register, 2020). Which of these, run on every file, would have told the team that cases were missing on the day they went missing? Mark every correct option.</w:t>
+        <w:t xml:space="preserve">Q11 (More than one correct, Hard, [D]): In October 2020 Public Health England found that 15,841 positive COVID-19 cases from 25 September to 2 October had been left out of the daily figures, because some files had exceeded the maximum size the load could take (GOV.UK, 2020). The labs' CSV files had been converted to the older .xls format, and records past its limit were "simply left off and not counted when imported" (The Register, 2020). Which of these checks, run on every file, would have stopped Lab B's file on the day in the table? Mark every correct option.</w:t>
       </w:r>
     </w:p>
     <w:p>
@@ -20829,7 +20667,7 @@
           <w:sz w:val="21"/>
           <w:szCs w:val="21"/>
         </w:rPr>
-        <w:t xml:space="preserve">Q12 (Scenario set, Hard, [S]): The analyst computes RANK(), DENSE_RANK() and ROW_NUMBER() over Q2 revenue, highest first, and keeps the members numbered 50 or better under each. How many members does each keep?</w:t>
+        <w:t xml:space="preserve">Q12 (Scenario set, Hard, [S]): The analyst computes RANK(), DENSE_RANK() and ROW_NUMBER() over the quarter's revenue, highest first, and keeps the members numbered 50 or better under each. How many members does each keep?</w:t>
       </w:r>
     </w:p>
     <w:p>
@@ -20848,7 +20686,7 @@
           <w:sz w:val="21"/>
           <w:szCs w:val="21"/>
         </w:rPr>
-        <w:t xml:space="preserve">Q13 (Scenario set, Hard, [D]): Which list meets the head of Retail-Plus's ask, and what does the note to Marketing say?</w:t>
+        <w:t xml:space="preserve">Q13 (Scenario set, Medium, [D]): Which list follows the rule the head of Retail-Plus set?</w:t>
       </w:r>
     </w:p>
     <w:p>
@@ -20867,7 +20705,7 @@
           <w:sz w:val="21"/>
           <w:szCs w:val="21"/>
         </w:rPr>
-        <w:t xml:space="preserve">Q15 (One correct option, Hard, [F]): The falling flag reads member_month, one row per member per month with an order. It takes prev1 = LAG(spend, 1) and prev2 = LAG(spend, 2), each partitioned by member and ordered by month, and flags a member whose September spend is below prev1 while prev1 is below prev2. Which members does it flag, and which of them should Marketing call falling two months running?</w:t>
+        <w:t xml:space="preserve">Q15 (One correct option, Hard, [F]): The falling flag reads member_month, one row per member per month with an order. It takes prev1 = LAG(spend, 1) and prev2 = LAG(spend, 2), each partitioned by member and ordered by month, and flags a member whose September spend is below prev1 while prev1 is below prev2. Marketing will call every member the flag names and say that their spend fell in both August and September. How many calls does Marketing make, and how many of them say something untrue?</w:t>
       </w:r>
     </w:p>
     <w:p>
@@ -20886,7 +20724,7 @@
           <w:sz w:val="21"/>
           <w:szCs w:val="21"/>
         </w:rPr>
-        <w:t xml:space="preserve">Q16 (One correct option, Hard, [D]): Q2 closed at Rs 9,84,00,000 against a plan of Rs 9,83,99,990 for the quarter. At mid-quarter the running total had been Rs 1.58 crore ahead of plan, almost all of it from one week in July. Meera's chief of staff wants one line about the plan for Monday's front page. Which do you send?</w:t>
+        <w:t xml:space="preserve">Q16 (One correct option, Hard, [D]): Meera's chief of staff wants one line about the plan for Monday's front page, and the figures above are all there is. Which line do they support?</w:t>
       </w:r>
     </w:p>
     <w:p>
@@ -20962,7 +20800,7 @@
           <w:sz w:val="21"/>
           <w:szCs w:val="21"/>
         </w:rPr>
-        <w:t xml:space="preserve">Q20 (Scenario set, Hard, [D]): Next Monday's feed may repeat customers again. Where does the fix belong, so the refresh runs clean without anyone editing its output?</w:t>
+        <w:t xml:space="preserve">Q20 (Scenario set, Hard, [D]): Marketing's rule is one exposure per customer, the first by date. Which step applies it, so that the table sent to Excel has one row per customer carrying each customer's first exposure?</w:t>
       </w:r>
     </w:p>
     <w:p>
@@ -21000,7 +20838,7 @@
           <w:sz w:val="21"/>
           <w:szCs w:val="21"/>
         </w:rPr>
-        <w:t xml:space="preserve">Q22 (One correct option, Hard, [D]): A gene symbol is the short name a gene is known by, such as SEPT2 or MARCH1. Ziemann and colleagues found that Excel's default settings turn such symbols into dates, SEPT2 into 2-Sep and MARCH1 into 1-Mar, and that about a fifth of genomics papers with Excel gene lists carried such errors (Genome Biology, 2016). An analyst merges a lab's list onto a reference table. What does the code above print, and what should the analyst do?</w:t>
+        <w:t xml:space="preserve">Q22 (One correct option, Hard, [D]): Gene symbols are the short names genes go by in papers and databases, and before 2020 two of them were SEPT2 and MARCH1. Ziemann and colleagues found that Excel's default settings turned such symbols into dates, SEPT2 into 2-Sep and MARCH1 into 1-Mar, and that about a fifth of genomics papers with Excel gene lists carried such errors (Genome Biology, 2016). In 2020 the body that names human genes renamed the genes Excel turned into dates, so that MARCH1 became MARCHF1 and SEPT1 became SEPTIN1 (Nature Genetics, 2020). The code above merges a lab's list onto a reference table from before the renaming. What does it print, and what should the analyst do?</w:t>
       </w:r>
     </w:p>
     <w:p>
@@ -21019,7 +20857,7 @@
           <w:sz w:val="21"/>
           <w:szCs w:val="21"/>
         </w:rPr>
-        <w:t xml:space="preserve">Q23 (Match the following, Medium, [F]): Find any member by id, and say so plainly when the id is not in the list</w:t>
+        <w:t xml:space="preserve">Q23 (Match the following, Medium, [F]): Find any member by member code, and print a plain message for an unknown code</w:t>
       </w:r>
     </w:p>
     <w:p>
@@ -21038,7 +20876,7 @@
           <w:sz w:val="21"/>
           <w:szCs w:val="21"/>
         </w:rPr>
-        <w:t xml:space="preserve">Q24 (Match the following, Medium, [F]): A total at the foot of the protect list that follows the filter to one city</w:t>
+        <w:t xml:space="preserve">Q24 (Match the following, Medium, [F]): A figure under the protect list that adds only the members a filter to Mumbai leaves on screen</w:t>
       </w:r>
     </w:p>
     <w:p>
@@ -21057,7 +20895,7 @@
           <w:sz w:val="21"/>
           <w:szCs w:val="21"/>
         </w:rPr>
-        <w:t xml:space="preserve">Q25 (Match the following, Medium, [F]): Revenue by segment from an export with one row per payment, so an order paid in two instalments appears twice</w:t>
+        <w:t xml:space="preserve">Q25 (Match the following, Medium, [F]): Revenue by segment from Friday's export, in which an invoice paid in two instalments appears twice</w:t>
       </w:r>
     </w:p>
     <w:p>
@@ -21076,7 +20914,7 @@
           <w:sz w:val="21"/>
           <w:szCs w:val="21"/>
         </w:rPr>
-        <w:t xml:space="preserve">Q26 (Match the following, Medium, [D]): Let a director try Rs 5,00,000 for Retail-Plus in Q2 without touching the source figures</w:t>
+        <w:t xml:space="preserve">Q26 (Match the following, Medium, [D]): Let a director try Rs 5,00,000 for Retail-Plus in July to September, with the warehouse's figures untouched</w:t>
       </w:r>
     </w:p>
     <w:p>
@@ -21095,7 +20933,7 @@
           <w:sz w:val="21"/>
           <w:szCs w:val="21"/>
         </w:rPr>
-        <w:t xml:space="preserve">Q27 (One correct option, Hard, [F]): In 2013 Herndon, Ash and Pollin tried to reproduce an influential 2010 paper by Reinhart and Rogoff from its own spreadsheet, and found an average whose range stopped short of the data, leaving Australia, Austria, Belgium, Canada and Denmark out of one group (PERI working paper 322, 2013). The chief of staff's workbook carries the same risk: next Monday's export holds 311 customers where Friday's held 300, and the Protect tab's formulas end at row 301. Which check, run on every refresh, catches both?</w:t>
+        <w:t xml:space="preserve">Q27 (Applied maths, Hard, [F]): In 2013 Herndon, Ash and Pollin rebuilt an influential 2010 paper by Reinhart and Rogoff from the authors' own working spreadsheet. They reported that a coding error "entirely excludes five countries, Australia, Austria, Belgium, Canada, and Denmark, from the analysis", because the averages covered lines 30 to 44 of the sheet instead of lines 30 to 49 (PERI working paper 322, 2013). The sheet above makes the same kind of error. What does B8 return, what should it return, and what does the error do to the reading of growth? Show the working.</w:t>
       </w:r>
     </w:p>
     <w:p>
@@ -21114,7 +20952,7 @@
           <w:sz w:val="21"/>
           <w:szCs w:val="21"/>
         </w:rPr>
-        <w:t xml:space="preserve">Q28 (One correct option, Hard, [D]): JPMorgan's task force on the 2012 losses in its Chief Investment Office reported that a value-at-risk model, an estimate of how much a trading book can lose on a bad day, ran through Excel spreadsheets filled by copying and pasting, and that one step divided a change in rates by the sum of the old and new rates where the modeller meant their average (JPMorgan Chase, 2013). What does the sheet return for the row above, and which check catches the error?</w:t>
+        <w:t xml:space="preserve">Q28 (One correct option, Hard, [D]): JPMorgan's task force on the 2012 losses in its Chief Investment Office reported that a value-at-risk model, an estimate of how much a trading book can lose on a bad day, ran through Excel spreadsheets filled by copying and pasting, and that one step divided a change in rates by the sum of the old and new rates where the modeller meant their average (JPMorgan Chase, 2013). Work out column D for the three rows and the change the modeller meant. What does the sheet do to the model's picture of risk?</w:t>
       </w:r>
     </w:p>
     <w:p>
@@ -21133,7 +20971,7 @@
           <w:sz w:val="21"/>
           <w:szCs w:val="21"/>
         </w:rPr>
-        <w:t xml:space="preserve">Q29 (Applied maths, Medium, [F]): In 2017 Uber said it had been taking its commission from New York City drivers on the gross fare, before sales tax and other fees were deducted, where it should have used the fare after them, and that it would repay affected drivers about 900 dollars each on average (CBS News, 2017). Suppose a trip's gross fare is 30.00 dollars, of which 2.40 dollars is tax and fees, and the commission is 25 percent. How much more commission did the gross-fare calculation take on this trip?</w:t>
+        <w:t xml:space="preserve">Q29 (Applied maths, Hard, [F]): In 2017 Uber said it had been taking its commission from New York City drivers on the gross fare, before sales tax and other fees were deducted, where it should have used the fare after them, and that it would repay affected drivers about 900 dollars each on average (CBS News, 2017). The commission rate on these trips is 25 percent. How much commission did the three trips overcharge the driver, and what share of the commission charged is that? Show the working.</w:t>
       </w:r>
     </w:p>
     <w:p>
@@ -21152,7 +20990,7 @@
           <w:sz w:val="21"/>
           <w:szCs w:val="21"/>
         </w:rPr>
-        <w:t xml:space="preserve">Q30 (One correct option, Hard, [F]): The team scores a model that sorts support tickets into refund, late and other, against labels from an annotation vendor. The vendor re-sent a batch, so two tickets carry their label twice. What does the code above print, and what is the model's accuracy on the five tickets?</w:t>
+        <w:t xml:space="preserve">Q30 (One correct option, Hard, [F]): The team scores a model that sorts support tickets into refund, late and other against labels from an annotation vendor, and ships a model only if it scores 0.5 or better. The vendor re-sent a batch, so two tickets carry their label twice. What does the code above print?</w:t>
       </w:r>
     </w:p>
     <w:p>
@@ -21171,7 +21009,7 @@
           <w:sz w:val="21"/>
           <w:szCs w:val="21"/>
         </w:rPr>
-        <w:t xml:space="preserve">Q31 (One correct option, Hard, [S]): The leaderboard must show each model's latest run and its accuracy, and show the same thing every morning. bot-b finished two runs on 9 September. Which approach does that?</w:t>
+        <w:t xml:space="preserve">Q31 (One correct option, Hard, [S]): The leaderboard must show one row per model, its latest run and that run's accuracy, and must show the same row every morning. Two of bot-b's runs finished on 9 September. Which query does that?</w:t>
       </w:r>
     </w:p>
     <w:p>
@@ -21190,7 +21028,7 @@
           <w:sz w:val="21"/>
           <w:szCs w:val="21"/>
         </w:rPr>
-        <w:t xml:space="preserve">Q32 (One correct option, Hard, [S]): Customers rate each reply from 1 to 5. The team lead asks which models had at least two replies rated 2 or below this week. What does the query above return?</w:t>
+        <w:t xml:space="preserve">Q32 (One correct option, Hard, [S]): Customers rate each reply from 1 to 5. The team lead asks for every model with at least three replies this week, beside how many of its replies were rated 2 or below. What does the query above return?</w:t>
       </w:r>
     </w:p>
     <w:p>
@@ -21228,7 +21066,7 @@
           <w:sz w:val="21"/>
           <w:szCs w:val="21"/>
         </w:rPr>
-        <w:t xml:space="preserve">Q34 (One correct option, Medium, [F]): The model's bill is charged per token, so the finance partner wants tokens used so far, call by call, to watch the bill build up. What does tokens_so_far read for calls 1 to 4?</w:t>
+        <w:t xml:space="preserve">Q34 (One correct option, Hard, [F]): The model's bill is charged per token, so the finance partner wants tokens used so far, call by call, to watch the bill build up. What does tokens_so_far read for calls 1 to 4?</w:t>
       </w:r>
     </w:p>
     <w:p>
@@ -21247,7 +21085,7 @@
           <w:sz w:val="21"/>
           <w:szCs w:val="21"/>
         </w:rPr>
-        <w:t xml:space="preserve">Q35 (One correct option, Medium, [F]): The seven daily counts in the chart above add up to 5,200. Counted once each, 2,100 different people used the assistant during the week. The product manager wants the week's active users for the deck. Which number do you give, and why?</w:t>
+        <w:t xml:space="preserve">Q35 (One correct option, Medium, [F]): The product manager wants the week's active users for the deck. Which number goes on the slide?</w:t>
       </w:r>
     </w:p>
     <w:p>
@@ -21355,7 +21193,7 @@
           <w:sz w:val="21"/>
           <w:szCs w:val="21"/>
         </w:rPr>
-        <w:t xml:space="preserve">Bank 6 (Fill in the blank, Medium, Wed), folded into Q15: Option d rests on when LAG returns NULL, on a row with no earlier row that far back, and the reason says so.</w:t>
+        <w:t xml:space="preserve">Bank 6 (Fill in the blank, Medium, Wed), folded into Q15: The option of three calls rests on LAG returning NULL for a member with a missing month, and the reason says LAG returns NULL only on a member's first rows.</w:t>
       </w:r>
     </w:p>
     <w:p>
@@ -21450,7 +21288,7 @@
           <w:sz w:val="21"/>
           <w:szCs w:val="21"/>
         </w:rPr>
-        <w:t xml:space="preserve">Bank 11 (True or false, Medium, Mon), folded into Q32: The item's reason says why the group filter sits in HAVING and never in WHERE, and its wrong option b is the HAVING-first reading.</w:t>
+        <w:t xml:space="preserve">Bank 11 (True or false, Medium, Mon), folded into Q32: The item's reason says why the group filter sits in HAVING and never in WHERE, and its wrong option b is the reading in which HAVING sees every reply.</w:t>
       </w:r>
     </w:p>
     <w:p>
@@ -21621,7 +21459,7 @@
           <w:sz w:val="21"/>
           <w:szCs w:val="21"/>
         </w:rPr>
-        <w:t xml:space="preserve">Bank 20 (One correct option, Medium, Mon), folded into Q5: The item's premise is why the Monday suite lives in the warehouse, and its key names the one change that would move a number out of it.</w:t>
+        <w:t xml:space="preserve">Bank 20 (One correct option, Medium, Mon), folded into Q5: The item's reason gives why the reported number lives in the warehouse, rerunning unchanged on the source and read line by line, and the item asks where the work that reports nothing belongs.</w:t>
       </w:r>
     </w:p>
     <w:p>
@@ -21678,7 +21516,7 @@
           <w:sz w:val="21"/>
           <w:szCs w:val="21"/>
         </w:rPr>
-        <w:t xml:space="preserve">Bank 23 (One correct option, Medium, Tue), folded into Q8: The report must drop the gateway's repeats by order and instalment, since HAVING count(*) &gt; 1 by order alone also lists the 188 invoices paid in two instalments; the reason gives both counts.</w:t>
+        <w:t xml:space="preserve">Bank 23 (One correct option, Medium, Tue), folded into Q8: The step the item leaves out drops every order with two payment rows, which is what HAVING count(*) &gt; 1 by order finds; the reason gives the 216 orders it lists against the 28 repeats that grouping by order and instalment lists.</w:t>
       </w:r>
     </w:p>
     <w:p>
@@ -21811,7 +21649,7 @@
           <w:sz w:val="21"/>
           <w:szCs w:val="21"/>
         </w:rPr>
-        <w:t xml:space="preserve">Bank 31 (One correct option, Medium, Fri), folded into Q23: The match row asks for the lookup that says so when an id is missing, with VLOOKUP's default approximate match as the spare beside it.</w:t>
+        <w:t xml:space="preserve">Bank 31 (One correct option, Medium, Fri), folded into Q23: The match row asks for the lookup that says so when a code is missing, with VLOOKUP's default approximate match as the spare beside it.</w:t>
       </w:r>
     </w:p>
     <w:p>
@@ -21830,7 +21668,7 @@
           <w:sz w:val="21"/>
           <w:szCs w:val="21"/>
         </w:rPr>
-        <w:t xml:space="preserve">Bank 32 (One correct option, Medium, Fri), folded into Q5: The item's key is the one job that belongs in Excel, a what-if a director changes in the room.</w:t>
+        <w:t xml:space="preserve">Bank 32 (One correct option, Medium, Fri), folded into Q26: The row is the one job bank 32 gives Excel, a director changing an input and watching the number recalculate, with the technique that does it.</w:t>
       </w:r>
     </w:p>
     <w:p>
@@ -21868,7 +21706,7 @@
           <w:sz w:val="21"/>
           <w:szCs w:val="21"/>
         </w:rPr>
-        <w:t xml:space="preserve">Bank 34 (More than one correct, Medium, Tue), folded into Q10: The item's table is the validation bank 34 asks for, and the item goes on to what to do when one check fails.</w:t>
+        <w:t xml:space="preserve">Bank 34 (More than one correct, Medium, Tue), folded into Q10: The item's table is the validation bank 34 asks for, the gap against the unpaid list channel by channel, and the item goes on to what to do when one channel fails.</w:t>
       </w:r>
     </w:p>
     <w:p>
@@ -21925,7 +21763,7 @@
           <w:sz w:val="21"/>
           <w:szCs w:val="21"/>
         </w:rPr>
-        <w:t xml:space="preserve">Bank 37 (More than one correct, Hard, Wed), folded into Q13: The item is the head of Retail-Plus's ask on the week's real tie, with each claim of bank 37 as an option.</w:t>
+        <w:t xml:space="preserve">Bank 37 (More than one correct, Hard, Wed), folded into Q13: The item applies bank 37's claims about RANK and ROW_NUMBER to the head of Retail-Plus's rule on the week's real tie.</w:t>
       </w:r>
     </w:p>
     <w:p>
@@ -21963,7 +21801,7 @@
           <w:sz w:val="21"/>
           <w:szCs w:val="21"/>
         </w:rPr>
-        <w:t xml:space="preserve">Bank 39 (More than one correct, Medium, Fri), folded into Q16: The front-page line must carry its period and its comparison, and each wrong option drops one.</w:t>
+        <w:t xml:space="preserve">Bank 39 (More than one correct, Medium, Fri), folded into Q16: The front-page line must carry its period and its comparison; every option states both, and only the key's match the figures.</w:t>
       </w:r>
     </w:p>
     <w:p>
@@ -21982,7 +21820,7 @@
           <w:sz w:val="21"/>
           <w:szCs w:val="21"/>
         </w:rPr>
-        <w:t xml:space="preserve">Bank 40 (Scenario set, Medium, Tue), folded into Q7: The same LEFT JOIN count on the week's Q2 book, with instalments as well as repeats.</w:t>
+        <w:t xml:space="preserve">Bank 40 (Scenario set, Medium, Tue), folded into Q7: The same LEFT JOIN count on the week's own quarter, with instalments as well as repeats.</w:t>
       </w:r>
     </w:p>
     <w:p>
@@ -22115,7 +21953,7 @@
           <w:sz w:val="21"/>
           <w:szCs w:val="21"/>
         </w:rPr>
-        <w:t xml:space="preserve">Bank 47 (Scenario set, Hard, Wed), folded into Q13: Exactly fifty by ROW_NUMBER with a tiebreaker is option c, with its cost named.</w:t>
+        <w:t xml:space="preserve">Bank 47 (Scenario set, Hard, Wed), folded into Q13: ROW_NUMBER with a member-id tiebreaker is option b, and its reason names the cost, a member who spent as much as the fiftieth dropped by an id nobody chose.</w:t>
       </w:r>
     </w:p>
     <w:p>
@@ -22191,7 +22029,7 @@
           <w:sz w:val="21"/>
           <w:szCs w:val="21"/>
         </w:rPr>
-        <w:t xml:space="preserve">Bank 51 (Scenario set, Hard, Thu), folded into Q20: The same question, where the fix belongs, with the business rule that repairs the feed.</w:t>
+        <w:t xml:space="preserve">Bank 51 (Scenario set, Hard, Thu), folded into Q20: Bank 51's fix, de-duplicating the exposure feed on a stated rule, is the item, which asks which step applies the rule of one exposure per customer, the first by date.</w:t>
       </w:r>
     </w:p>
     <w:p>
@@ -22210,7 +22048,7 @@
           <w:sz w:val="21"/>
           <w:szCs w:val="21"/>
         </w:rPr>
-        <w:t xml:space="preserve">Bank 52 (Applied maths, Easy, Mon), folded into Q32: The item turns on GROUP BY returning one row per value that survives WHERE, and no row for a value that does not.</w:t>
+        <w:t xml:space="preserve">Bank 52 (Applied maths, Easy, Mon), folded into Q32: Predicting the query needs the groups GROUP BY forms from the rows WHERE keeps, one per model with a low rating, before HAVING filters them.</w:t>
       </w:r>
     </w:p>
     <w:p>
@@ -22305,7 +22143,7 @@
           <w:sz w:val="21"/>
           <w:szCs w:val="21"/>
         </w:rPr>
-        <w:t xml:space="preserve">Bank 58 (Order the steps, Medium, Fri), folded into Q5: The item places one number in the warehouse, an export or a workbook, and its reason gives the one direction a number travels, from the warehouse through pandas to Excel.</w:t>
+        <w:t xml:space="preserve">Bank 58 (Order the steps, Medium, Fri), folded into Q5: The item places a piece of work among the warehouse, a notebook and a workbook, and its reason gives the one direction a number travels, from the warehouse through pandas to Excel.</w:t>
       </w:r>
     </w:p>
     <w:p>
@@ -22400,7 +22238,7 @@
           <w:sz w:val="21"/>
           <w:szCs w:val="21"/>
         </w:rPr>
-        <w:t xml:space="preserve">Bank 32, folded into Q5, option c (accepted): The key was the longest option.</w:t>
+        <w:t xml:space="preserve">Bank 32, folded into Q26, option c (accepted): The key was the longest option.</w:t>
       </w:r>
     </w:p>
     <w:p>
@@ -22633,7 +22471,7 @@
           <w:sz w:val="21"/>
           <w:szCs w:val="21"/>
         </w:rPr>
-        <w:t xml:space="preserve">A repeat is the same order and the same instalment posted twice for the same amount; the date is not part of that identity, so the rule keys on order and instalment and keeps the first posting. I would add a check that no instalment is paid more than once and list any that is, with its dates, for Anand's analyst to confirm, rather than dropping it silently.</w:t>
+        <w:t xml:space="preserve">The payment's date decides collected's week, where the order's date decides booked's, so an order paid in two instalments adds to collected in two different weeks. A weekly gap between booked and collected is then timing as well as unpaid orders, and the report says so beside the weekly figures.</w:t>
       </w:r>
     </w:p>
     <w:p>
@@ -22659,7 +22497,7 @@
           <w:sz w:val="21"/>
           <w:szCs w:val="21"/>
         </w:rPr>
-        <w:t xml:space="preserve">All three take rank 49, so every one of them holds a rank of 50 or better and the list ships 51 members. The note says so in one line: 51 members, because three tie at forty-ninth, and names the three.</w:t>
+        <w:t xml:space="preserve">The member's revenue divided by sum(revenue) OVER (), the tier's total on every row, taken in numeric and rounded on purpose; the check is that the shares add to 1, and that the total on every row equals the tier's revenue from the Monday suite.</w:t>
       </w:r>
     </w:p>
     <w:p>
@@ -22711,7 +22549,7 @@
           <w:sz w:val="21"/>
           <w:szCs w:val="21"/>
         </w:rPr>
-        <w:t xml:space="preserve">Rs 19.84 crore is real and covers two quarters, so a director reads it as a quarter that doubled. The page reads: Q2, July to September, Rs 9.84 crore, down 1.6 percent on Q1's Rs 10.00 crore.</w:t>
+        <w:t xml:space="preserve">Rs 19.84 crore is real and covers two quarters, so a director reads it as a quarter that doubled. The page reads: July to September, Rs 9.84 crore, down 1.6 percent on April to June's Rs 10.00 crore.</w:t>
       </w:r>
     </w:p>
     <w:p>
@@ -23084,42 +22922,7 @@
                       <w:sz w:val="16"/>
                       <w:szCs w:val="16"/>
                     </w:rPr>
-                    <w:t xml:space="preserve">Q1</w:t>
-                  </w:r>
-                </w:p>
-              </w:tc>
-              <w:tc>
-                <w:tcPr>
-                  <w:tcW w:type="dxa" w:w="420"/>
-                  <w:tcBorders>
-                    <w:top w:val="single" w:color="D5D0C4" w:sz="4"/>
-                    <w:left w:val="single" w:color="D5D0C4" w:sz="4"/>
-                    <w:bottom w:val="single" w:color="D5D0C4" w:sz="4"/>
-                    <w:right w:val="single" w:color="D5D0C4" w:sz="4"/>
-                  </w:tcBorders>
-                  <w:tcMar>
-                    <w:top w:type="dxa" w:w="20"/>
-                    <w:left w:type="dxa" w:w="60"/>
-                    <w:bottom w:type="dxa" w:w="20"/>
-                    <w:right w:type="dxa" w:w="60"/>
-                  </w:tcMar>
-                  <w:vAlign w:val="center"/>
-                </w:tcPr>
-                <w:p>
-                  <w:pPr>
-                    <w:spacing w:after="20" w:before="20" w:line="240"/>
-                    <w:jc w:val="center"/>
-                  </w:pPr>
-                  <w:r>
-                    <w:rPr>
-                      <w:rFonts w:ascii="Arial" w:cs="Arial" w:eastAsia="Arial" w:hAnsi="Arial"/>
-                      <w:b/>
-                      <w:bCs/>
-                      <w:color w:val="B37A33"/>
-                      <w:sz w:val="16"/>
-                      <w:szCs w:val="16"/>
-                    </w:rPr>
-                    <w:t xml:space="preserve"/>
+                    <w:t xml:space="preserve">Q5</w:t>
                   </w:r>
                 </w:p>
               </w:tc>
@@ -23190,188 +22993,6 @@
                       <w:szCs w:val="16"/>
                     </w:rPr>
                     <w:t xml:space="preserve">X</w:t>
-                  </w:r>
-                </w:p>
-              </w:tc>
-              <w:tc>
-                <w:tcPr>
-                  <w:tcW w:type="dxa" w:w="420"/>
-                  <w:tcBorders>
-                    <w:top w:val="single" w:color="D5D0C4" w:sz="4"/>
-                    <w:left w:val="single" w:color="D5D0C4" w:sz="4"/>
-                    <w:bottom w:val="single" w:color="D5D0C4" w:sz="4"/>
-                    <w:right w:val="single" w:color="D5D0C4" w:sz="4"/>
-                  </w:tcBorders>
-                  <w:tcMar>
-                    <w:top w:type="dxa" w:w="20"/>
-                    <w:left w:type="dxa" w:w="60"/>
-                    <w:bottom w:type="dxa" w:w="20"/>
-                    <w:right w:type="dxa" w:w="60"/>
-                  </w:tcMar>
-                  <w:vAlign w:val="center"/>
-                </w:tcPr>
-                <w:p>
-                  <w:pPr>
-                    <w:spacing w:after="20" w:before="20" w:line="240"/>
-                    <w:jc w:val="center"/>
-                  </w:pPr>
-                  <w:r>
-                    <w:rPr>
-                      <w:rFonts w:ascii="Arial" w:cs="Arial" w:eastAsia="Arial" w:hAnsi="Arial"/>
-                      <w:b/>
-                      <w:bCs/>
-                      <w:color w:val="B37A33"/>
-                      <w:sz w:val="16"/>
-                      <w:szCs w:val="16"/>
-                    </w:rPr>
-                    <w:t xml:space="preserve"/>
-                  </w:r>
-                </w:p>
-              </w:tc>
-              <w:tc>
-                <w:tcPr>
-                  <w:tcW w:type="dxa" w:w="420"/>
-                  <w:tcBorders>
-                    <w:top w:val="single" w:color="D5D0C4" w:sz="4"/>
-                    <w:left w:val="single" w:color="D5D0C4" w:sz="4"/>
-                    <w:bottom w:val="single" w:color="D5D0C4" w:sz="4"/>
-                    <w:right w:val="single" w:color="D5D0C4" w:sz="4"/>
-                  </w:tcBorders>
-                  <w:shd w:fill="D5D0C4" w:color="auto" w:val="clear"/>
-                  <w:tcMar>
-                    <w:top w:type="dxa" w:w="20"/>
-                    <w:left w:type="dxa" w:w="60"/>
-                    <w:bottom w:type="dxa" w:w="20"/>
-                    <w:right w:type="dxa" w:w="60"/>
-                  </w:tcMar>
-                  <w:vAlign w:val="center"/>
-                </w:tcPr>
-                <w:p>
-                  <w:pPr>
-                    <w:spacing w:after="20" w:before="20" w:line="240"/>
-                    <w:jc w:val="center"/>
-                  </w:pPr>
-                  <w:r>
-                    <w:rPr>
-                      <w:rFonts w:ascii="Arial" w:cs="Arial" w:eastAsia="Arial" w:hAnsi="Arial"/>
-                      <w:b/>
-                      <w:bCs/>
-                      <w:color w:val="B37A33"/>
-                      <w:sz w:val="16"/>
-                      <w:szCs w:val="16"/>
-                    </w:rPr>
-                    <w:t xml:space="preserve"/>
-                  </w:r>
-                </w:p>
-              </w:tc>
-            </w:tr>
-            <w:tr>
-              <w:trPr>
-                <w:cantSplit/>
-                <w:trHeight w:val="280" w:hRule="atLeast"/>
-              </w:trPr>
-              <w:tc>
-                <w:tcPr>
-                  <w:tcW w:type="dxa" w:w="640"/>
-                  <w:tcBorders>
-                    <w:top w:val="single" w:color="D5D0C4" w:sz="4"/>
-                    <w:left w:val="single" w:color="D5D0C4" w:sz="4"/>
-                    <w:bottom w:val="single" w:color="D5D0C4" w:sz="4"/>
-                    <w:right w:val="single" w:color="D5D0C4" w:sz="4"/>
-                  </w:tcBorders>
-                  <w:tcMar>
-                    <w:top w:type="dxa" w:w="20"/>
-                    <w:left w:type="dxa" w:w="60"/>
-                    <w:bottom w:type="dxa" w:w="20"/>
-                    <w:right w:type="dxa" w:w="60"/>
-                  </w:tcMar>
-                  <w:vAlign w:val="center"/>
-                </w:tcPr>
-                <w:p>
-                  <w:pPr>
-                    <w:spacing w:after="20" w:before="20" w:line="240"/>
-                    <w:jc w:val="center"/>
-                  </w:pPr>
-                  <w:r>
-                    <w:rPr>
-                      <w:rFonts w:ascii="Arial" w:cs="Arial" w:eastAsia="Arial" w:hAnsi="Arial"/>
-                      <w:b w:val="false"/>
-                      <w:bCs w:val="false"/>
-                      <w:color w:val="1C1B16"/>
-                      <w:sz w:val="16"/>
-                      <w:szCs w:val="16"/>
-                    </w:rPr>
-                    <w:t xml:space="preserve">Q5</w:t>
-                  </w:r>
-                </w:p>
-              </w:tc>
-              <w:tc>
-                <w:tcPr>
-                  <w:tcW w:type="dxa" w:w="420"/>
-                  <w:tcBorders>
-                    <w:top w:val="single" w:color="D5D0C4" w:sz="4"/>
-                    <w:left w:val="single" w:color="D5D0C4" w:sz="4"/>
-                    <w:bottom w:val="single" w:color="D5D0C4" w:sz="4"/>
-                    <w:right w:val="single" w:color="D5D0C4" w:sz="4"/>
-                  </w:tcBorders>
-                  <w:tcMar>
-                    <w:top w:type="dxa" w:w="20"/>
-                    <w:left w:type="dxa" w:w="60"/>
-                    <w:bottom w:type="dxa" w:w="20"/>
-                    <w:right w:type="dxa" w:w="60"/>
-                  </w:tcMar>
-                  <w:vAlign w:val="center"/>
-                </w:tcPr>
-                <w:p>
-                  <w:pPr>
-                    <w:spacing w:after="20" w:before="20" w:line="240"/>
-                    <w:jc w:val="center"/>
-                  </w:pPr>
-                  <w:r>
-                    <w:rPr>
-                      <w:rFonts w:ascii="Arial" w:cs="Arial" w:eastAsia="Arial" w:hAnsi="Arial"/>
-                      <w:b/>
-                      <w:bCs/>
-                      <w:color w:val="B37A33"/>
-                      <w:sz w:val="16"/>
-                      <w:szCs w:val="16"/>
-                    </w:rPr>
-                    <w:t xml:space="preserve">X</w:t>
-                  </w:r>
-                </w:p>
-              </w:tc>
-              <w:tc>
-                <w:tcPr>
-                  <w:tcW w:type="dxa" w:w="420"/>
-                  <w:tcBorders>
-                    <w:top w:val="single" w:color="D5D0C4" w:sz="4"/>
-                    <w:left w:val="single" w:color="D5D0C4" w:sz="4"/>
-                    <w:bottom w:val="single" w:color="D5D0C4" w:sz="4"/>
-                    <w:right w:val="single" w:color="D5D0C4" w:sz="4"/>
-                  </w:tcBorders>
-                  <w:tcMar>
-                    <w:top w:type="dxa" w:w="20"/>
-                    <w:left w:type="dxa" w:w="60"/>
-                    <w:bottom w:type="dxa" w:w="20"/>
-                    <w:right w:type="dxa" w:w="60"/>
-                  </w:tcMar>
-                  <w:vAlign w:val="center"/>
-                </w:tcPr>
-                <w:p>
-                  <w:pPr>
-                    <w:spacing w:after="20" w:before="20" w:line="240"/>
-                    <w:jc w:val="center"/>
-                  </w:pPr>
-                  <w:r>
-                    <w:rPr>
-                      <w:rFonts w:ascii="Arial" w:cs="Arial" w:eastAsia="Arial" w:hAnsi="Arial"/>
-                      <w:b/>
-                      <w:bCs/>
-                      <w:color w:val="B37A33"/>
-                      <w:sz w:val="16"/>
-                      <w:szCs w:val="16"/>
-                    </w:rPr>
-                    <w:t xml:space="preserve"/>
                   </w:r>
                 </w:p>
               </w:tc>
@@ -24924,7 +24545,7 @@
                       <w:sz w:val="16"/>
                       <w:szCs w:val="16"/>
                     </w:rPr>
-                    <w:t xml:space="preserve"/>
+                    <w:t xml:space="preserve">X</w:t>
                   </w:r>
                 </w:p>
               </w:tc>
@@ -24959,7 +24580,7 @@
                       <w:sz w:val="16"/>
                       <w:szCs w:val="16"/>
                     </w:rPr>
-                    <w:t xml:space="preserve">X</w:t>
+                    <w:t xml:space="preserve"/>
                   </w:r>
                 </w:p>
               </w:tc>
@@ -26503,7 +26124,7 @@
                       <w:sz w:val="16"/>
                       <w:szCs w:val="16"/>
                     </w:rPr>
-                    <w:t xml:space="preserve">X</w:t>
+                    <w:t xml:space="preserve"/>
                   </w:r>
                 </w:p>
               </w:tc>
@@ -26538,7 +26159,7 @@
                       <w:sz w:val="16"/>
                       <w:szCs w:val="16"/>
                     </w:rPr>
-                    <w:t xml:space="preserve"/>
+                    <w:t xml:space="preserve">X</w:t>
                   </w:r>
                 </w:p>
               </w:tc>
@@ -27013,223 +26634,6 @@
                 </w:p>
               </w:tc>
             </w:tr>
-            <w:tr>
-              <w:trPr>
-                <w:cantSplit/>
-                <w:trHeight w:val="280" w:hRule="atLeast"/>
-              </w:trPr>
-              <w:tc>
-                <w:tcPr>
-                  <w:tcW w:type="dxa" w:w="640"/>
-                  <w:tcBorders>
-                    <w:top w:val="single" w:color="D5D0C4" w:sz="4"/>
-                    <w:left w:val="single" w:color="D5D0C4" w:sz="4"/>
-                    <w:bottom w:val="single" w:color="D5D0C4" w:sz="4"/>
-                    <w:right w:val="single" w:color="D5D0C4" w:sz="4"/>
-                  </w:tcBorders>
-                  <w:tcMar>
-                    <w:top w:type="dxa" w:w="20"/>
-                    <w:left w:type="dxa" w:w="60"/>
-                    <w:bottom w:type="dxa" w:w="20"/>
-                    <w:right w:type="dxa" w:w="60"/>
-                  </w:tcMar>
-                  <w:vAlign w:val="center"/>
-                </w:tcPr>
-                <w:p>
-                  <w:pPr>
-                    <w:spacing w:after="20" w:before="20" w:line="240"/>
-                    <w:jc w:val="center"/>
-                  </w:pPr>
-                  <w:r>
-                    <w:rPr>
-                      <w:rFonts w:ascii="Arial" w:cs="Arial" w:eastAsia="Arial" w:hAnsi="Arial"/>
-                      <w:b w:val="false"/>
-                      <w:bCs w:val="false"/>
-                      <w:color w:val="1C1B16"/>
-                      <w:sz w:val="16"/>
-                      <w:szCs w:val="16"/>
-                    </w:rPr>
-                    <w:t xml:space="preserve">Q27</w:t>
-                  </w:r>
-                </w:p>
-              </w:tc>
-              <w:tc>
-                <w:tcPr>
-                  <w:tcW w:type="dxa" w:w="420"/>
-                  <w:tcBorders>
-                    <w:top w:val="single" w:color="D5D0C4" w:sz="4"/>
-                    <w:left w:val="single" w:color="D5D0C4" w:sz="4"/>
-                    <w:bottom w:val="single" w:color="D5D0C4" w:sz="4"/>
-                    <w:right w:val="single" w:color="D5D0C4" w:sz="4"/>
-                  </w:tcBorders>
-                  <w:tcMar>
-                    <w:top w:type="dxa" w:w="20"/>
-                    <w:left w:type="dxa" w:w="60"/>
-                    <w:bottom w:type="dxa" w:w="20"/>
-                    <w:right w:type="dxa" w:w="60"/>
-                  </w:tcMar>
-                  <w:vAlign w:val="center"/>
-                </w:tcPr>
-                <w:p>
-                  <w:pPr>
-                    <w:spacing w:after="20" w:before="20" w:line="240"/>
-                    <w:jc w:val="center"/>
-                  </w:pPr>
-                  <w:r>
-                    <w:rPr>
-                      <w:rFonts w:ascii="Arial" w:cs="Arial" w:eastAsia="Arial" w:hAnsi="Arial"/>
-                      <w:b/>
-                      <w:bCs/>
-                      <w:color w:val="B37A33"/>
-                      <w:sz w:val="16"/>
-                      <w:szCs w:val="16"/>
-                    </w:rPr>
-                    <w:t xml:space="preserve"/>
-                  </w:r>
-                </w:p>
-              </w:tc>
-              <w:tc>
-                <w:tcPr>
-                  <w:tcW w:type="dxa" w:w="420"/>
-                  <w:tcBorders>
-                    <w:top w:val="single" w:color="D5D0C4" w:sz="4"/>
-                    <w:left w:val="single" w:color="D5D0C4" w:sz="4"/>
-                    <w:bottom w:val="single" w:color="D5D0C4" w:sz="4"/>
-                    <w:right w:val="single" w:color="D5D0C4" w:sz="4"/>
-                  </w:tcBorders>
-                  <w:tcMar>
-                    <w:top w:type="dxa" w:w="20"/>
-                    <w:left w:type="dxa" w:w="60"/>
-                    <w:bottom w:type="dxa" w:w="20"/>
-                    <w:right w:type="dxa" w:w="60"/>
-                  </w:tcMar>
-                  <w:vAlign w:val="center"/>
-                </w:tcPr>
-                <w:p>
-                  <w:pPr>
-                    <w:spacing w:after="20" w:before="20" w:line="240"/>
-                    <w:jc w:val="center"/>
-                  </w:pPr>
-                  <w:r>
-                    <w:rPr>
-                      <w:rFonts w:ascii="Arial" w:cs="Arial" w:eastAsia="Arial" w:hAnsi="Arial"/>
-                      <w:b/>
-                      <w:bCs/>
-                      <w:color w:val="B37A33"/>
-                      <w:sz w:val="16"/>
-                      <w:szCs w:val="16"/>
-                    </w:rPr>
-                    <w:t xml:space="preserve"/>
-                  </w:r>
-                </w:p>
-              </w:tc>
-              <w:tc>
-                <w:tcPr>
-                  <w:tcW w:type="dxa" w:w="420"/>
-                  <w:tcBorders>
-                    <w:top w:val="single" w:color="D5D0C4" w:sz="4"/>
-                    <w:left w:val="single" w:color="D5D0C4" w:sz="4"/>
-                    <w:bottom w:val="single" w:color="D5D0C4" w:sz="4"/>
-                    <w:right w:val="single" w:color="D5D0C4" w:sz="4"/>
-                  </w:tcBorders>
-                  <w:tcMar>
-                    <w:top w:type="dxa" w:w="20"/>
-                    <w:left w:type="dxa" w:w="60"/>
-                    <w:bottom w:type="dxa" w:w="20"/>
-                    <w:right w:type="dxa" w:w="60"/>
-                  </w:tcMar>
-                  <w:vAlign w:val="center"/>
-                </w:tcPr>
-                <w:p>
-                  <w:pPr>
-                    <w:spacing w:after="20" w:before="20" w:line="240"/>
-                    <w:jc w:val="center"/>
-                  </w:pPr>
-                  <w:r>
-                    <w:rPr>
-                      <w:rFonts w:ascii="Arial" w:cs="Arial" w:eastAsia="Arial" w:hAnsi="Arial"/>
-                      <w:b/>
-                      <w:bCs/>
-                      <w:color w:val="B37A33"/>
-                      <w:sz w:val="16"/>
-                      <w:szCs w:val="16"/>
-                    </w:rPr>
-                    <w:t xml:space="preserve"/>
-                  </w:r>
-                </w:p>
-              </w:tc>
-              <w:tc>
-                <w:tcPr>
-                  <w:tcW w:type="dxa" w:w="420"/>
-                  <w:tcBorders>
-                    <w:top w:val="single" w:color="D5D0C4" w:sz="4"/>
-                    <w:left w:val="single" w:color="D5D0C4" w:sz="4"/>
-                    <w:bottom w:val="single" w:color="D5D0C4" w:sz="4"/>
-                    <w:right w:val="single" w:color="D5D0C4" w:sz="4"/>
-                  </w:tcBorders>
-                  <w:tcMar>
-                    <w:top w:type="dxa" w:w="20"/>
-                    <w:left w:type="dxa" w:w="60"/>
-                    <w:bottom w:type="dxa" w:w="20"/>
-                    <w:right w:type="dxa" w:w="60"/>
-                  </w:tcMar>
-                  <w:vAlign w:val="center"/>
-                </w:tcPr>
-                <w:p>
-                  <w:pPr>
-                    <w:spacing w:after="20" w:before="20" w:line="240"/>
-                    <w:jc w:val="center"/>
-                  </w:pPr>
-                  <w:r>
-                    <w:rPr>
-                      <w:rFonts w:ascii="Arial" w:cs="Arial" w:eastAsia="Arial" w:hAnsi="Arial"/>
-                      <w:b/>
-                      <w:bCs/>
-                      <w:color w:val="B37A33"/>
-                      <w:sz w:val="16"/>
-                      <w:szCs w:val="16"/>
-                    </w:rPr>
-                    <w:t xml:space="preserve">X</w:t>
-                  </w:r>
-                </w:p>
-              </w:tc>
-              <w:tc>
-                <w:tcPr>
-                  <w:tcW w:type="dxa" w:w="420"/>
-                  <w:tcBorders>
-                    <w:top w:val="single" w:color="D5D0C4" w:sz="4"/>
-                    <w:left w:val="single" w:color="D5D0C4" w:sz="4"/>
-                    <w:bottom w:val="single" w:color="D5D0C4" w:sz="4"/>
-                    <w:right w:val="single" w:color="D5D0C4" w:sz="4"/>
-                  </w:tcBorders>
-                  <w:shd w:fill="D5D0C4" w:color="auto" w:val="clear"/>
-                  <w:tcMar>
-                    <w:top w:type="dxa" w:w="20"/>
-                    <w:left w:type="dxa" w:w="60"/>
-                    <w:bottom w:type="dxa" w:w="20"/>
-                    <w:right w:type="dxa" w:w="60"/>
-                  </w:tcMar>
-                  <w:vAlign w:val="center"/>
-                </w:tcPr>
-                <w:p>
-                  <w:pPr>
-                    <w:spacing w:after="20" w:before="20" w:line="240"/>
-                    <w:jc w:val="center"/>
-                  </w:pPr>
-                  <w:r>
-                    <w:rPr>
-                      <w:rFonts w:ascii="Arial" w:cs="Arial" w:eastAsia="Arial" w:hAnsi="Arial"/>
-                      <w:b/>
-                      <w:bCs/>
-                      <w:color w:val="B37A33"/>
-                      <w:sz w:val="16"/>
-                      <w:szCs w:val="16"/>
-                    </w:rPr>
-                    <w:t xml:space="preserve"/>
-                  </w:r>
-                </w:p>
-              </w:tc>
-            </w:tr>
           </w:tbl>
           <w:p>
             <w:pPr>
@@ -27579,7 +26983,7 @@
                       <w:sz w:val="16"/>
                       <w:szCs w:val="16"/>
                     </w:rPr>
-                    <w:t xml:space="preserve">X</w:t>
+                    <w:t xml:space="preserve"/>
                   </w:r>
                 </w:p>
               </w:tc>
@@ -27614,7 +27018,7 @@
                       <w:sz w:val="16"/>
                       <w:szCs w:val="16"/>
                     </w:rPr>
-                    <w:t xml:space="preserve"/>
+                    <w:t xml:space="preserve">X</w:t>
                   </w:r>
                 </w:p>
               </w:tc>
@@ -28230,7 +27634,7 @@
                       <w:sz w:val="16"/>
                       <w:szCs w:val="16"/>
                     </w:rPr>
-                    <w:t xml:space="preserve"/>
+                    <w:t xml:space="preserve">X</w:t>
                   </w:r>
                 </w:p>
               </w:tc>
@@ -28265,7 +27669,7 @@
                       <w:sz w:val="16"/>
                       <w:szCs w:val="16"/>
                     </w:rPr>
-                    <w:t xml:space="preserve">X</w:t>
+                    <w:t xml:space="preserve"/>
                   </w:r>
                 </w:p>
               </w:tc>
@@ -29270,6 +28674,117 @@
                       <w:sz w:val="16"/>
                       <w:szCs w:val="16"/>
                     </w:rPr>
+                    <w:t xml:space="preserve">Q1</w:t>
+                  </w:r>
+                </w:p>
+              </w:tc>
+              <w:tc>
+                <w:tcPr>
+                  <w:tcW w:type="dxa" w:w="1250"/>
+                  <w:tcBorders>
+                    <w:top w:val="single" w:color="D5D0C4" w:sz="4"/>
+                    <w:left w:val="single" w:color="D5D0C4" w:sz="4"/>
+                    <w:bottom w:val="single" w:color="D5D0C4" w:sz="4"/>
+                    <w:right w:val="single" w:color="D5D0C4" w:sz="4"/>
+                  </w:tcBorders>
+                  <w:tcMar>
+                    <w:top w:type="dxa" w:w="20"/>
+                    <w:left w:type="dxa" w:w="60"/>
+                    <w:bottom w:type="dxa" w:w="20"/>
+                    <w:right w:type="dxa" w:w="60"/>
+                  </w:tcMar>
+                  <w:vAlign w:val="center"/>
+                </w:tcPr>
+                <w:p>
+                  <w:pPr>
+                    <w:spacing w:after="20" w:before="20" w:line="240"/>
+                    <w:jc w:val="center"/>
+                  </w:pPr>
+                  <w:r>
+                    <w:rPr>
+                      <w:rFonts w:ascii="Arial" w:cs="Arial" w:eastAsia="Arial" w:hAnsi="Arial"/>
+                      <w:b w:val="false"/>
+                      <w:bCs w:val="false"/>
+                      <w:color w:val="6B675E"/>
+                      <w:sz w:val="14"/>
+                      <w:szCs w:val="14"/>
+                    </w:rPr>
+                    <w:t xml:space="preserve">Final answer</w:t>
+                  </w:r>
+                </w:p>
+              </w:tc>
+              <w:tc>
+                <w:tcPr>
+                  <w:tcW w:type="dxa" w:w="2860"/>
+                  <w:tcBorders>
+                    <w:top w:val="single" w:color="D5D0C4" w:sz="4"/>
+                    <w:left w:val="single" w:color="D5D0C4" w:sz="4"/>
+                    <w:bottom w:val="single" w:color="D5D0C4" w:sz="4"/>
+                    <w:right w:val="single" w:color="D5D0C4" w:sz="4"/>
+                  </w:tcBorders>
+                  <w:tcMar>
+                    <w:top w:type="dxa" w:w="20"/>
+                    <w:left w:type="dxa" w:w="60"/>
+                    <w:bottom w:type="dxa" w:w="20"/>
+                    <w:right w:type="dxa" w:w="60"/>
+                  </w:tcMar>
+                  <w:vAlign w:val="center"/>
+                </w:tcPr>
+                <w:p>
+                  <w:pPr>
+                    <w:spacing w:after="20" w:before="20" w:line="240"/>
+                    <w:jc w:val="left"/>
+                  </w:pPr>
+                  <w:r>
+                    <w:rPr>
+                      <w:rFonts w:ascii="Arial" w:cs="Arial" w:eastAsia="Arial" w:hAnsi="Arial"/>
+                      <w:b/>
+                      <w:bCs/>
+                      <w:color w:val="B37A33"/>
+                      <w:sz w:val="16"/>
+                      <w:szCs w:val="16"/>
+                    </w:rPr>
+                    <w:t xml:space="preserve">It prints 2 and 1. The true figures are 2.36 and 1.84, a fall of about 22 percent.</w:t>
+                  </w:r>
+                </w:p>
+              </w:tc>
+            </w:tr>
+            <w:tr>
+              <w:trPr>
+                <w:cantSplit/>
+                <w:trHeight w:val="380" w:hRule="atLeast"/>
+              </w:trPr>
+              <w:tc>
+                <w:tcPr>
+                  <w:tcW w:type="dxa" w:w="640"/>
+                  <w:tcBorders>
+                    <w:top w:val="single" w:color="D5D0C4" w:sz="4"/>
+                    <w:left w:val="single" w:color="D5D0C4" w:sz="4"/>
+                    <w:bottom w:val="single" w:color="D5D0C4" w:sz="4"/>
+                    <w:right w:val="single" w:color="D5D0C4" w:sz="4"/>
+                  </w:tcBorders>
+                  <w:tcMar>
+                    <w:top w:type="dxa" w:w="20"/>
+                    <w:left w:type="dxa" w:w="60"/>
+                    <w:bottom w:type="dxa" w:w="20"/>
+                    <w:right w:type="dxa" w:w="60"/>
+                  </w:tcMar>
+                  <w:vAlign w:val="center"/>
+                </w:tcPr>
+                <w:p>
+                  <w:pPr>
+                    <w:spacing w:after="20" w:before="20" w:line="240"/>
+                    <w:jc w:val="center"/>
+                  </w:pPr>
+                  <w:r>
+                    <w:rPr>
+                      <w:rFonts w:ascii="Arial" w:cs="Arial" w:eastAsia="Arial" w:hAnsi="Arial"/>
+                      <w:b w:val="false"/>
+                      <w:bCs w:val="false"/>
+                      <w:color w:val="1C1B16"/>
+                      <w:sz w:val="16"/>
+                      <w:szCs w:val="16"/>
+                    </w:rPr>
                     <w:t xml:space="preserve">Q2</w:t>
                   </w:r>
                 </w:p>
@@ -29673,7 +29188,7 @@
                       <w:sz w:val="16"/>
                       <w:szCs w:val="16"/>
                     </w:rPr>
-                    <w:t xml:space="preserve">C, E, A, D, B</w:t>
+                    <w:t xml:space="preserve">E, F, B, C, A</w:t>
                   </w:r>
                 </w:p>
               </w:tc>
@@ -30436,6 +29951,117 @@
                       <w:sz w:val="16"/>
                       <w:szCs w:val="16"/>
                     </w:rPr>
+                    <w:t xml:space="preserve">Q27</w:t>
+                  </w:r>
+                </w:p>
+              </w:tc>
+              <w:tc>
+                <w:tcPr>
+                  <w:tcW w:type="dxa" w:w="1250"/>
+                  <w:tcBorders>
+                    <w:top w:val="single" w:color="D5D0C4" w:sz="4"/>
+                    <w:left w:val="single" w:color="D5D0C4" w:sz="4"/>
+                    <w:bottom w:val="single" w:color="D5D0C4" w:sz="4"/>
+                    <w:right w:val="single" w:color="D5D0C4" w:sz="4"/>
+                  </w:tcBorders>
+                  <w:tcMar>
+                    <w:top w:type="dxa" w:w="20"/>
+                    <w:left w:type="dxa" w:w="60"/>
+                    <w:bottom w:type="dxa" w:w="20"/>
+                    <w:right w:type="dxa" w:w="60"/>
+                  </w:tcMar>
+                  <w:vAlign w:val="center"/>
+                </w:tcPr>
+                <w:p>
+                  <w:pPr>
+                    <w:spacing w:after="20" w:before="20" w:line="240"/>
+                    <w:jc w:val="center"/>
+                  </w:pPr>
+                  <w:r>
+                    <w:rPr>
+                      <w:rFonts w:ascii="Arial" w:cs="Arial" w:eastAsia="Arial" w:hAnsi="Arial"/>
+                      <w:b w:val="false"/>
+                      <w:bCs w:val="false"/>
+                      <w:color w:val="6B675E"/>
+                      <w:sz w:val="14"/>
+                      <w:szCs w:val="14"/>
+                    </w:rPr>
+                    <w:t xml:space="preserve">Final answer</w:t>
+                  </w:r>
+                </w:p>
+              </w:tc>
+              <w:tc>
+                <w:tcPr>
+                  <w:tcW w:type="dxa" w:w="2860"/>
+                  <w:tcBorders>
+                    <w:top w:val="single" w:color="D5D0C4" w:sz="4"/>
+                    <w:left w:val="single" w:color="D5D0C4" w:sz="4"/>
+                    <w:bottom w:val="single" w:color="D5D0C4" w:sz="4"/>
+                    <w:right w:val="single" w:color="D5D0C4" w:sz="4"/>
+                  </w:tcBorders>
+                  <w:tcMar>
+                    <w:top w:type="dxa" w:w="20"/>
+                    <w:left w:type="dxa" w:w="60"/>
+                    <w:bottom w:type="dxa" w:w="20"/>
+                    <w:right w:type="dxa" w:w="60"/>
+                  </w:tcMar>
+                  <w:vAlign w:val="center"/>
+                </w:tcPr>
+                <w:p>
+                  <w:pPr>
+                    <w:spacing w:after="20" w:before="20" w:line="240"/>
+                    <w:jc w:val="left"/>
+                  </w:pPr>
+                  <w:r>
+                    <w:rPr>
+                      <w:rFonts w:ascii="Arial" w:cs="Arial" w:eastAsia="Arial" w:hAnsi="Arial"/>
+                      <w:b/>
+                      <w:bCs/>
+                      <w:color w:val="B37A33"/>
+                      <w:sz w:val="16"/>
+                      <w:szCs w:val="16"/>
+                    </w:rPr>
+                    <w:t xml:space="preserve">B8 returns -0.5; the six rows average 1.0; the formula understates growth by 1.5 points and turns growth into a fall.</w:t>
+                  </w:r>
+                </w:p>
+              </w:tc>
+            </w:tr>
+            <w:tr>
+              <w:trPr>
+                <w:cantSplit/>
+                <w:trHeight w:val="380" w:hRule="atLeast"/>
+              </w:trPr>
+              <w:tc>
+                <w:tcPr>
+                  <w:tcW w:type="dxa" w:w="640"/>
+                  <w:tcBorders>
+                    <w:top w:val="single" w:color="D5D0C4" w:sz="4"/>
+                    <w:left w:val="single" w:color="D5D0C4" w:sz="4"/>
+                    <w:bottom w:val="single" w:color="D5D0C4" w:sz="4"/>
+                    <w:right w:val="single" w:color="D5D0C4" w:sz="4"/>
+                  </w:tcBorders>
+                  <w:tcMar>
+                    <w:top w:type="dxa" w:w="20"/>
+                    <w:left w:type="dxa" w:w="60"/>
+                    <w:bottom w:type="dxa" w:w="20"/>
+                    <w:right w:type="dxa" w:w="60"/>
+                  </w:tcMar>
+                  <w:vAlign w:val="center"/>
+                </w:tcPr>
+                <w:p>
+                  <w:pPr>
+                    <w:spacing w:after="20" w:before="20" w:line="240"/>
+                    <w:jc w:val="center"/>
+                  </w:pPr>
+                  <w:r>
+                    <w:rPr>
+                      <w:rFonts w:ascii="Arial" w:cs="Arial" w:eastAsia="Arial" w:hAnsi="Arial"/>
+                      <w:b w:val="false"/>
+                      <w:bCs w:val="false"/>
+                      <w:color w:val="1C1B16"/>
+                      <w:sz w:val="16"/>
+                      <w:szCs w:val="16"/>
+                    </w:rPr>
                     <w:t xml:space="preserve">Q29</w:t>
                   </w:r>
                 </w:p>
@@ -30506,7 +30132,7 @@
                       <w:sz w:val="16"/>
                       <w:szCs w:val="16"/>
                     </w:rPr>
-                    <w:t xml:space="preserve">0.60 dollars a trip</w:t>
+                    <w:t xml:space="preserve">2.00 dollars, about 8.5 percent of the 23.50 dollars charged</w:t>
                   </w:r>
                 </w:p>
               </w:tc>

</xml_diff>

<commit_message>
W02 Saturday: the review's fixes to items and parts, rebuilt with the key proofs
Q32's stem routes every call whose total is over 1,000, so the first call
routed has one reading. Q12's options a and d both say 51, so the count no
longer finds the key. Q28's MergeError option no longer says the labels
repeat. Part 4 and Part 5 are renamed by the question each asks, Part 5's
opening names its three public cases as numbers people relied on and
Friday's protect list, and Part 6 opens on a drawing of who acts on which
table. Set 1 states that every paid order was paid in full and Q10 that
no order was paid short, which the proofs check on the warehouse. The
key's reasons lose their run tails and cite Friday for JPMorgan; Q14's
option d divides by the average, so no key is a lone length outlier.
No key moved; the proofs pass 33 of 33.

Co-Authored-By: Claude Opus 5.5 <noreply@anthropic.com>
Claude-Session: https://claude.ai/code/session_01Q6BoMrCz4psj5e3WRTrZh9
</commit_message>
<xml_diff>
--- a/content/W02/SAT/answer-key/C2_W02_SAT_answer_key_TRAINER.docx
+++ b/content/W02/SAT/answer-key/C2_W02_SAT_answer_key_TRAINER.docx
@@ -1454,7 +1454,7 @@
                 <w:sz w:val="18"/>
                 <w:szCs w:val="18"/>
               </w:rPr>
-              <w:t xml:space="preserve">Can the growth team act on Monday's table of 340 customers without checking it first?</w:t>
+              <w:t xml:space="preserve">What must Monday's customer table check before the growth team acts on it?</w:t>
             </w:r>
           </w:p>
         </w:tc>
@@ -1745,7 +1745,7 @@
                 <w:sz w:val="18"/>
                 <w:szCs w:val="18"/>
               </w:rPr>
-              <w:t xml:space="preserve">Which spreadsheet numbers can a director trust, in Monday's workbook and in three public cases?</w:t>
+              <w:t xml:space="preserve">Which numbers in Monday's workbook can a director trust, and where did three public cases go wrong?</w:t>
             </w:r>
           </w:p>
         </w:tc>
@@ -1817,7 +1817,7 @@
                 <w:sz w:val="18"/>
                 <w:szCs w:val="18"/>
               </w:rPr>
-              <w:t xml:space="preserve">whether you can build the workbook a director changes in the room and catch a spreadsheet's silent errors</w:t>
+              <w:t xml:space="preserve">whether you can build the workbook a director changes in the room and catch a wrong range, formula or base in a number</w:t>
             </w:r>
           </w:p>
         </w:tc>
@@ -12673,7 +12673,7 @@
                 <w:sz w:val="21"/>
                 <w:szCs w:val="21"/>
               </w:rPr>
-              <w:t xml:space="preserve">count(*) and count(DISTINCT customer_id) are both whole numbers, so Postgres divides them as integers and drops the fraction: 215 / 91 prints 2 for April to June, and 140 / 76 prints 1 for July to September. Orders per member were 2.36 and 1.84, and 1.84 against 2.36 is a fall of 22.0 percent; accept 21 to 22 percent, or about a fifth. A note that quotes the printed 2 and 1 says orders per member halved, which is Monday's chapter 3 trap. The fix is count(*)::numeric, and the check is to multiply back: 1 times 76 members is 76, where the orders are 140. Run on PostgreSQL 16.14 on the week's warehouse on 1 October 2026.</w:t>
+              <w:t xml:space="preserve">count(*) and count(DISTINCT customer_id) are both whole numbers, so Postgres divides them as integers and drops the fraction: 215 / 91 prints 2 for April to June, and 140 / 76 prints 1 for July to September. Orders per member were 2.36 and 1.84, and 1.84 against 2.36 is a fall of 22.0 percent. Accept 21 to 22 percent, about a fifth, or the fall from 2.36 to 1.84 given without a percentage, since each says what orders per member did. A note that quotes the printed 2 and 1 says orders per member halved, which is Monday's chapter 3 trap, and earns no tick. The fix is count(*)::numeric, and the check is to multiply back: 1 times 76 members is 76, where the orders are 140.</w:t>
             </w:r>
           </w:p>
           <w:p>
@@ -12847,7 +12847,7 @@
                 <w:sz w:val="21"/>
                 <w:szCs w:val="21"/>
               </w:rPr>
-              <w:t xml:space="preserve">LIMIT without ORDER BY returns some rows, never defined ones, so I order on a unique key before I limit.</w:t>
+              <w:t xml:space="preserve">LIMIT without ORDER BY returns whichever rows the database reaches first, so I order on a unique key before I limit.</w:t>
             </w:r>
           </w:p>
           <w:p>
@@ -13117,7 +13117,7 @@
                 <w:sz w:val="21"/>
                 <w:szCs w:val="21"/>
               </w:rPr>
-              <w:t xml:space="preserve">A member with no order in the quarter keeps one row from the LEFT JOIN, with NULL in every order column, so sum(o.amount) returns NULL for 44 of the 120 members. avg skips NULLs, so it divides Rs 4,13,380 by the 76 members who ordered and prints 5439. The head asked for the average over all 120 on the books, Rs 3,445, which needs coalesce(sum(o.amount), 0) in the member step. Monday's chapter 4 met the same skip from a CASE with no ELSE, and Kavya's rule from it is that an average names who is inside it. Run on PostgreSQL 16.14 on the week's warehouse on 1 October 2026.</w:t>
+              <w:t xml:space="preserve">A member with no order in the quarter keeps one row from the LEFT JOIN, with NULL in every order column, so sum(o.amount) returns NULL for 44 of the 120 members. avg skips NULLs, so it divides Rs 4,13,380 by the 76 members who ordered and prints 5439. The head asked for the average over all 120 on the books, Rs 3,445, which needs coalesce(sum(o.amount), 0) in the member step. Monday's chapter 4 met the same skip from a CASE with no ELSE, and Kavya's rule from it is that an average names who is inside it.</w:t>
             </w:r>
           </w:p>
           <w:p>
@@ -13373,7 +13373,7 @@
                 <w:sz w:val="20"/>
                 <w:szCs w:val="20"/>
               </w:rPr>
-              <w:t xml:space="preserve">This stretches the rule past its words. It covers the figures Anand files each Monday, and a suite that holds every exploratory chart stops being a list an analyst can audit.</w:t>
+              <w:t xml:space="preserve">Option b stretches the rule past its words. It covers the figures Anand files each Monday, and a suite that holds every exploratory chart stops being a list an analyst can audit.</w:t>
             </w:r>
           </w:p>
           <w:p>
@@ -13575,7 +13575,7 @@
                 <w:sz w:val="21"/>
                 <w:szCs w:val="21"/>
               </w:rPr>
-              <w:t xml:space="preserve">The CASE has no ELSE, so it returns NULL for the two viewers under three seconds, and count skips NULLs: the calculated average divides all 30 seconds by 3 people, 10.0, where the defined one divides by all 5 who played, 6.0. Against the defined figure, 10.0 overstates 6.0 by 4.0 over 6.0, about 67 percent. TechCrunch (Devin Coldewey, 22 September 2016) quoted Facebook's definition and its calculation, put the inflation at 60 to 80 percent over two years and reported that billing was not affected; checked on 30 September 2026. Run on PostgreSQL 16.14 on 1 October 2026.</w:t>
+              <w:t xml:space="preserve">The CASE has no ELSE, so it returns NULL for the two viewers under three seconds, and count skips NULLs: the calculated average divides all 30 seconds by 3 people, 10.0, where the defined one divides by all 5 who played, 6.0. Against the defined figure, 10.0 overstates 6.0 by 4.0 over 6.0, about 67 percent. TechCrunch (Devin Coldewey, 22 September 2016, read on 30 September 2026) quoted Facebook's definition and its calculation, put the inflation at 60 to 80 percent over two years and reported that billing was not affected.</w:t>
             </w:r>
           </w:p>
           <w:p>
@@ -13804,7 +13804,7 @@
                 <w:sz w:val="21"/>
                 <w:szCs w:val="21"/>
               </w:rPr>
-              <w:t xml:space="preserve">A LEFT JOIN writes one row per matching payment row and keeps an order with none as one row of NULLs: 216 + 2 times 188 + 2 times 28 + 30 = 678 rows. count(p.payment_id) skips the 30 unpaid orders' NULLs where count(*) counts them, so it reads 678 minus 30 = 648, which is also what an INNER JOIN would return. The gateway's retried rows join twice like any other rows, and the eight payments with no order never meet an order. On Tuesday the same 678 rows, each carrying its order's booked amount, summed to Rs 19,29,04,410 of collected against Rs 9,84,00,000 booked, chapter 2's fan-out. Run on PostgreSQL 16.14 on the week's warehouse on 1 October 2026.</w:t>
+              <w:t xml:space="preserve">A LEFT JOIN writes one row per matching payment row and keeps an order with none as one row of NULLs: 216 + 2 times 188 + 2 times 28 + 30 = 678 rows. count(p.payment_id) skips the 30 unpaid orders' NULLs where count(*) counts them, so it reads 678 minus 30 = 648, which is also what an INNER JOIN would return. The gateway's retried rows join twice like any other rows, and the eight payments with no order never meet an order. On Tuesday the same 678 rows, each carrying its order's booked amount, summed to Rs 19,29,04,410 of collected against Rs 9,84,00,000 booked, chapter 2's fan-out.</w:t>
             </w:r>
           </w:p>
           <w:p>
@@ -14033,7 +14033,7 @@
                 <w:sz w:val="21"/>
                 <w:szCs w:val="21"/>
               </w:rPr>
-              <w:t xml:space="preserve">The step to leave out is d: 188 of the orders with two payment rows are instalments 1 and 2 of one invoice, and dropping them throws away real cash along with the 28 retries. On the same book, HAVING count(*) &gt; 1 by order lists 216 orders, Tuesday's chapter 4 trap, and grouping by order and instalment lists the 28 retries. The retries go first (e), because a sum taken before them keeps the Rs 20,750 the gateway posted twice, which is posted and never collected. The payment rows then go to one collected figure per order (f), which is what the join (b) reads, so the result keeps one row per order. The checks (c) come before anything is sent (a), and on Kalpa's book they read 462 rows and a gap of Rs 17,54,930, the unpaid orders' booked value exactly. Run on PostgreSQL 16.14 on the week's warehouse on 1 October 2026.</w:t>
+              <w:t xml:space="preserve">The step to leave out is d: 188 of the orders with two payment rows are instalments 1 and 2 of one invoice, and dropping them throws away real cash along with the 28 retries. On the same book, HAVING count(*) &gt; 1 by order lists 216 orders, the 188 instalment orders and the 28 retries together, which is Tuesday's chapter 4 trap, and grouping by order and instalment lists the 28 retries alone. The retries go first (e), because a sum taken before them keeps the Rs 20,750 the gateway posted twice, which is posted and never collected. The payment rows then go to one collected figure per order (f), which is what the join (b) reads, so the result keeps one row per order. The checks (c) come before anything is sent (a), and on Kalpa's book they read 462 rows and a gap of Rs 17,54,930, the unpaid orders' booked value exactly.</w:t>
             </w:r>
           </w:p>
           <w:p>
@@ -14181,7 +14181,7 @@
                 <w:sz w:val="21"/>
                 <w:szCs w:val="21"/>
               </w:rPr>
-              <w:t xml:space="preserve">O-1's two instalments both fall inside the quarter, so the join gives O-1 two rows and sum(o.amount) counts its Rs 1,200 twice. O-2's only payment is dated 1 October, so its joined row fails the WHERE. O-3 has no payment, so its paid_date is NULL, BETWEEN on a NULL is unknown, and WHERE drops that row too. Two rows remain, booked Rs 2,400, against three orders worth Rs 2,500: the report lost two orders and doubled the one it kept. Run on PostgreSQL 16.14 on 1 October 2026.</w:t>
+              <w:t xml:space="preserve">O-1's two instalments both fall inside the quarter, so the join gives O-1 two rows and sum(o.amount) counts its Rs 1,200 twice. O-2's only payment is dated 1 October, so its joined row fails the WHERE. O-3 has no payment, so its paid_date is NULL, BETWEEN on a NULL is unknown, and WHERE drops that row too. Two rows remain, booked Rs 2,400, against three orders worth Rs 2,500: the report lost two orders and doubled the one it kept.</w:t>
             </w:r>
           </w:p>
           <w:p>
@@ -14288,7 +14288,7 @@
                 <w:sz w:val="21"/>
                 <w:szCs w:val="21"/>
               </w:rPr>
-              <w:t xml:space="preserve">A filter on the right-hand table of a LEFT JOIN belongs in ON, because WHERE runs after the join, drops the NULL rows and turns the LEFT JOIN back into an INNER one; and the payments go to one row per order before the join.</w:t>
+              <w:t xml:space="preserve">A filter on the right-hand table of a LEFT JOIN belongs in ON, because WHERE runs after the join, drops the NULL rows and turns the LEFT JOIN into an INNER one; and the payments go to one row per order before the join.</w:t>
             </w:r>
           </w:p>
           <w:p>
@@ -14639,7 +14639,7 @@
                 <w:sz w:val="21"/>
                 <w:szCs w:val="21"/>
               </w:rPr>
-              <w:t xml:space="preserve">Lab B's file lost 5,365 rows in the conversion, 70,900 in the CSV against 65,535 in the sheet. Comparing rows loaded with the rows in the lab's own CSV sees the loss, and a sheet at exactly 65,535 data rows sits at the format's limit, which a check can treat as a stop. Rows loaded and rows in the sheet were both counted after the cut, so they agree, and Lab B loaded more rows than the day before, 65,535 against 61,020, so neither of those checks fires. Tuesday's chapter 3 met the same case: the loss sat in rows that never loaded, which only a count of rows sent against rows loaded, taken back to the first count in the chain, measures. The facts are from the GOV.UK statement of 4 October 2020 (15,841 cases between 25 September and 2 October; files that exceeded the maximum file size) and The Register of 5 October 2020 (lab CSV files stored in the older .xls format, 65,536 rows a sheet, records past the limit left off and not counted), both checked on 30 September 2026; the three labs' counts are illustrative.</w:t>
+              <w:t xml:space="preserve">Lab B's file lost 5,365 rows in the conversion, 70,900 in the CSV against 65,535 in the sheet. Comparing rows loaded with the rows in the lab's own CSV sees the loss, and a sheet at exactly 65,535 data rows sits at the format's limit, which a check can treat as a stop. Rows loaded and rows in the sheet were both counted after the cut, so they agree, and Lab B loaded more rows than the day before, 65,535 against 61,020, so neither of those checks fires. Tuesday's chapter 3 met the same case: the loss sat in rows that never loaded, which a count of rows sent against rows loaded, taken back to the first count in the chain, measures. The facts are from the GOV.UK statement of 4 October 2020 (15,841 cases between 25 September and 2 October; files that exceeded the maximum file size) and The Register of 5 October 2020 (lab CSV files stored in the older .xls format, 65,536 rows a sheet, records past the limit left off and not counted), both read on 30 September 2026, and the three labs' counts are illustrative.</w:t>
             </w:r>
           </w:p>
           <w:p>
@@ -14868,7 +14868,7 @@
                 <w:sz w:val="21"/>
                 <w:szCs w:val="21"/>
               </w:rPr>
-              <w:t xml:space="preserve">RANK gives C-0185 and C-0242 the shared rank 50 and C-0259 rank 52, so 51 members hold a rank of 50 or better, and they are exactly the members who spent at least Rs 3,350, the fiftieth member's spend. DENSE_RANK leaves no gaps, so the tie at 48 (C-0189 and C-0206) lifts C-0185 and C-0242 to dense rank 49 and C-0259, on Rs 3,200, to 50: 52 members, one of whom spent less than the fiftieth. ROW_NUMBER numbers every row once and drops C-0242, who spent as much as the fiftieth. RANK's 51 is the count each learner ran for the head's list in Wednesday's chapter 3, and the note to Marketing gives the rule, the count and the members at the line, the last place the list keeps, in one sentence. Run on PostgreSQL 16.14 on the week's warehouse on 1 October 2026.</w:t>
+              <w:t xml:space="preserve">RANK gives C-0185 and C-0242 the shared rank 50 and C-0259 rank 52, so 51 members hold a rank of 50 or better, and they are exactly the members who spent at least Rs 3,350, the fiftieth member's spend. DENSE_RANK leaves no gaps, so the tie at 48 (C-0189 and C-0206) lifts C-0185 and C-0242 to dense rank 49 and C-0259, on Rs 3,200, to 50, and its cut at 50 keeps 52 members, one of whom spent less than the fiftieth. ROW_NUMBER numbers every row once and drops C-0242, who spent as much as the fiftieth. RANK's 51 is the count each learner ran for the head's list in Wednesday's chapter 3, and the note to Marketing gives the rule, the count and the members at the line, the last place the list keeps, in one sentence.</w:t>
             </w:r>
           </w:p>
           <w:p>
@@ -14895,7 +14895,7 @@
                 <w:sz w:val="20"/>
                 <w:szCs w:val="20"/>
               </w:rPr>
-              <w:t xml:space="preserve">DENSE_RANK shares ranks and then keeps C-0259, who spent Rs 3,200, less than both members at the fiftieth place. It is the trap of Wednesday's chapter 3, where DENSE_RANK sent 52 Retail-Core members as the top fifty, two of whom tied with nobody.</w:t>
+              <w:t xml:space="preserve">DENSE_RANK shares ranks and then keeps C-0259, who spent Rs 3,200, less than both members at the fiftieth place, so its cut holds 52 members and the count of 51 belongs to RANK alone. It is the trap of Wednesday's chapter 3, where DENSE_RANK sent 52 Retail-Core members as the top fifty, two of whom tied with nobody.</w:t>
             </w:r>
           </w:p>
           <w:p>
@@ -15097,7 +15097,7 @@
                 <w:sz w:val="21"/>
                 <w:szCs w:val="21"/>
               </w:rPr>
-              <w:t xml:space="preserve">A rank computed within PARTITION BY segment keeps every customer and starts again in each segment, and the outer query keeps the rows ranked three or better. The filter has to sit outside the window, because WHERE runs before any window is computed. The list in the stem is Wednesday's chapter 2 trap, the whole book numbered once and then split by segment: all 35 Business customers who ordered, since the smallest of their spends, Rs 2,25,000, is ten times the largest retail spend, Rs 21,740, then 11 Retail-Plus members, 4 Retail-Core customers and no Student.</w:t>
+              <w:t xml:space="preserve">A rank computed within PARTITION BY segment keeps every customer and starts again in each segment, and the outer query keeps the rows ranked three or better. The filter has to sit outside the window, because WHERE runs before any window is computed. The list in the stem is Wednesday's chapter 2 trap, the whole book numbered once and then split by segment: all 35 Business customers who ordered, since the smallest of their spends, Rs 2,25,000, is more than ten times the largest retail spend, Rs 21,740, then 11 Retail-Plus members, 4 Retail-Core customers and no Student.</w:t>
             </w:r>
           </w:p>
           <w:p>
@@ -15326,7 +15326,7 @@
                 <w:sz w:val="21"/>
                 <w:szCs w:val="21"/>
               </w:rPr>
-              <w:t xml:space="preserve">OVER () puts the tier's total on every row without collapsing the rows, so each member's spend divides by Rs 4,13,380 and the shares add to 1. Grouping by member makes each sum the member's own spend, and so does a partition by member, so both return a share of 1 for everyone. An ORDER BY inside the window turns the sum into a running total, the shape Wednesday's chapter 5 used against the plan line, so the top spender's share reads 1 and each later share divides by a larger part of the total. Run on PostgreSQL 16.14 on the week's warehouse on 1 October 2026.</w:t>
+              <w:t xml:space="preserve">OVER () puts the tier's total on every row without collapsing the rows, so each member's spend divides by Rs 4,13,380 and the shares add to 1. Grouping by member makes each sum the member's own spend, so every share reads 1. Dividing by avg(spend) OVER () compares each member with the average member, Rs 5,439. An ORDER BY inside the window turns the sum into a running total, the shape Wednesday's chapter 5 used against the plan line, so the top spender's share reads 1 and each later share divides by a larger part of the total.</w:t>
             </w:r>
           </w:p>
           <w:p>
@@ -15407,7 +15407,7 @@
                 <w:sz w:val="20"/>
                 <w:szCs w:val="20"/>
               </w:rPr>
-              <w:t xml:space="preserve">A partition by member sums each member's own row, so every share reads 1.</w:t>
+              <w:t xml:space="preserve">Dividing by avg(spend) OVER () compares each member with the average member: a member at the average reads 1, and the results add to 76, the number of members, where shares add to 1.</w:t>
             </w:r>
           </w:p>
           <w:p>
@@ -15555,7 +15555,7 @@
                 <w:sz w:val="21"/>
                 <w:szCs w:val="21"/>
               </w:rPr>
-              <w:t xml:space="preserve">member_month has a row only for a month with an order, and LAG reads the previous row in the partition, never the previous calendar month. C-0161 and C-0171 fell from July to August and again from August to September, so both are flagged, and rightly. C-0185's September is compared with July (1,450 below 1,900) and July with June (1,900 below 2,690), and C-0216's September with July and July with May (2,540 below 4,300, below 6,440), so both are flagged too, although neither ordered in August: two of the four calls tell a member their spend fell in August and September when there was no August reading at all. A calendar check, that the two rows LAG reads are August and July, keeps the two genuine falls; it is Wednesday's chapter 6 fix, which cut sixteen calls to nine after C-0216 rang to say they had been travelling in August. Run on PostgreSQL 16.14 on the week's warehouse on 1 October 2026.</w:t>
+              <w:t xml:space="preserve">member_month has a row only for a month with an order, and LAG reads the previous row in the partition, never the previous calendar month. C-0161 and C-0171 fell from July to August and again from August to September, so both are flagged, and rightly. C-0185's September is compared with July (1,450 below 1,900) and July with June (1,900 below 2,690), and C-0216's September with July and July with May (2,540 below 4,300, below 6,440), so both are flagged too, although neither ordered in August: two of the four calls tell a member their spend fell in August and September when there was no August reading at all. A calendar check, that the two rows LAG reads are August and July, keeps the two genuine falls; it is Wednesday's chapter 6 fix, which cut sixteen calls to nine after C-0216 rang to say they had been travelling in August.</w:t>
             </w:r>
           </w:p>
           <w:p>
@@ -15662,7 +15662,7 @@
                 <w:sz w:val="21"/>
                 <w:szCs w:val="21"/>
               </w:rPr>
-              <w:t xml:space="preserve">One row per customer per month, LAG 1 and LAG 2 partitioned by customer and ordered by month, a check that the lagged rows really are the previous two calendar months, and a flag where each month is below the one before; a month with no order is no reading.</w:t>
+              <w:t xml:space="preserve">I build one row per customer per month, take LAG 1 and LAG 2 partitioned by customer and ordered by month, check that the two lagged rows are the two calendar months before, and flag a customer where each month is below the one before; a month with no order is no reading.</w:t>
             </w:r>
           </w:p>
           <w:p>
@@ -15784,7 +15784,7 @@
                 <w:sz w:val="21"/>
                 <w:szCs w:val="21"/>
               </w:rPr>
-              <w:t xml:space="preserve">Booked to date less plan to date, read from the table at the seven readings, is -0.25, +1.95, +2.17, +1.57, +0.73, +0.79 and 0.00 crore; to the rupee, the lead was Rs 1,57,51,980 in the week of 17 August and Rs 79,70,130 in the week of 14 September. The quarter was behind after the first week, well ahead once the week of 13 July booked Rs 2.66 crore, furthest ahead in the week of 3 August at Rs 2,16,69,660, still about Rs 0.8 crore ahead in the week of 14 September, and level at the close, Rs 10 over a plan of Rs 9,83,99,990. The weekly rate did the giving back: six of the seven full weeks from 10 August booked below the plan's Rs 75,69,230 a week. A front-page sentence carries its period and its comparison, so a director reads the close and the path together. The figures are Wednesday's chapter 5 running total against plan_line, with the first plan week carrying the orders of 1 to 5 July, recomputed on PostgreSQL 16.14 on 1 October 2026.</w:t>
+              <w:t xml:space="preserve">Booked to date less plan to date, read from the table at the seven readings, is -0.25, +1.95, +2.17, +1.57, +0.73, +0.79 and 0.00 crore; to the rupee, the lead was Rs 1,57,51,980 in the week of 17 August and Rs 79,70,130 in the week of 14 September. The quarter was behind after the first week, well ahead once the week of 13 July booked Rs 2.66 crore, furthest ahead in the week of 3 August at Rs 2,16,69,660, still about Rs 0.8 crore ahead in the week of 14 September, and level at the close, Rs 10 over a plan of Rs 9,83,99,990. The weekly rate did the giving back: six of the seven full weeks from 10 August booked below the plan's Rs 75,69,230 a week. A front-page sentence carries its period and its comparison, so a director reads the close and the path together. The figures are Wednesday's chapter 5 running total against plan_line, with the first plan week carrying the orders of 1 to 5 July.</w:t>
             </w:r>
           </w:p>
           <w:p>
@@ -15838,7 +15838,7 @@
                 <w:sz w:val="20"/>
                 <w:szCs w:val="20"/>
               </w:rPr>
-              <w:t xml:space="preserve">This reads the fortnights' bookings as the position: booked to date stayed above plan to date at every reading after the first week, although several weeks booked less than the plan's Rs 75,69,230.</w:t>
+              <w:t xml:space="preserve">Option b reads the fortnights' bookings as the position: booked to date stayed above plan to date at every reading after the first week, although several weeks booked less than the plan's Rs 75,69,230.</w:t>
             </w:r>
           </w:p>
           <w:p>
@@ -16013,7 +16013,7 @@
                 <w:sz w:val="21"/>
                 <w:szCs w:val="21"/>
               </w:rPr>
-              <w:t xml:space="preserve">A left merge keeps every customer and writes one row per matching feed row; the feed has 136 rows for 130 customers, so six of its rows repeat a customer already there, and each adds a row: 340 + 6 = 346 (six customers were sent twice, on 3 and 11 August). validate='one_to_one' checks that the key is unique on both sides and raises pandas' MergeError ("Merge keys are not unique in right dataset; not a one-to-one merge") before a merged table exists; an assert on the row count would stop the run too, once the table had been built. Unguarded, the pivot reads Rs 19,84,45,800, Rs 45,800 over the book. It is the merge the room ran on Kalpa's own feed in Thursday's chapter 2. Run on pandas 3.0.6 on the week's files on 1 October 2026.</w:t>
+              <w:t xml:space="preserve">A left merge keeps every customer and writes one row per matching feed row; the feed has 136 rows for 130 customers, so six of its rows repeat a customer already there, and each adds a row: 340 + 6 = 346 (six customers were sent twice, on 3 and 11 August). validate='one_to_one' checks that the key is unique on both sides and raises pandas' MergeError ("Merge keys are not unique in right dataset; not a one-to-one merge") before a merged table exists; an assert on the row count would stop the run too, once the table had been built. Unguarded, the pivot reads Rs 19,84,45,800, Rs 45,800 over the book. It is the merge the room ran on Kalpa's own feed in Thursday's chapter 2.</w:t>
             </w:r>
           </w:p>
           <w:p>
@@ -16242,7 +16242,7 @@
                 <w:sz w:val="21"/>
                 <w:szCs w:val="21"/>
               </w:rPr>
-              <w:t xml:space="preserve">drop_duplicates with subset='customer_id' compares the customer id alone and, by its default keep='first', keeps each customer's first row in the order the file lists it. The tool lists each customer's 11 August send before its 3 August one, so C-0001 keeps 11 August, its second exposure, and the report credits the sale only from then on: orders placed from 3 to 10 August, after the real first exposure, go uncredited. On the week's book that is C-0001's order of 6 August, Rs 1,200. Thursday's chapter 2 applied the rule in order: sort the feed by exposed_date from the earliest, keep each customer's first row, then merge with validate='one_to_one'. Done here, that keeps 3 August for C-0001 and C-0002 and C-0012's one row, 130 rows in all, one per customer, and the merge returns 340 rows with spend on the book. Run on pandas 3.0.6 on the exhibit's rows and on the week's feed sent in the same order, on 1 October 2026.</w:t>
+              <w:t xml:space="preserve">drop_duplicates with subset='customer_id' compares the customer id alone and, by its default keep='first', keeps each customer's first row in the order the file lists it. The tool lists each customer's 11 August send before its 3 August one, so C-0001 keeps 11 August, its second exposure, and the report credits the sale only from then on: orders placed from 3 to 10 August, after the real first exposure, go uncredited. On the week's book that is C-0001's order of 6 August, Rs 1,200. Thursday's chapter 2 applied the rule in order: sort the feed by exposed_date from the earliest, keep each customer's first row, then merge with validate='one_to_one'. Done here, that keeps 3 August for C-0001 and C-0002 and C-0012's one row, 130 rows in all, one per customer, and the merge returns 340 rows with spend on the book.</w:t>
             </w:r>
           </w:p>
           <w:p>
@@ -16471,7 +16471,7 @@
                 <w:sz w:val="21"/>
                 <w:szCs w:val="21"/>
               </w:rPr>
-              <w:t xml:space="preserve">pivot_table splits the orders by member and month, applies its default aggfunc, which is the mean, and combines one cell per group, so M1's two June orders print as their average, 2000.0, where M1 spent 4,000, and M2's June reads 1,200. melt turns the 2 by 2 view into 4 rows, one per member and month, including M2's empty July, and sum skips that NaN: 2,000 + 2,400 + 1,200 = 5600.0 against 8,800 of orders. The check is the grand total against the orders, and the fix is aggfunc='sum' with fill_value=0. On Kalpa's Retail-Plus months in Thursday's chapter 3, the default read a fall of 18 percent where the orders fell 29.4. Run on pandas 3.0.6 on 1 October 2026.</w:t>
+              <w:t xml:space="preserve">pivot_table splits the orders by member and month, applies its default aggfunc, which is the mean, and combines one cell per group, so M1's two June orders print as their average, 2000.0, where M1 spent 4,000, and M2's June reads 1,200. melt turns the 2 by 2 view into 4 rows, one per member and month, including M2's empty July, and sum skips that NaN: 2,000 + 2,400 + 1,200 = 5600.0 against 8,800 of orders. The check is the grand total against the orders, and the fix is aggfunc='sum' with fill_value=0. On Kalpa's Retail-Plus months in Thursday's chapter 3, the default read a fall of 18 percent where the orders fell 29.4.</w:t>
             </w:r>
           </w:p>
           <w:p>
@@ -16700,7 +16700,7 @@
                 <w:sz w:val="21"/>
                 <w:szCs w:val="21"/>
               </w:rPr>
-              <w:t xml:space="preserve">The reference table holds one row per gene and panel, and TP53 sits on two panels, so the left merge writes TP53 twice: 5 rows from the lab's 4. '2-Sep' and '1-Mar' are SEPT2 and MARCH1 after Excel turned them into dates, so they match no symbol and keep a NaN panel: 3 rows carry a panel. Nothing raises. The lab's list goes back for the two symbols, fixed at their source, and the analyst decides at which grain a gene with two panels is counted before any total is taken. Ziemann, Eren and El-Osta, Genome Biology, 2016, checked on 30 September 2026; the code rerun on pandas 3.0.6 on 1 October 2026.</w:t>
+              <w:t xml:space="preserve">The reference table holds one row per gene and panel, and TP53 sits on two panels, so the left merge writes TP53 twice: 5 rows from the lab's 4. '2-Sep' and '1-Mar' are SEPT2 and MARCH1 after Excel turned them into dates, so they match no symbol and keep a NaN panel: 3 rows carry a panel. Nothing raises. The lab's list goes back for the two symbols, fixed at their source, and the analyst decides at which grain a gene with two panels is counted before any total is taken. The finding is from Ziemann, Eren and El-Osta in Genome Biology, 2016, read on 30 September 2026.</w:t>
             </w:r>
           </w:p>
           <w:p>
@@ -16929,7 +16929,7 @@
                 <w:sz w:val="21"/>
                 <w:szCs w:val="21"/>
               </w:rPr>
-              <w:t xml:space="preserve">XLOOKUP matches exactly by default, and its fourth argument, if_not_found, is what it shows for an id that is not in the list (Microsoft Support, XLOOKUP function, verified 29 September 2026). The spare beside it, VLOOKUP with its fourth argument left out, looks for an approximate match: in Friday's chapter 3 it returned C-0194's Rs 16,740, rank 15 on the list, for C-0195, a Retail-Plus member with no orders.</w:t>
+              <w:t xml:space="preserve">XLOOKUP matches exactly by default, and its fourth argument, if_not_found, is what it shows for an id that is not in the list (Microsoft Support, XLOOKUP function, read on 29 September 2026). The unused technique beside it in the match table, VLOOKUP with its fourth argument left out, looks for an approximate match: in Friday's chapter 3 it returned C-0194's Rs 16,740, rank 15 on the list, for C-0195, a Retail-Plus member with no orders.</w:t>
             </w:r>
           </w:p>
           <w:p>
@@ -17225,7 +17225,7 @@
                 <w:sz w:val="21"/>
                 <w:szCs w:val="21"/>
               </w:rPr>
-              <w:t xml:space="preserve">Friday's export repeats each order's booked amount on every payment row, so an order paid in two instalments carries its order_amount twice, and a plain sum or pivot doubles it. Flagging the first row of each order, with =IF(COUNTIF($A$2:A2,A2)=1,1,0) filled down, and summing order_amount over the flagged rows with SUMIFS counts each order once: in Friday's chapter 2 that took the raw export's Rs 39.41 crore back to the warehouse's Rs 19.84 crore. The spare beside it, Remove Duplicates across every column, removes only identical rows: it dropped the 50 gateway copies, and an instalment order's two rows differ in paid_amount, so 1,400 rows stayed and the total still doubled.</w:t>
+              <w:t xml:space="preserve">Friday's export repeats each order's booked amount on every payment row, so an order paid in two instalments carries its order_amount twice, and a plain sum or pivot doubles it. Flagging the first row of each order, with =IF(COUNTIF($A$2:A2,A2)=1,1,0) filled down, and summing order_amount over the flagged rows with SUMIFS counts each order once: in Friday's chapter 2 that took the raw export's Rs 39.41 crore back to the warehouse's Rs 19.84 crore. The unused technique beside it in the match table, Remove Duplicates across every column, removes only identical rows: it dropped the 50 gateway copies, and an instalment order's two rows differ in paid_amount, so 1,400 rows stayed and the total still doubled.</w:t>
             </w:r>
           </w:p>
           <w:p>
@@ -17521,7 +17521,7 @@
                 <w:sz w:val="21"/>
                 <w:szCs w:val="21"/>
               </w:rPr>
-              <w:t xml:space="preserve">B8 averages rows 2 to 5 alone, (-1.0 + 1.0 - 3.0 + 1.0) / 4 = -0.5, while C8 covers all six rows, 9.0 / 6 = 1.5, so the sheet reports growth 2 points lower in high-debt years. Over all six countries the high-debt column averages (-1.0 + 1.0 - 3.0 + 1.0 + 6.0 + 5.0) / 6 = 1.5, the same as the other years, so the gap disappears. In the paper the averages covered lines 30 to 44 of the sheet instead of lines 30 to 49 (footnote 5), and the error, compounded with other errors, took 0.3 percentage points off the published average for the highest debt group, overstated the lowest group by 0.1 and understated the second by 0.2; the replicators' corrected average for the highest group, 2.2 percent against the published -0.1, also corrects two other choices, so the range alone is not the whole gap (PERI working paper 322, April 2013, page 7, checked on 30 September 2026). The check that catches a range such as B2:B5 is a count of the rows each range covers against the rows in the table, run on every refresh.</w:t>
+              <w:t xml:space="preserve">B8 averages rows 2 to 5 alone, (-1.0 + 1.0 - 3.0 + 1.0) / 4 = -0.5, while C8 covers all six rows, 9.0 / 6 = 1.5, so the sheet reports growth 2 points lower in high-debt years. Over all six countries the high-debt column averages (-1.0 + 1.0 - 3.0 + 1.0 + 6.0 + 5.0) / 6 = 1.5, the same as the other years, so the gap disappears. In the paper the averages covered lines 30 to 44 of the sheet instead of lines 30 to 49 (footnote 5), and the error, compounded with other errors, took 0.3 percentage points off the published average for the highest debt group, overstated the lowest group by 0.1 and understated the second by 0.2; the replicators' corrected average for the highest group, 2.2 percent against the published -0.1, also corrects the excluded data and the weighting, so the range alone is not the whole gap. The figures are from PERI working paper 322, April 2013, page 7, read on 30 September 2026. The check that catches a range such as B2:B5 is a count of the rows each range covers against the rows in the table, run on every refresh.</w:t>
             </w:r>
           </w:p>
           <w:p>
@@ -17669,7 +17669,7 @@
                 <w:sz w:val="21"/>
                 <w:szCs w:val="21"/>
               </w:rPr>
-              <w:t xml:space="preserve">Column D reads 0.60 / 4.60 = 0.130, -0.60 / 5.40 = -0.111 and 0.30 / 3.30 = 0.091; divided by the average, as the documentation defines it, the changes are 0.261, -0.222 and 0.182. The sum of the two rates is twice their average, so every change, rising or falling, comes out at half its size, and a value at risk that moves with the changes is half what it should be: 70 million dollars should read 140 million, 20 million over the 120 million limit. The task force wrote that the error "likely had the effect of muting volatility by a factor of two and of lowering the VaR". A second way to the same number, by hand on one row or in a second tool, catches it, as in Thursday's chapter 4, where plain Python, SQL and pandas agreed only once they shared one definition. Quoted from the Report of JPMorgan Chase and Co. Management Task Force Regarding 2012 CIO Losses, 16 January 2013, pages 123 and 128, checked on 30 September 2026; the value at risk and the limit here are illustrative.</w:t>
+              <w:t xml:space="preserve">Column D reads 0.60 / 4.60 = 0.130, -0.60 / 5.40 = -0.111 and 0.30 / 3.30 = 0.091; divided by the average, as the documentation defines it, the changes are 0.261, -0.222 and 0.182. The sum of the two rates is twice their average, so every change, rising or falling, comes out at half its size, and a value at risk that moves with the changes is half what it should be: 70 million dollars should read 140 million, 20 million over the 120 million limit. The task force wrote that the error "likely had the effect of muting volatility by a factor of two and of lowering the VaR". A second way to the same number, by hand on one row or in a second tool, catches it, as in Thursday's chapter 4, where plain Python, SQL and pandas agreed only once they shared one definition, and Friday's notes met the same report's finding, a spreadsheet that "divided by their sum instead of their average". The quotations are from the Report of JPMorgan Chase and Co. Management Task Force Regarding 2012 CIO Losses, 16 January 2013, pages 123 and 128, read on 30 September 2026, and the value at risk and the limit here are illustrative.</w:t>
             </w:r>
           </w:p>
           <w:p>
@@ -17817,7 +17817,7 @@
                 <w:sz w:val="21"/>
                 <w:szCs w:val="21"/>
               </w:rPr>
-              <w:t xml:space="preserve">The commission charged is 25 percent of the gross fare on every trip, 7.50, 5.00 and 11.00. The fares after taxes and fees are 27.60, 18.40 and 40.00 dollars, so the commission due is 6.90, 4.60 and 10.00: 0.60 + 0.40 + 1.00 = 2.00 dollars over, which is also 25 percent of the 8.00 dollars of taxes and fees. Against the 23.50 dollars charged that is 8.5 percent, and every trip that carries taxes and fees is overcharged the same way, which is why a percentage's base is part of its definition. CBS News, 24 May 2017, reported that Uber had calculated its driver commissions "based on gross fares, before any taxes and fees were deducted"; checked on 30 September 2026. The fares and the rate here are illustrative.</w:t>
+              <w:t xml:space="preserve">The commission charged is 25 percent of the gross fare on every trip, 7.50, 5.00 and 11.00. The fares after taxes and fees are 27.60, 18.40 and 40.00 dollars, so the commission due is 6.90, 4.60 and 10.00: 0.60 + 0.40 + 1.00 = 2.00 dollars over, which is also 25 percent of the 8.00 dollars of taxes and fees. Against the 23.50 dollars charged that is 8.5 percent, and every trip that carries taxes and fees is overcharged the same way, which is why a percentage's base is part of its definition. CBS News reported on 24 May 2017 that Uber had calculated its driver commissions "based on gross fares, before any taxes and fees were deducted" (read on 30 September 2026 and again on 1 October 2026), and the fares and the rate here are illustrative.</w:t>
             </w:r>
           </w:p>
           <w:p>
@@ -17965,7 +17965,7 @@
                 <w:sz w:val="21"/>
                 <w:szCs w:val="21"/>
               </w:rPr>
-              <w:t xml:space="preserve">The labels hold T3 and T5 twice, so the merge writes one row per matching label and returns 7 rows. T3 and T5 are both tickets the model got wrong, so the mean counts 3 correct rows of 7, 0.43, against 3 correct tickets of 5, 0.6: the model fails the 0.5 bar on a score that counts its two misses twice. It is the fan-out of Tuesday's payments and Thursday's exposure feed, and the checks are the same: rows before and after, or validate='one_to_one'. Run on pandas 3.0.6 on 1 October 2026.</w:t>
+              <w:t xml:space="preserve">The labels hold T3 and T5 twice, so the merge writes one row per matching label and returns 7 rows. T3 and T5 are both tickets the model got wrong, so the mean counts 3 correct rows of 7, 0.43, against 3 correct tickets of 5, 0.6: the model fails the 0.5 bar on a score that counts its two misses twice. It is the fan-out of Tuesday's payments and Thursday's exposure feed, and the checks are the same: rows before and after, or validate='one_to_one'.</w:t>
             </w:r>
           </w:p>
           <w:p>
@@ -18046,7 +18046,7 @@
                 <w:sz w:val="20"/>
                 <w:szCs w:val="20"/>
               </w:rPr>
-              <w:t xml:space="preserve">A MergeError would need a merge that refuses repeated keys; pandas raises it only when validate is set, and without it writes one row per matching label and prints a number.</w:t>
+              <w:t xml:space="preserve">A MergeError would need a merge that refuses repeated keys, and frames of different lengths merge without complaint; pandas raises it only when validate is set, and without it writes one row per matching label and prints a number.</w:t>
             </w:r>
           </w:p>
           <w:p>
@@ -18194,7 +18194,7 @@
                 <w:sz w:val="21"/>
                 <w:szCs w:val="21"/>
               </w:rPr>
-              <w:t xml:space="preserve">Partitioned by model and ordered by finished_on descending, then run_id descending, ROW_NUMBER puts run 11 first for bot-b, the later of its two runs of 9 September, at 0.74, and run 9 first for bot-a, at 0.78, so bot-a stays, every time the query runs. ROW_NUMBER breaks a tie by whatever else its ORDER BY names, as Wednesday's chapter 3 put it, so the tiebreaker has to follow the business's own definition of latest. run_id is a number, so 11 sorts above 10; stored as text, '11' would sort below '9'. Run on PostgreSQL 16.14 on 1 October 2026.</w:t>
+              <w:t xml:space="preserve">Partitioned by model and ordered by finished_on descending, then run_id descending, ROW_NUMBER puts run 11 first for bot-b, the later of its two runs of 9 September, at 0.74, and run 9 first for bot-a, at 0.78, so bot-a stays, every time the query runs. ROW_NUMBER breaks a tie by whatever else its ORDER BY names, as Wednesday's chapter 3 put it, so the tiebreaker has to follow the business's own definition of latest. run_id is a number, so run 11 sorts above run 10.</w:t>
             </w:r>
           </w:p>
           <w:p>
@@ -18423,7 +18423,7 @@
                 <w:sz w:val="21"/>
                 <w:szCs w:val="21"/>
               </w:rPr>
-              <w:t xml:space="preserve">Monday's run order is FROM, WHERE, GROUP BY, HAVING, SELECT, ORDER BY, then LIMIT, and because SELECT runs after GROUP BY it can name only the grouping column and aggregates, here model and count(*). WHERE runs first and keeps the five low ratings: three for bot-a, one for bot-b and one for bot-c. GROUP BY forms its groups from those rows alone, so count(*) counts low ratings, and HAVING count(*) &gt;= 3 keeps bot-a with 3. The lead asked for the models with at least three replies in all, bot-a with 4 and bot-b with 3, so bot-b goes unretrained because the HAVING tests the wrong count. With no WHERE, counting every reply in HAVING and the low ones with count(*) FILTER (WHERE rating &lt;= 2) returns bot-a 3 and bot-b 1. Run on PostgreSQL 16.14 on 1 October 2026.</w:t>
+              <w:t xml:space="preserve">Monday's run order is FROM, WHERE, GROUP BY, HAVING, SELECT, ORDER BY, then LIMIT, and because SELECT runs after GROUP BY it can name only the grouping column and aggregates, here model and count(*). WHERE runs first and keeps the five low ratings: three for bot-a, one for bot-b and one for bot-c. GROUP BY forms its groups from those rows alone, so count(*) counts low ratings, and HAVING count(*) &gt;= 3 keeps bot-a with 3. The lead asked for the models with at least three replies in all, bot-a with 4 and bot-b with 3, so bot-b goes unretrained because the HAVING tests the wrong count. With no WHERE, counting every reply in HAVING and the low ones with count(*) FILTER (WHERE rating &lt;= 2) returns bot-a 3 and bot-b 1.</w:t>
             </w:r>
           </w:p>
           <w:p>
@@ -18652,7 +18652,7 @@
                 <w:sz w:val="21"/>
                 <w:szCs w:val="21"/>
               </w:rPr>
-              <w:t xml:space="preserve">The handoff log holds a row whose conversation_id is NULL. For c1, NOT IN asks c1 &lt;&gt; 'c2' AND c1 &lt;&gt; 'c4' AND c1 &lt;&gt; NULL; the last comparison is unknown, so the whole condition is unknown and WHERE drops the row. Every conversation fails the same way, so the count is 0, and the lead cuts the budget of an assistant that resolved two of four, half. NOT EXISTS, or a LEFT JOIN kept where the handoff key IS NULL, returns 2; Tuesday's chapter 4 named NOT IN as the anti-join to avoid for this reason. Run on PostgreSQL 16.14 on 1 October 2026.</w:t>
+              <w:t xml:space="preserve">The handoff log holds a row whose conversation_id is NULL. For c1, NOT IN asks c1 &lt;&gt; 'c2' AND c1 &lt;&gt; 'c4' AND c1 &lt;&gt; NULL; the last comparison is unknown, so the whole condition is unknown and WHERE drops the row. Every conversation fails the same way, so the count is 0, and the lead cuts the budget of an assistant that resolved two of four, half. NOT EXISTS, or a LEFT JOIN kept where the handoff key IS NULL, returns 2; Tuesday's chapter 4 named NOT IN as the anti-join to avoid for this reason.</w:t>
             </w:r>
           </w:p>
           <w:p>
@@ -18881,7 +18881,7 @@
                 <w:sz w:val="21"/>
                 <w:szCs w:val="21"/>
               </w:rPr>
-              <w:t xml:space="preserve">With an ORDER BY and no frame, the window runs from the first row to the current row and its peers, the rows that tie on the ORDER BY. Calls 2 and 3 share 22 September, so both read the day's closing figure, 1200, and call 2 is routed although the total stood at 700 after it, as the twelve orders of 22 July all read the day's close in Wednesday's chapter 5. Adding call_id to the window's ORDER BY gives each call its own step and routes call 3. Run on PostgreSQL 16.14 on 1 October 2026.</w:t>
+              <w:t xml:space="preserve">With an ORDER BY and no frame, the window runs from the first row to the current row and its peers, the rows that tie on the ORDER BY. Calls 2 and 3 share 22 September, so both read the day's closing figure, 1,200, and call 2 is routed although the total stood at 700 after it, as the twelve orders of 22 July all read the day's close in Wednesday's chapter 5. Adding call_id to the window's ORDER BY gives each call its own step and routes call 3.</w:t>
             </w:r>
           </w:p>
           <w:p>
@@ -18908,7 +18908,7 @@
                 <w:sz w:val="20"/>
                 <w:szCs w:val="20"/>
               </w:rPr>
-              <w:t xml:space="preserve">Call 3 is the one-step-per-row reading, 400, 700, 1,200, which needs a unique ORDER BY such as day then call_id; with the date alone calls 2 and 3 are peers and share one figure.</w:t>
+              <w:t xml:space="preserve">Call 3 would be the first only if each row took its own step, 400, 700, 1,200, which needs a unique ORDER BY such as day then call_id; with the date alone, calls 2 and 3 are peers and both read 1,200.</w:t>
             </w:r>
           </w:p>
           <w:p>
@@ -19191,7 +19191,7 @@
                 <w:sz w:val="20"/>
                 <w:szCs w:val="20"/>
               </w:rPr>
-              <w:t xml:space="preserve">3, the busiest day's count, answers how much the assistant must handle at once, and the ask was the week's active users.</w:t>
+              <w:t xml:space="preserve">3 is the busiest day's count, which says how many users the busiest day brought, and the ask was the week's active users.</w:t>
             </w:r>
           </w:p>
           <w:p>
@@ -19467,7 +19467,7 @@
           <w:sz w:val="21"/>
           <w:szCs w:val="21"/>
         </w:rPr>
-        <w:t xml:space="preserve">Part 4, Can the growth team act on Monday's table of 340 customers without checking it first? (4): Q17, Q18, Q19, Q20</w:t>
+        <w:t xml:space="preserve">Part 4, What must Monday's customer table check before the growth team acts on it? (4): Q17, Q18, Q19, Q20</w:t>
       </w:r>
     </w:p>
     <w:p>
@@ -19486,7 +19486,7 @@
           <w:sz w:val="21"/>
           <w:szCs w:val="21"/>
         </w:rPr>
-        <w:t xml:space="preserve">Part 5, Which spreadsheet numbers can a director trust, in Monday's workbook and in three public cases? (7): Q21, Q22, Q23, Q24, Q25, Q26, Q27</w:t>
+        <w:t xml:space="preserve">Part 5, Which numbers in Monday's workbook can a director trust, and where did three public cases go wrong? (7): Q21, Q22, Q23, Q24, Q25, Q26, Q27</w:t>
       </w:r>
     </w:p>
     <w:p>
@@ -19689,7 +19689,7 @@
           <w:sz w:val="21"/>
           <w:szCs w:val="21"/>
         </w:rPr>
-        <w:t xml:space="preserve">Q10 (One correct option, Medium, [D]): It is the end of the reporting day, and Anand expects the report tonight. His rule for a check that fails this late: booked always leaves, because it ties to the orders table alone; a collected figure that does not reconcile never leaves, and an open line goes with the report, naming the failed check, what it means and when it will close. On this report a channel's collected reconciles when its gap, booked less collected, equals its unpaid orders' booked value. What do you send?</w:t>
+        <w:t xml:space="preserve">Q10 (One correct option, Medium, [D]): It is the end of the reporting day, and Anand expects the report tonight. His rule for a check that fails this late: booked always leaves, because it ties to the orders table alone; a collected figure that does not reconcile never leaves, and an open line goes with the report, naming the failed check, what it means and when it will close. No order on this report was paid short, so a channel's collected reconciles when its gap, booked less collected, equals its unpaid orders' booked value. What do you send?</w:t>
       </w:r>
     </w:p>
     <w:p>
@@ -19898,7 +19898,7 @@
           <w:sz w:val="21"/>
           <w:szCs w:val="21"/>
         </w:rPr>
-        <w:t xml:space="preserve">Q22 (Match the following, Medium, [F]): A figure under the protect list that adds only the members a filter to Mumbai leaves on screen</w:t>
+        <w:t xml:space="preserve">Q22 (Match the following, Medium, [F]): A figure under the protect list that adds the spend of only the members a filter to Mumbai leaves on screen</w:t>
       </w:r>
     </w:p>
     <w:p>
@@ -19955,7 +19955,7 @@
           <w:sz w:val="21"/>
           <w:szCs w:val="21"/>
         </w:rPr>
-        <w:t xml:space="preserve">Q25 (Applied maths, Hard, [F]): In 2013 Herndon, Ash and Pollin rebuilt an influential 2010 paper by Reinhart and Rogoff from the authors' own working spreadsheet, and found that the paper's average growth for countries with public debt over 90 percent of GDP, the value of everything a country produces in a year, published as -0.1 percent, was 2.2 percent when properly calculated (PERI working paper 322, 2013). The illustrative sheet above goes to a review today. What does it report for the two columns, what do the six countries' figures give, and does its comparison hold? Show the working.</w:t>
+        <w:t xml:space="preserve">Q25 (Applied maths, Hard, [F]): In 2013 Herndon, Ash and Pollin rebuilt an influential 2010 paper by Reinhart and Rogoff from the authors' own working spreadsheet, and found that the paper's average growth for countries with public debt over 90 percent of GDP, the value of everything a country produces in a year, published as -0.1 percent, was 2.2 percent once a coding error in the spreadsheet, the exclusion of some available data and an unusual weighting of the averages were corrected (PERI working paper 322, 2013). The illustrative sheet above goes to a review today. What does it report for the two columns, what do the six countries' figures give, and does its comparison hold? Show the working.</w:t>
       </w:r>
     </w:p>
     <w:p>
@@ -19974,7 +19974,7 @@
           <w:sz w:val="21"/>
           <w:szCs w:val="21"/>
         </w:rPr>
-        <w:t xml:space="preserve">Q26 (Applied maths, Hard, [D]): JPMorgan's task force on the 2012 losses in its Chief Investment Office reported on a value-at-risk model, an estimate of how much a trading book can lose on a bad day, that ran through Excel spreadsheets filled by copying and pasting (JPMorgan Chase, 2013). Suppose the model's documentation defines a day's change as the difference between the new and old rates divided by their average, and that its value at risk moves in step with the size of those changes. The sheet above reports a value at risk of 70 million dollars against the desk's limit of 120 million dollars; both figures are illustrative. What value at risk should the sheet have reported, and is the desk inside its limit? Show the working.</w:t>
+        <w:t xml:space="preserve">Q26 (Applied maths, Hard, [D]): JPMorgan's task force on the 2012 losses in its Chief Investment Office reported on a value-at-risk model, an estimate of how much a trading book can lose on a bad day, that ran through Excel spreadsheets filled by copying and pasting (JPMorgan Chase, 2013). Suppose the model's documentation defines a day's change as the difference between the new and old rates divided by their average, and that its value at risk moves in proportion to the size of those changes. The sheet above reports a value at risk of 70 million dollars against the desk's limit of 120 million dollars; both figures are illustrative. What value at risk should the sheet have reported, and is the desk inside its limit? Show the working.</w:t>
       </w:r>
     </w:p>
     <w:p>
@@ -20012,7 +20012,7 @@
           <w:sz w:val="21"/>
           <w:szCs w:val="21"/>
         </w:rPr>
-        <w:t xml:space="preserve">Q28 (One correct option, Hard, [F]): The team scores a model that sorts support tickets into refund, late and other against labels from an annotation vendor, and ships a model only if it scores 0.5 or better. What does the code above print, and what happens to the model?</w:t>
+        <w:t xml:space="preserve">Q28 (One correct option, Hard, [F]): The team scores a model that sorts support tickets into refund, late and other against labels that an outside firm set by hand, and ships a model only if it scores 0.5 or better. What does the code above print, and what happens to the model?</w:t>
       </w:r>
     </w:p>
     <w:p>
@@ -20088,7 +20088,7 @@
           <w:sz w:val="21"/>
           <w:szCs w:val="21"/>
         </w:rPr>
-        <w:t xml:space="preserve">Q32 (One correct option, Hard, [F]): The model's bill is charged per token, so the finance partner routes every call to a cheaper model once tokens_so_far, read from the query above, passes 1,000. Which call is the first one routed to the cheaper model?</w:t>
+        <w:t xml:space="preserve">Q32 (One correct option, Hard, [F]): The model's bill is charged per token, so the finance partner routes to the cheaper model every call whose tokens_so_far, read from the query above, is over 1,000. Which is the first call routed?</w:t>
       </w:r>
     </w:p>
     <w:p>
@@ -20671,7 +20671,7 @@
           <w:sz w:val="21"/>
           <w:szCs w:val="21"/>
         </w:rPr>
-        <w:t xml:space="preserve">Bank 31 (One correct option, Medium, Fri), folded into Q21: The match row asks for the lookup that says so when an id is missing, with VLOOKUP's default approximate match as the spare beside it.</w:t>
+        <w:t xml:space="preserve">Bank 31 (One correct option, Medium, Fri), folded into Q21: The match row asks for the lookup that says so when an id is missing, with VLOOKUP's default approximate match as the unused technique beside it.</w:t>
       </w:r>
     </w:p>
     <w:p>

</xml_diff>

<commit_message>
W02 Saturday: Q13's stem says "more than ten times", since Rs 2,25,000 is 10.35 times Rs 21,740
Bank 27's proposed stem in data/programme/paper_edits.yaml now matches the key's reason. The paper,
the key and the item-analysis workbook were rebuilt with mermaid-cli 11.17.0 (23 and 25 pages), the
key proofs pass on all 33 items against the reloaded v4 warehouse, and the provenance records both
open points as settled. The edit stays proposed for the Programme Head.

Co-Authored-By: Claude Opus 5.5 <noreply@anthropic.com>
Claude-Session: https://claude.ai/code/session_01P7zaoR4dQ5pzBFnsX549JQ
</commit_message>
<xml_diff>
--- a/content/W02/SAT/answer-key/C2_W02_SAT_answer_key_TRAINER.docx
+++ b/content/W02/SAT/answer-key/C2_W02_SAT_answer_key_TRAINER.docx
@@ -28861,8 +28861,8 @@
       </w:tr>
     </w:tbl>
     <w:sectPr>
-      <w:headerReference w:type="default" r:id="rId6"/>
-      <w:footerReference w:type="default" r:id="rId7"/>
+      <w:headerReference w:type="default" r:id="rId7"/>
+      <w:footerReference w:type="default" r:id="rId8"/>
       <w:pgSz w:w="11906" w:h="16838" w:orient="portrait"/>
       <w:pgMar w:top="900" w:right="1053" w:bottom="900" w:left="1053" w:header="500" w:footer="500" w:gutter="0"/>
       <w:pgNumType/>
@@ -28870,6 +28870,10 @@
     </w:sectPr>
   </w:body>
 </w:document>
+</file>
+
+<file path=word/comments.xml><?xml version="1.0" encoding="utf-8"?>
+<w:comments xmlns:cx="http://schemas.microsoft.com/office/drawing/2014/chartex" xmlns:cx1="http://schemas.microsoft.com/office/drawing/2015/9/8/chartex" xmlns:cx2="http://schemas.microsoft.com/office/drawing/2015/10/21/chartex" xmlns:cx3="http://schemas.microsoft.com/office/drawing/2016/5/9/chartex" xmlns:cx4="http://schemas.microsoft.com/office/drawing/2016/5/10/chartex" xmlns:cx5="http://schemas.microsoft.com/office/drawing/2016/5/11/chartex" xmlns:cx6="http://schemas.microsoft.com/office/drawing/2016/5/12/chartex" xmlns:cx7="http://schemas.microsoft.com/office/drawing/2016/5/13/chartex" xmlns:cx8="http://schemas.microsoft.com/office/drawing/2016/5/14/chartex" xmlns:mc="http://schemas.openxmlformats.org/markup-compatibility/2006" xmlns:aink="http://schemas.microsoft.com/office/drawing/2016/ink" xmlns:am3d="http://schemas.microsoft.com/office/drawing/2017/model3d" xmlns:o="urn:schemas-microsoft-com:office:office" xmlns:r="http://schemas.openxmlformats.org/officeDocument/2006/relationships" xmlns:m="http://schemas.openxmlformats.org/officeDocument/2006/math" xmlns:v="urn:schemas-microsoft-com:vml" xmlns:wp14="http://schemas.microsoft.com/office/word/2010/wordprocessingDrawing" xmlns:wp="http://schemas.openxmlformats.org/drawingml/2006/wordprocessingDrawing" xmlns:w10="urn:schemas-microsoft-com:office:word" xmlns:w="http://schemas.openxmlformats.org/wordprocessingml/2006/main" xmlns:w14="http://schemas.microsoft.com/office/word/2010/wordml" xmlns:w15="http://schemas.microsoft.com/office/word/2012/wordml" xmlns:w16cex="http://schemas.microsoft.com/office/word/2018/wordml/cex" xmlns:w16cid="http://schemas.microsoft.com/office/word/2016/wordml/cid" xmlns:w16="http://schemas.microsoft.com/office/word/2018/wordml" xmlns:w16sdtdh="http://schemas.microsoft.com/office/word/2020/wordml/sdtdatahash" xmlns:w16se="http://schemas.microsoft.com/office/word/2015/wordml/symex" xmlns:wpg="http://schemas.microsoft.com/office/word/2010/wordprocessingGroup" xmlns:wpi="http://schemas.microsoft.com/office/word/2010/wordprocessingInk" xmlns:wne="http://schemas.microsoft.com/office/word/2006/wordml" xmlns:wps="http://schemas.microsoft.com/office/word/2010/wordprocessingShape"/>
 </file>
 
 <file path=word/endnotes.xml><?xml version="1.0" encoding="utf-8"?>
@@ -29024,7 +29028,7 @@
 <w:numbering xmlns:wpc="http://schemas.microsoft.com/office/word/2010/wordprocessingCanvas" xmlns:mc="http://schemas.openxmlformats.org/markup-compatibility/2006" xmlns:o="urn:schemas-microsoft-com:office:office" xmlns:r="http://schemas.openxmlformats.org/officeDocument/2006/relationships" xmlns:m="http://schemas.openxmlformats.org/officeDocument/2006/math" xmlns:v="urn:schemas-microsoft-com:vml" xmlns:wp14="http://schemas.microsoft.com/office/word/2010/wordprocessingDrawing" xmlns:wp="http://schemas.openxmlformats.org/drawingml/2006/wordprocessingDrawing" xmlns:w10="urn:schemas-microsoft-com:office:word" xmlns:w="http://schemas.openxmlformats.org/wordprocessingml/2006/main" xmlns:w14="http://schemas.microsoft.com/office/word/2010/wordml" xmlns:w15="http://schemas.microsoft.com/office/word/2012/wordml" xmlns:wpg="http://schemas.microsoft.com/office/word/2010/wordprocessingGroup" xmlns:wpi="http://schemas.microsoft.com/office/word/2010/wordprocessingInk" xmlns:wne="http://schemas.microsoft.com/office/word/2006/wordml" xmlns:wps="http://schemas.microsoft.com/office/word/2010/wordprocessingShape" mc:Ignorable="w14 w15 wp14">
   <w:abstractNum w:abstractNumId="1" w15:restartNumberingAfterBreak="0">
     <w:multiLevelType w:val="hybridMultilevel"/>
-    <w:lvl w:ilvl="0" w:tentative="1">
+    <w:lvl w:ilvl="0" w15:tentative="1">
       <w:start w:val="1"/>
       <w:numFmt w:val="bullet"/>
       <w:lvlText w:val="●"/>
@@ -29033,7 +29037,7 @@
         <w:ind w:left="720" w:hanging="360"/>
       </w:pPr>
     </w:lvl>
-    <w:lvl w:ilvl="1" w:tentative="1">
+    <w:lvl w:ilvl="1" w15:tentative="1">
       <w:start w:val="1"/>
       <w:numFmt w:val="bullet"/>
       <w:lvlText w:val="○"/>
@@ -29042,7 +29046,7 @@
         <w:ind w:left="1440" w:hanging="360"/>
       </w:pPr>
     </w:lvl>
-    <w:lvl w:ilvl="2" w:tentative="1">
+    <w:lvl w:ilvl="2" w15:tentative="1">
       <w:start w:val="1"/>
       <w:numFmt w:val="bullet"/>
       <w:lvlText w:val="■"/>
@@ -29051,7 +29055,7 @@
         <w:ind w:left="2160" w:hanging="360"/>
       </w:pPr>
     </w:lvl>
-    <w:lvl w:ilvl="3" w:tentative="1">
+    <w:lvl w:ilvl="3" w15:tentative="1">
       <w:start w:val="1"/>
       <w:numFmt w:val="bullet"/>
       <w:lvlText w:val="●"/>
@@ -29060,7 +29064,7 @@
         <w:ind w:left="2880" w:hanging="360"/>
       </w:pPr>
     </w:lvl>
-    <w:lvl w:ilvl="4" w:tentative="1">
+    <w:lvl w:ilvl="4" w15:tentative="1">
       <w:start w:val="1"/>
       <w:numFmt w:val="bullet"/>
       <w:lvlText w:val="○"/>
@@ -29069,7 +29073,7 @@
         <w:ind w:left="3600" w:hanging="360"/>
       </w:pPr>
     </w:lvl>
-    <w:lvl w:ilvl="5" w:tentative="1">
+    <w:lvl w:ilvl="5" w15:tentative="1">
       <w:start w:val="1"/>
       <w:numFmt w:val="bullet"/>
       <w:lvlText w:val="■"/>
@@ -29078,7 +29082,7 @@
         <w:ind w:left="4320" w:hanging="360"/>
       </w:pPr>
     </w:lvl>
-    <w:lvl w:ilvl="6" w:tentative="1">
+    <w:lvl w:ilvl="6" w15:tentative="1">
       <w:start w:val="1"/>
       <w:numFmt w:val="bullet"/>
       <w:lvlText w:val="●"/>
@@ -29087,7 +29091,7 @@
         <w:ind w:left="5040" w:hanging="360"/>
       </w:pPr>
     </w:lvl>
-    <w:lvl w:ilvl="7" w:tentative="1">
+    <w:lvl w:ilvl="7" w15:tentative="1">
       <w:start w:val="1"/>
       <w:numFmt w:val="bullet"/>
       <w:lvlText w:val="●"/>
@@ -29096,7 +29100,7 @@
         <w:ind w:left="5760" w:hanging="360"/>
       </w:pPr>
     </w:lvl>
-    <w:lvl w:ilvl="8" w:tentative="1">
+    <w:lvl w:ilvl="8" w15:tentative="1">
       <w:start w:val="1"/>
       <w:numFmt w:val="bullet"/>
       <w:lvlText w:val="●"/>
@@ -29108,11 +29112,11 @@
   </w:abstractNum>
   <w:abstractNum w:abstractNumId="2" w15:restartNumberingAfterBreak="0">
     <w:multiLevelType w:val="hybridMultilevel"/>
-    <w:lvl w:ilvl="0" w:tentative="1">
+    <w:lvl w:ilvl="0" w15:tentative="1">
       <w:start w:val="1"/>
       <w:numFmt w:val="decimal"/>
       <w:lvlText w:val="%1."/>
-      <w:lvlJc w:val="left"/>
+      <w:lvlJc w:val="start"/>
       <w:pPr>
         <w:ind w:left="400" w:hanging="300"/>
       </w:pPr>
@@ -29120,11 +29124,11 @@
   </w:abstractNum>
   <w:abstractNum w:abstractNumId="3" w15:restartNumberingAfterBreak="0">
     <w:multiLevelType w:val="hybridMultilevel"/>
-    <w:lvl w:ilvl="0" w:tentative="1">
+    <w:lvl w:ilvl="0" w15:tentative="1">
       <w:start w:val="1"/>
       <w:numFmt w:val="bullet"/>
       <w:lvlText w:val="•"/>
-      <w:lvlJc w:val="left"/>
+      <w:lvlJc w:val="start"/>
       <w:pPr>
         <w:ind w:left="400" w:hanging="300"/>
       </w:pPr>
@@ -29164,10 +29168,6 @@
     </w:rPrDefault>
     <w:pPrDefault/>
   </w:docDefaults>
-  <w:style w:type="paragraph" w:styleId="Normal" w:default="1">
-    <w:name w:val="Normal"/>
-    <w:qFormat/>
-  </w:style>
   <w:style w:type="paragraph" w:styleId="Title">
     <w:name w:val="Title"/>
     <w:basedOn w:val="Normal"/>
@@ -29340,294 +29340,4 @@
     </w:rPr>
   </w:style>
 </w:styles>
-</file>
-
-<file path=word/theme/theme1.xml><?xml version="1.0" encoding="utf-8"?>
-<a:theme xmlns:a="http://schemas.openxmlformats.org/drawingml/2006/main" name="Office Theme">
-  <a:themeElements>
-    <a:clrScheme name="Office">
-      <a:dk1>
-        <a:sysClr val="windowText" lastClr="000000"/>
-      </a:dk1>
-      <a:lt1>
-        <a:sysClr val="window" lastClr="FFFFFF"/>
-      </a:lt1>
-      <a:dk2>
-        <a:srgbClr val="44546A"/>
-      </a:dk2>
-      <a:lt2>
-        <a:srgbClr val="E7E6E6"/>
-      </a:lt2>
-      <a:accent1>
-        <a:srgbClr val="4472C4"/>
-      </a:accent1>
-      <a:accent2>
-        <a:srgbClr val="ED7D31"/>
-      </a:accent2>
-      <a:accent3>
-        <a:srgbClr val="A5A5A5"/>
-      </a:accent3>
-      <a:accent4>
-        <a:srgbClr val="FFC000"/>
-      </a:accent4>
-      <a:accent5>
-        <a:srgbClr val="5B9BD5"/>
-      </a:accent5>
-      <a:accent6>
-        <a:srgbClr val="70AD47"/>
-      </a:accent6>
-      <a:hlink>
-        <a:srgbClr val="0563C1"/>
-      </a:hlink>
-      <a:folHlink>
-        <a:srgbClr val="954F72"/>
-      </a:folHlink>
-    </a:clrScheme>
-    <a:fontScheme name="Office">
-      <a:majorFont>
-        <a:latin typeface="Calibri Light" panose="020F0302020204030204"/>
-        <a:ea typeface=""/>
-        <a:cs typeface=""/>
-        <a:font script="Jpan" typeface="游ゴシック Light"/>
-        <a:font script="Hang" typeface="맑은 고딕"/>
-        <a:font script="Hans" typeface="等线 Light"/>
-        <a:font script="Hant" typeface="新細明體"/>
-        <a:font script="Arab" typeface="Times New Roman"/>
-        <a:font script="Hebr" typeface="Times New Roman"/>
-        <a:font script="Thai" typeface="Angsana New"/>
-        <a:font script="Ethi" typeface="Nyala"/>
-        <a:font script="Beng" typeface="Vrinda"/>
-        <a:font script="Gujr" typeface="Shruti"/>
-        <a:font script="Khmr" typeface="MoolBoran"/>
-        <a:font script="Knda" typeface="Tunga"/>
-        <a:font script="Guru" typeface="Raavi"/>
-        <a:font script="Cans" typeface="Euphemia"/>
-        <a:font script="Cher" typeface="Plantagenet Cherokee"/>
-        <a:font script="Yiii" typeface="Microsoft Yi Baiti"/>
-        <a:font script="Tibt" typeface="Microsoft Himalaya"/>
-        <a:font script="Thaa" typeface="MV Boli"/>
-        <a:font script="Deva" typeface="Mangal"/>
-        <a:font script="Telu" typeface="Gautami"/>
-        <a:font script="Taml" typeface="Latha"/>
-        <a:font script="Syrc" typeface="Estrangelo Edessa"/>
-        <a:font script="Orya" typeface="Kalinga"/>
-        <a:font script="Mlym" typeface="Kartika"/>
-        <a:font script="Laoo" typeface="DokChampa"/>
-        <a:font script="Sinh" typeface="Iskoola Pota"/>
-        <a:font script="Mong" typeface="Mongolian Baiti"/>
-        <a:font script="Viet" typeface="Times New Roman"/>
-        <a:font script="Uigh" typeface="Microsoft Uighur"/>
-        <a:font script="Geor" typeface="Sylfaen"/>
-        <a:font script="Armn" typeface="Arial"/>
-        <a:font script="Bugi" typeface="Leelawadee UI"/>
-        <a:font script="Bopo" typeface="Microsoft JhengHei"/>
-        <a:font script="Java" typeface="Javanese Text"/>
-        <a:font script="Lisu" typeface="Segoe UI"/>
-        <a:font script="Mymr" typeface="Myanmar Text"/>
-        <a:font script="Nkoo" typeface="Ebrima"/>
-        <a:font script="Olck" typeface="Nirmala UI"/>
-        <a:font script="Osma" typeface="Ebrima"/>
-        <a:font script="Phag" typeface="Phagspa"/>
-        <a:font script="Syrn" typeface="Estrangelo Edessa"/>
-        <a:font script="Syrj" typeface="Estrangelo Edessa"/>
-        <a:font script="Syre" typeface="Estrangelo Edessa"/>
-        <a:font script="Sora" typeface="Nirmala UI"/>
-        <a:font script="Tale" typeface="Microsoft Tai Le"/>
-        <a:font script="Talu" typeface="Microsoft New Tai Lue"/>
-        <a:font script="Tfng" typeface="Ebrima"/>
-      </a:majorFont>
-      <a:minorFont>
-        <a:latin typeface="Calibri" panose="020F0502020204030204"/>
-        <a:ea typeface=""/>
-        <a:cs typeface=""/>
-        <a:font script="Jpan" typeface="游明朝"/>
-        <a:font script="Hang" typeface="맑은 고딕"/>
-        <a:font script="Hans" typeface="等线"/>
-        <a:font script="Hant" typeface="新細明體"/>
-        <a:font script="Arab" typeface="Arial"/>
-        <a:font script="Hebr" typeface="Arial"/>
-        <a:font script="Thai" typeface="Cordia New"/>
-        <a:font script="Ethi" typeface="Nyala"/>
-        <a:font script="Beng" typeface="Vrinda"/>
-        <a:font script="Gujr" typeface="Shruti"/>
-        <a:font script="Khmr" typeface="DaunPenh"/>
-        <a:font script="Knda" typeface="Tunga"/>
-        <a:font script="Guru" typeface="Raavi"/>
-        <a:font script="Cans" typeface="Euphemia"/>
-        <a:font script="Cher" typeface="Plantagenet Cherokee"/>
-        <a:font script="Yiii" typeface="Microsoft Yi Baiti"/>
-        <a:font script="Tibt" typeface="Microsoft Himalaya"/>
-        <a:font script="Thaa" typeface="MV Boli"/>
-        <a:font script="Deva" typeface="Mangal"/>
-        <a:font script="Telu" typeface="Gautami"/>
-        <a:font script="Taml" typeface="Latha"/>
-        <a:font script="Syrc" typeface="Estrangelo Edessa"/>
-        <a:font script="Orya" typeface="Kalinga"/>
-        <a:font script="Mlym" typeface="Kartika"/>
-        <a:font script="Laoo" typeface="DokChampa"/>
-        <a:font script="Sinh" typeface="Iskoola Pota"/>
-        <a:font script="Mong" typeface="Mongolian Baiti"/>
-        <a:font script="Viet" typeface="Arial"/>
-        <a:font script="Uigh" typeface="Microsoft Uighur"/>
-        <a:font script="Geor" typeface="Sylfaen"/>
-        <a:font script="Armn" typeface="Arial"/>
-        <a:font script="Bugi" typeface="Leelawadee UI"/>
-        <a:font script="Bopo" typeface="Microsoft JhengHei"/>
-        <a:font script="Java" typeface="Javanese Text"/>
-        <a:font script="Lisu" typeface="Segoe UI"/>
-        <a:font script="Mymr" typeface="Myanmar Text"/>
-        <a:font script="Nkoo" typeface="Ebrima"/>
-        <a:font script="Olck" typeface="Nirmala UI"/>
-        <a:font script="Osma" typeface="Ebrima"/>
-        <a:font script="Phag" typeface="Phagspa"/>
-        <a:font script="Syrn" typeface="Estrangelo Edessa"/>
-        <a:font script="Syrj" typeface="Estrangelo Edessa"/>
-        <a:font script="Syre" typeface="Estrangelo Edessa"/>
-        <a:font script="Sora" typeface="Nirmala UI"/>
-        <a:font script="Tale" typeface="Microsoft Tai Le"/>
-        <a:font script="Talu" typeface="Microsoft New Tai Lue"/>
-        <a:font script="Tfng" typeface="Ebrima"/>
-      </a:minorFont>
-    </a:fontScheme>
-    <a:fmtScheme name="Office">
-      <a:fillStyleLst>
-        <a:solidFill>
-          <a:schemeClr val="phClr"/>
-        </a:solidFill>
-        <a:gradFill rotWithShape="true">
-          <a:gsLst>
-            <a:gs pos="0">
-              <a:schemeClr val="phClr">
-                <a:lumMod val="110000"/>
-                <a:satMod val="105000"/>
-                <a:tint val="67000"/>
-              </a:schemeClr>
-            </a:gs>
-            <a:gs pos="50000">
-              <a:schemeClr val="phClr">
-                <a:lumMod val="105000"/>
-                <a:satMod val="103000"/>
-                <a:tint val="73000"/>
-              </a:schemeClr>
-            </a:gs>
-            <a:gs pos="100000">
-              <a:schemeClr val="phClr">
-                <a:lumMod val="105000"/>
-                <a:satMod val="109000"/>
-                <a:tint val="81000"/>
-              </a:schemeClr>
-            </a:gs>
-          </a:gsLst>
-          <a:lin ang="5400000" scaled="false"/>
-        </a:gradFill>
-        <a:gradFill rotWithShape="true">
-          <a:gsLst>
-            <a:gs pos="0">
-              <a:schemeClr val="phClr">
-                <a:satMod val="103000"/>
-                <a:lumMod val="102000"/>
-                <a:tint val="94000"/>
-              </a:schemeClr>
-            </a:gs>
-            <a:gs pos="50000">
-              <a:schemeClr val="phClr">
-                <a:satMod val="110000"/>
-                <a:lumMod val="100000"/>
-                <a:shade val="100000"/>
-              </a:schemeClr>
-            </a:gs>
-            <a:gs pos="100000">
-              <a:schemeClr val="phClr">
-                <a:lumMod val="99000"/>
-                <a:satMod val="120000"/>
-                <a:shade val="78000"/>
-              </a:schemeClr>
-            </a:gs>
-          </a:gsLst>
-          <a:lin ang="5400000" scaled="false"/>
-        </a:gradFill>
-      </a:fillStyleLst>
-      <a:lnStyleLst>
-        <a:ln w="6350" cap="flat" cmpd="sng" algn="ctr">
-          <a:solidFill>
-            <a:schemeClr val="phClr"/>
-          </a:solidFill>
-          <a:prstDash val="solid"/>
-          <a:miter lim="800000"/>
-        </a:ln>
-        <a:ln w="12700" cap="flat" cmpd="sng" algn="ctr">
-          <a:solidFill>
-            <a:schemeClr val="phClr"/>
-          </a:solidFill>
-          <a:prstDash val="solid"/>
-          <a:miter lim="800000"/>
-        </a:ln>
-        <a:ln w="19050" cap="flat" cmpd="sng" algn="ctr">
-          <a:solidFill>
-            <a:schemeClr val="phClr"/>
-          </a:solidFill>
-          <a:prstDash val="solid"/>
-          <a:miter lim="800000"/>
-        </a:ln>
-      </a:lnStyleLst>
-      <a:effectStyleLst>
-        <a:effectStyle>
-          <a:effectLst/>
-        </a:effectStyle>
-        <a:effectStyle>
-          <a:effectLst/>
-        </a:effectStyle>
-        <a:effectStyle>
-          <a:effectLst>
-            <a:outerShdw blurRad="57150" dist="19050" dir="5400000" algn="ctr" rotWithShape="false">
-              <a:srgbClr val="000000">
-                <a:alpha val="63000"/>
-              </a:srgbClr>
-            </a:outerShdw>
-          </a:effectLst>
-        </a:effectStyle>
-      </a:effectStyleLst>
-      <a:bgFillStyleLst>
-        <a:solidFill>
-          <a:schemeClr val="phClr"/>
-        </a:solidFill>
-        <a:solidFill>
-          <a:schemeClr val="phClr">
-            <a:tint val="95000"/>
-            <a:satMod val="170000"/>
-          </a:schemeClr>
-        </a:solidFill>
-        <a:gradFill rotWithShape="true">
-          <a:gsLst>
-            <a:gs pos="0">
-              <a:schemeClr val="phClr">
-                <a:tint val="93000"/>
-                <a:satMod val="150000"/>
-                <a:shade val="98000"/>
-                <a:lumMod val="102000"/>
-              </a:schemeClr>
-            </a:gs>
-            <a:gs pos="50000">
-              <a:schemeClr val="phClr">
-                <a:tint val="98000"/>
-                <a:satMod val="130000"/>
-                <a:shade val="90000"/>
-                <a:lumMod val="103000"/>
-              </a:schemeClr>
-            </a:gs>
-            <a:gs pos="100000">
-              <a:schemeClr val="phClr">
-                <a:shade val="63000"/>
-                <a:satMod val="120000"/>
-              </a:schemeClr>
-            </a:gs>
-          </a:gsLst>
-          <a:lin ang="5400000" scaled="false"/>
-        </a:gradFill>
-      </a:bgFillStyleLst>
-    </a:fmtScheme>
-  </a:themeElements>
-  <a:objectDefaults/>
-  <a:extraClrSchemeLst/>
-</a:theme>
 </file>
</xml_diff>